<commit_message>
Correctifs finaux PEC/PE/Tatitra 2026-2027
Titre centré, tableau sans couleur, marges égales, total hors tableau,
date à droite, police 12, ST gras italique, Sifflet vy, LETSARASON,
Pascoma/Sport = 145 élèves (aligné en-tête). Total 9 389 500 Ar.

Co-authored-by: arena-agent <297053741+arena-agent@users.noreply.github.com>
</commit_message>
<xml_diff>
--- a/PE-VOI-2026-2027.docx
+++ b/PE-VOI-2026-2027.docx
@@ -8,8 +8,8 @@
         <w:tblLook w:firstColumn="1" w:firstRow="1" w:lastColumn="0" w:lastRow="0" w:noHBand="0" w:noVBand="1" w:val="04A0"/>
       </w:tblPr>
       <w:tblGrid>
-        <w:gridCol w:w="5273"/>
-        <w:gridCol w:w="5273"/>
+        <w:gridCol w:w="5103"/>
+        <w:gridCol w:w="5103"/>
       </w:tblGrid>
       <w:tr>
         <w:tc>
@@ -17,11 +17,17 @@
             <w:tcW w:type="dxa" w:w="4200"/>
             <w:vAlign w:val="center"/>
             <w:tcMar>
-              <w:top w:w="40" w:type="dxa"/>
-              <w:bottom w:w="40" w:type="dxa"/>
+              <w:top w:w="30" w:type="dxa"/>
+              <w:bottom w:w="30" w:type="dxa"/>
               <w:left w:w="40" w:type="dxa"/>
               <w:right w:w="40" w:type="dxa"/>
             </w:tcMar>
+            <w:tcBorders>
+              <w:top w:val="nil"/>
+              <w:left w:val="nil"/>
+              <w:bottom w:val="nil"/>
+              <w:right w:val="nil"/>
+            </w:tcBorders>
           </w:tcPr>
           <w:p>
             <w:pPr>
@@ -32,7 +38,8 @@
               <w:rPr>
                 <w:rFonts w:ascii="Times New Roman" w:hAnsi="Times New Roman" w:eastAsia="Times New Roman" w:cs="Times New Roman"/>
                 <w:b/>
-                <w:sz w:val="16"/>
+                <w:i w:val="0"/>
+                <w:sz w:val="22"/>
               </w:rPr>
               <w:t>MINISTERE DE L’EDUCATION NATIONALE</w:t>
             </w:r>
@@ -45,7 +52,8 @@
               <w:rPr>
                 <w:rFonts w:ascii="Times New Roman" w:hAnsi="Times New Roman" w:eastAsia="Times New Roman" w:cs="Times New Roman"/>
                 <w:b/>
-                <w:sz w:val="16"/>
+                <w:i w:val="0"/>
+                <w:sz w:val="22"/>
               </w:rPr>
               <w:t>DREN : ALAOTRA MANGORO</w:t>
             </w:r>
@@ -58,7 +66,8 @@
               <w:rPr>
                 <w:rFonts w:ascii="Times New Roman" w:hAnsi="Times New Roman" w:eastAsia="Times New Roman" w:cs="Times New Roman"/>
                 <w:b/>
-                <w:sz w:val="16"/>
+                <w:i w:val="0"/>
+                <w:sz w:val="22"/>
               </w:rPr>
               <w:t>CISCO : ANOSIBE AN’ALA</w:t>
             </w:r>
@@ -71,7 +80,8 @@
               <w:rPr>
                 <w:rFonts w:ascii="Times New Roman" w:hAnsi="Times New Roman" w:eastAsia="Times New Roman" w:cs="Times New Roman"/>
                 <w:b/>
-                <w:sz w:val="16"/>
+                <w:i w:val="0"/>
+                <w:sz w:val="22"/>
               </w:rPr>
               <w:t>COMMUNE : TRATRAMARINA</w:t>
             </w:r>
@@ -84,7 +94,8 @@
               <w:rPr>
                 <w:rFonts w:ascii="Times New Roman" w:hAnsi="Times New Roman" w:eastAsia="Times New Roman" w:cs="Times New Roman"/>
                 <w:b/>
-                <w:sz w:val="16"/>
+                <w:i w:val="0"/>
+                <w:sz w:val="22"/>
               </w:rPr>
               <w:t>ZAP : TRATRAMARINA</w:t>
             </w:r>
@@ -97,7 +108,8 @@
               <w:rPr>
                 <w:rFonts w:ascii="Times New Roman" w:hAnsi="Times New Roman" w:eastAsia="Times New Roman" w:cs="Times New Roman"/>
                 <w:b/>
-                <w:sz w:val="16"/>
+                <w:i w:val="0"/>
+                <w:sz w:val="22"/>
               </w:rPr>
               <w:t>FOKONTANY : TRATRAMARINA</w:t>
             </w:r>
@@ -110,7 +122,8 @@
               <w:rPr>
                 <w:rFonts w:ascii="Times New Roman" w:hAnsi="Times New Roman" w:eastAsia="Times New Roman" w:cs="Times New Roman"/>
                 <w:b/>
-                <w:sz w:val="16"/>
+                <w:i w:val="0"/>
+                <w:sz w:val="22"/>
               </w:rPr>
               <w:t>EPP : ANDRANOMAFANA</w:t>
             </w:r>
@@ -123,7 +136,8 @@
               <w:rPr>
                 <w:rFonts w:ascii="Times New Roman" w:hAnsi="Times New Roman" w:eastAsia="Times New Roman" w:cs="Times New Roman"/>
                 <w:b/>
-                <w:sz w:val="16"/>
+                <w:i w:val="0"/>
+                <w:sz w:val="22"/>
               </w:rPr>
               <w:t>CODE : 506 090 012</w:t>
             </w:r>
@@ -134,11 +148,17 @@
             <w:tcW w:type="dxa" w:w="5200"/>
             <w:vAlign w:val="center"/>
             <w:tcMar>
-              <w:top w:w="40" w:type="dxa"/>
-              <w:bottom w:w="40" w:type="dxa"/>
+              <w:top w:w="30" w:type="dxa"/>
+              <w:bottom w:w="30" w:type="dxa"/>
               <w:left w:w="40" w:type="dxa"/>
               <w:right w:w="40" w:type="dxa"/>
             </w:tcMar>
+            <w:tcBorders>
+              <w:top w:val="nil"/>
+              <w:left w:val="nil"/>
+              <w:bottom w:val="nil"/>
+              <w:right w:val="nil"/>
+            </w:tcBorders>
           </w:tcPr>
           <w:p>
             <w:pPr>
@@ -149,7 +169,8 @@
               <w:rPr>
                 <w:rFonts w:ascii="Times New Roman" w:hAnsi="Times New Roman" w:eastAsia="Times New Roman" w:cs="Times New Roman"/>
                 <w:b/>
-                <w:sz w:val="22"/>
+                <w:i w:val="0"/>
+                <w:sz w:val="26"/>
               </w:rPr>
               <w:t>LAMIM-PANDANIANA</w:t>
             </w:r>
@@ -163,7 +184,8 @@
               <w:rPr>
                 <w:rFonts w:ascii="Times New Roman" w:hAnsi="Times New Roman" w:eastAsia="Times New Roman" w:cs="Times New Roman"/>
                 <w:b/>
-                <w:sz w:val="22"/>
+                <w:i w:val="0"/>
+                <w:sz w:val="26"/>
               </w:rPr>
               <w:t>VONDRON’OLONA IFOTONY (VOI)</w:t>
             </w:r>
@@ -177,7 +199,22 @@
               <w:rPr>
                 <w:rFonts w:ascii="Times New Roman" w:hAnsi="Times New Roman" w:eastAsia="Times New Roman" w:cs="Times New Roman"/>
                 <w:b/>
-                <w:sz w:val="22"/>
+                <w:i w:val="0"/>
+                <w:sz w:val="26"/>
+              </w:rPr>
+            </w:r>
+          </w:p>
+          <w:p>
+            <w:pPr>
+              <w:spacing w:before="0" w:after="0" w:line="240" w:lineRule="auto"/>
+              <w:jc w:val="center"/>
+            </w:pPr>
+            <w:r>
+              <w:rPr>
+                <w:rFonts w:ascii="Times New Roman" w:hAnsi="Times New Roman" w:eastAsia="Times New Roman" w:cs="Times New Roman"/>
+                <w:b/>
+                <w:i w:val="0"/>
+                <w:sz w:val="26"/>
               </w:rPr>
               <w:t>FEFFI : ANDRANOMAFANA</w:t>
             </w:r>
@@ -191,7 +228,8 @@
               <w:rPr>
                 <w:rFonts w:ascii="Times New Roman" w:hAnsi="Times New Roman" w:eastAsia="Times New Roman" w:cs="Times New Roman"/>
                 <w:b/>
-                <w:sz w:val="22"/>
+                <w:i w:val="0"/>
+                <w:sz w:val="26"/>
               </w:rPr>
               <w:t>Taom-pianarana 2026 – 2027</w:t>
             </w:r>
@@ -201,7 +239,7 @@
     </w:tbl>
     <w:p>
       <w:pPr>
-        <w:spacing w:after="80"/>
+        <w:spacing w:after="120"/>
       </w:pPr>
     </w:p>
     <w:tbl>
@@ -212,27 +250,32 @@
         <w:tblLook w:firstColumn="1" w:firstRow="1" w:lastColumn="0" w:lastRow="0" w:noHBand="0" w:noVBand="1" w:val="04A0"/>
       </w:tblPr>
       <w:tblGrid>
-        <w:gridCol w:w="1318"/>
-        <w:gridCol w:w="1318"/>
-        <w:gridCol w:w="1318"/>
-        <w:gridCol w:w="1318"/>
-        <w:gridCol w:w="1318"/>
-        <w:gridCol w:w="1318"/>
-        <w:gridCol w:w="1318"/>
-        <w:gridCol w:w="1318"/>
+        <w:gridCol w:w="1276"/>
+        <w:gridCol w:w="1276"/>
+        <w:gridCol w:w="1276"/>
+        <w:gridCol w:w="1276"/>
+        <w:gridCol w:w="1276"/>
+        <w:gridCol w:w="1276"/>
+        <w:gridCol w:w="1276"/>
+        <w:gridCol w:w="1276"/>
       </w:tblGrid>
       <w:tr>
         <w:tc>
           <w:tcPr>
-            <w:tcW w:type="dxa" w:w="500"/>
+            <w:tcW w:type="dxa" w:w="550"/>
             <w:vAlign w:val="center"/>
             <w:tcMar>
-              <w:top w:w="40" w:type="dxa"/>
-              <w:bottom w:w="40" w:type="dxa"/>
+              <w:top w:w="30" w:type="dxa"/>
+              <w:bottom w:w="30" w:type="dxa"/>
               <w:left w:w="40" w:type="dxa"/>
               <w:right w:w="40" w:type="dxa"/>
             </w:tcMar>
-            <w:shd w:fill="1F4E79" w:val="clear"/>
+            <w:tcBorders>
+              <w:top w:val="single" w:sz="4" w:space="0" w:color="000000"/>
+              <w:left w:val="single" w:sz="4" w:space="0" w:color="000000"/>
+              <w:bottom w:val="single" w:sz="4" w:space="0" w:color="000000"/>
+              <w:right w:val="single" w:sz="4" w:space="0" w:color="000000"/>
+            </w:tcBorders>
             <w:vMerge w:val="restart"/>
           </w:tcPr>
           <w:p>
@@ -244,8 +287,8 @@
               <w:rPr>
                 <w:rFonts w:ascii="Times New Roman" w:hAnsi="Times New Roman" w:eastAsia="Times New Roman" w:cs="Times New Roman"/>
                 <w:b/>
-                <w:color w:val="FFFFFF"/>
-                <w:sz w:val="15"/>
+                <w:i w:val="0"/>
+                <w:sz w:val="22"/>
               </w:rPr>
               <w:t>N°</w:t>
             </w:r>
@@ -253,15 +296,20 @@
         </w:tc>
         <w:tc>
           <w:tcPr>
-            <w:tcW w:type="dxa" w:w="1800"/>
+            <w:tcW w:type="dxa" w:w="1900"/>
             <w:vAlign w:val="center"/>
             <w:tcMar>
-              <w:top w:w="40" w:type="dxa"/>
-              <w:bottom w:w="40" w:type="dxa"/>
+              <w:top w:w="30" w:type="dxa"/>
+              <w:bottom w:w="30" w:type="dxa"/>
               <w:left w:w="40" w:type="dxa"/>
               <w:right w:w="40" w:type="dxa"/>
             </w:tcMar>
-            <w:shd w:fill="1F4E79" w:val="clear"/>
+            <w:tcBorders>
+              <w:top w:val="single" w:sz="4" w:space="0" w:color="000000"/>
+              <w:left w:val="single" w:sz="4" w:space="0" w:color="000000"/>
+              <w:bottom w:val="single" w:sz="4" w:space="0" w:color="000000"/>
+              <w:right w:val="single" w:sz="4" w:space="0" w:color="000000"/>
+            </w:tcBorders>
             <w:vMerge w:val="restart"/>
           </w:tcPr>
           <w:p>
@@ -273,8 +321,8 @@
               <w:rPr>
                 <w:rFonts w:ascii="Times New Roman" w:hAnsi="Times New Roman" w:eastAsia="Times New Roman" w:cs="Times New Roman"/>
                 <w:b/>
-                <w:color w:val="FFFFFF"/>
-                <w:sz w:val="15"/>
+                <w:i w:val="0"/>
+                <w:sz w:val="22"/>
               </w:rPr>
               <w:t>LAHASA</w:t>
             </w:r>
@@ -282,15 +330,20 @@
         </w:tc>
         <w:tc>
           <w:tcPr>
-            <w:tcW w:type="dxa" w:w="2400"/>
+            <w:tcW w:type="dxa" w:w="2500"/>
             <w:vAlign w:val="center"/>
             <w:tcMar>
-              <w:top w:w="40" w:type="dxa"/>
-              <w:bottom w:w="40" w:type="dxa"/>
+              <w:top w:w="30" w:type="dxa"/>
+              <w:bottom w:w="30" w:type="dxa"/>
               <w:left w:w="40" w:type="dxa"/>
               <w:right w:w="40" w:type="dxa"/>
             </w:tcMar>
-            <w:shd w:fill="1F4E79" w:val="clear"/>
+            <w:tcBorders>
+              <w:top w:val="single" w:sz="4" w:space="0" w:color="000000"/>
+              <w:left w:val="single" w:sz="4" w:space="0" w:color="000000"/>
+              <w:bottom w:val="single" w:sz="4" w:space="0" w:color="000000"/>
+              <w:right w:val="single" w:sz="4" w:space="0" w:color="000000"/>
+            </w:tcBorders>
             <w:vMerge w:val="restart"/>
           </w:tcPr>
           <w:p>
@@ -302,8 +355,8 @@
               <w:rPr>
                 <w:rFonts w:ascii="Times New Roman" w:hAnsi="Times New Roman" w:eastAsia="Times New Roman" w:cs="Times New Roman"/>
                 <w:b/>
-                <w:color w:val="FFFFFF"/>
-                <w:sz w:val="15"/>
+                <w:i w:val="0"/>
+                <w:sz w:val="22"/>
               </w:rPr>
               <w:t>KARAZANY</w:t>
             </w:r>
@@ -311,24 +364,21 @@
         </w:tc>
         <w:tc>
           <w:tcPr>
-            <w:tcW w:type="dxa" w:w="2800"/>
+            <w:tcW w:type="dxa" w:w="3050"/>
+            <w:gridSpan w:val="3"/>
             <w:vAlign w:val="center"/>
             <w:tcMar>
-              <w:top w:w="40" w:type="dxa"/>
-              <w:bottom w:w="40" w:type="dxa"/>
+              <w:top w:w="30" w:type="dxa"/>
+              <w:bottom w:w="30" w:type="dxa"/>
               <w:left w:w="40" w:type="dxa"/>
               <w:right w:w="40" w:type="dxa"/>
             </w:tcMar>
-            <w:gridSpan w:val="3"/>
-            <w:shd w:fill="1F4E79" w:val="clear"/>
-            <w:vAlign w:val="center"/>
-            <w:tcMar>
-              <w:top w:w="40" w:type="dxa"/>
-              <w:bottom w:w="40" w:type="dxa"/>
-              <w:left w:w="40" w:type="dxa"/>
-              <w:right w:w="40" w:type="dxa"/>
-            </w:tcMar>
-            <w:shd w:fill="1F4E79" w:val="clear"/>
+            <w:tcBorders>
+              <w:top w:val="single" w:sz="4" w:space="0" w:color="000000"/>
+              <w:left w:val="single" w:sz="4" w:space="0" w:color="000000"/>
+              <w:bottom w:val="single" w:sz="4" w:space="0" w:color="000000"/>
+              <w:right w:val="single" w:sz="4" w:space="0" w:color="000000"/>
+            </w:tcBorders>
           </w:tcPr>
           <w:p>
             <w:pPr>
@@ -339,16 +389,16 @@
               <w:rPr>
                 <w:rFonts w:ascii="Times New Roman" w:hAnsi="Times New Roman" w:eastAsia="Times New Roman" w:cs="Times New Roman"/>
                 <w:b/>
-                <w:color w:val="FFFFFF"/>
-                <w:sz w:val="15"/>
+                <w:i w:val="0"/>
+                <w:sz w:val="22"/>
               </w:rPr>
             </w:r>
             <w:r>
               <w:rPr>
                 <w:rFonts w:ascii="Times New Roman" w:hAnsi="Times New Roman" w:eastAsia="Times New Roman" w:cs="Times New Roman"/>
                 <w:b/>
-                <w:color w:val="FFFFFF"/>
-                <w:sz w:val="15"/>
+                <w:i w:val="0"/>
+                <w:sz w:val="22"/>
               </w:rPr>
               <w:t>TETIBIDY</w:t>
             </w:r>
@@ -356,15 +406,20 @@
         </w:tc>
         <w:tc>
           <w:tcPr>
-            <w:tcW w:type="dxa" w:w="1200"/>
+            <w:tcW w:type="dxa" w:w="1400"/>
             <w:vAlign w:val="center"/>
             <w:tcMar>
-              <w:top w:w="40" w:type="dxa"/>
-              <w:bottom w:w="40" w:type="dxa"/>
+              <w:top w:w="30" w:type="dxa"/>
+              <w:bottom w:w="30" w:type="dxa"/>
               <w:left w:w="40" w:type="dxa"/>
               <w:right w:w="40" w:type="dxa"/>
             </w:tcMar>
-            <w:shd w:fill="1F4E79" w:val="clear"/>
+            <w:tcBorders>
+              <w:top w:val="single" w:sz="4" w:space="0" w:color="000000"/>
+              <w:left w:val="single" w:sz="4" w:space="0" w:color="000000"/>
+              <w:bottom w:val="single" w:sz="4" w:space="0" w:color="000000"/>
+              <w:right w:val="single" w:sz="4" w:space="0" w:color="000000"/>
+            </w:tcBorders>
             <w:vMerge w:val="restart"/>
           </w:tcPr>
           <w:p>
@@ -376,8 +431,8 @@
               <w:rPr>
                 <w:rFonts w:ascii="Times New Roman" w:hAnsi="Times New Roman" w:eastAsia="Times New Roman" w:cs="Times New Roman"/>
                 <w:b/>
-                <w:color w:val="FFFFFF"/>
-                <w:sz w:val="15"/>
+                <w:i w:val="0"/>
+                <w:sz w:val="22"/>
               </w:rPr>
               <w:t>LOHARANO NIAVIAN’NY VOLA</w:t>
             </w:r>
@@ -385,15 +440,20 @@
         </w:tc>
         <w:tc>
           <w:tcPr>
-            <w:tcW w:type="dxa" w:w="1100"/>
+            <w:tcW w:type="dxa" w:w="1000"/>
             <w:vAlign w:val="center"/>
             <w:tcMar>
-              <w:top w:w="40" w:type="dxa"/>
-              <w:bottom w:w="40" w:type="dxa"/>
+              <w:top w:w="30" w:type="dxa"/>
+              <w:bottom w:w="30" w:type="dxa"/>
               <w:left w:w="40" w:type="dxa"/>
               <w:right w:w="40" w:type="dxa"/>
             </w:tcMar>
-            <w:shd w:fill="1F4E79" w:val="clear"/>
+            <w:tcBorders>
+              <w:top w:val="single" w:sz="4" w:space="0" w:color="000000"/>
+              <w:left w:val="single" w:sz="4" w:space="0" w:color="000000"/>
+              <w:bottom w:val="single" w:sz="4" w:space="0" w:color="000000"/>
+              <w:right w:val="single" w:sz="4" w:space="0" w:color="000000"/>
+            </w:tcBorders>
             <w:vMerge w:val="restart"/>
           </w:tcPr>
           <w:p>
@@ -405,8 +465,8 @@
               <w:rPr>
                 <w:rFonts w:ascii="Times New Roman" w:hAnsi="Times New Roman" w:eastAsia="Times New Roman" w:cs="Times New Roman"/>
                 <w:b/>
-                <w:color w:val="FFFFFF"/>
-                <w:sz w:val="15"/>
+                <w:i w:val="0"/>
+                <w:sz w:val="22"/>
               </w:rPr>
               <w:t>FANAMARIHANA</w:t>
             </w:r>
@@ -416,15 +476,20 @@
       <w:tr>
         <w:tc>
           <w:tcPr>
-            <w:tcW w:type="dxa" w:w="500"/>
+            <w:tcW w:type="dxa" w:w="550"/>
             <w:vAlign w:val="center"/>
             <w:tcMar>
-              <w:top w:w="40" w:type="dxa"/>
-              <w:bottom w:w="40" w:type="dxa"/>
+              <w:top w:w="30" w:type="dxa"/>
+              <w:bottom w:w="30" w:type="dxa"/>
               <w:left w:w="40" w:type="dxa"/>
               <w:right w:w="40" w:type="dxa"/>
             </w:tcMar>
-            <w:shd w:fill="2E75B6" w:val="clear"/>
+            <w:tcBorders>
+              <w:top w:val="single" w:sz="4" w:space="0" w:color="000000"/>
+              <w:left w:val="single" w:sz="4" w:space="0" w:color="000000"/>
+              <w:bottom w:val="single" w:sz="4" w:space="0" w:color="000000"/>
+              <w:right w:val="single" w:sz="4" w:space="0" w:color="000000"/>
+            </w:tcBorders>
             <w:vMerge/>
           </w:tcPr>
           <w:p>
@@ -436,23 +501,28 @@
               <w:rPr>
                 <w:rFonts w:ascii="Times New Roman" w:hAnsi="Times New Roman" w:eastAsia="Times New Roman" w:cs="Times New Roman"/>
                 <w:b/>
-                <w:color w:val="FFFFFF"/>
-                <w:sz w:val="15"/>
+                <w:i w:val="0"/>
+                <w:sz w:val="22"/>
               </w:rPr>
             </w:r>
           </w:p>
         </w:tc>
         <w:tc>
           <w:tcPr>
-            <w:tcW w:type="dxa" w:w="1800"/>
+            <w:tcW w:type="dxa" w:w="1900"/>
             <w:vAlign w:val="center"/>
             <w:tcMar>
-              <w:top w:w="40" w:type="dxa"/>
-              <w:bottom w:w="40" w:type="dxa"/>
+              <w:top w:w="30" w:type="dxa"/>
+              <w:bottom w:w="30" w:type="dxa"/>
               <w:left w:w="40" w:type="dxa"/>
               <w:right w:w="40" w:type="dxa"/>
             </w:tcMar>
-            <w:shd w:fill="2E75B6" w:val="clear"/>
+            <w:tcBorders>
+              <w:top w:val="single" w:sz="4" w:space="0" w:color="000000"/>
+              <w:left w:val="single" w:sz="4" w:space="0" w:color="000000"/>
+              <w:bottom w:val="single" w:sz="4" w:space="0" w:color="000000"/>
+              <w:right w:val="single" w:sz="4" w:space="0" w:color="000000"/>
+            </w:tcBorders>
             <w:vMerge/>
           </w:tcPr>
           <w:p>
@@ -464,23 +534,28 @@
               <w:rPr>
                 <w:rFonts w:ascii="Times New Roman" w:hAnsi="Times New Roman" w:eastAsia="Times New Roman" w:cs="Times New Roman"/>
                 <w:b/>
-                <w:color w:val="FFFFFF"/>
-                <w:sz w:val="15"/>
+                <w:i w:val="0"/>
+                <w:sz w:val="22"/>
               </w:rPr>
             </w:r>
           </w:p>
         </w:tc>
         <w:tc>
           <w:tcPr>
-            <w:tcW w:type="dxa" w:w="2400"/>
+            <w:tcW w:type="dxa" w:w="2500"/>
             <w:vAlign w:val="center"/>
             <w:tcMar>
-              <w:top w:w="40" w:type="dxa"/>
-              <w:bottom w:w="40" w:type="dxa"/>
+              <w:top w:w="30" w:type="dxa"/>
+              <w:bottom w:w="30" w:type="dxa"/>
               <w:left w:w="40" w:type="dxa"/>
               <w:right w:w="40" w:type="dxa"/>
             </w:tcMar>
-            <w:shd w:fill="2E75B6" w:val="clear"/>
+            <w:tcBorders>
+              <w:top w:val="single" w:sz="4" w:space="0" w:color="000000"/>
+              <w:left w:val="single" w:sz="4" w:space="0" w:color="000000"/>
+              <w:bottom w:val="single" w:sz="4" w:space="0" w:color="000000"/>
+              <w:right w:val="single" w:sz="4" w:space="0" w:color="000000"/>
+            </w:tcBorders>
             <w:vMerge/>
           </w:tcPr>
           <w:p>
@@ -492,23 +567,28 @@
               <w:rPr>
                 <w:rFonts w:ascii="Times New Roman" w:hAnsi="Times New Roman" w:eastAsia="Times New Roman" w:cs="Times New Roman"/>
                 <w:b/>
-                <w:color w:val="FFFFFF"/>
-                <w:sz w:val="15"/>
+                <w:i w:val="0"/>
+                <w:sz w:val="22"/>
               </w:rPr>
             </w:r>
           </w:p>
         </w:tc>
         <w:tc>
           <w:tcPr>
-            <w:tcW w:type="dxa" w:w="1000"/>
+            <w:tcW w:type="dxa" w:w="1100"/>
             <w:vAlign w:val="center"/>
             <w:tcMar>
-              <w:top w:w="40" w:type="dxa"/>
-              <w:bottom w:w="40" w:type="dxa"/>
+              <w:top w:w="30" w:type="dxa"/>
+              <w:bottom w:w="30" w:type="dxa"/>
               <w:left w:w="40" w:type="dxa"/>
               <w:right w:w="40" w:type="dxa"/>
             </w:tcMar>
-            <w:shd w:fill="2E75B6" w:val="clear"/>
+            <w:tcBorders>
+              <w:top w:val="single" w:sz="4" w:space="0" w:color="000000"/>
+              <w:left w:val="single" w:sz="4" w:space="0" w:color="000000"/>
+              <w:bottom w:val="single" w:sz="4" w:space="0" w:color="000000"/>
+              <w:right w:val="single" w:sz="4" w:space="0" w:color="000000"/>
+            </w:tcBorders>
           </w:tcPr>
           <w:p>
             <w:pPr>
@@ -519,8 +599,8 @@
               <w:rPr>
                 <w:rFonts w:ascii="Times New Roman" w:hAnsi="Times New Roman" w:eastAsia="Times New Roman" w:cs="Times New Roman"/>
                 <w:b/>
-                <w:color w:val="FFFFFF"/>
-                <w:sz w:val="15"/>
+                <w:i w:val="0"/>
+                <w:sz w:val="22"/>
               </w:rPr>
               <w:t>Vidin’ny iray</w:t>
             </w:r>
@@ -528,15 +608,20 @@
         </w:tc>
         <w:tc>
           <w:tcPr>
-            <w:tcW w:type="dxa" w:w="700"/>
+            <w:tcW w:type="dxa" w:w="750"/>
             <w:vAlign w:val="center"/>
             <w:tcMar>
-              <w:top w:w="40" w:type="dxa"/>
-              <w:bottom w:w="40" w:type="dxa"/>
+              <w:top w:w="30" w:type="dxa"/>
+              <w:bottom w:w="30" w:type="dxa"/>
               <w:left w:w="40" w:type="dxa"/>
               <w:right w:w="40" w:type="dxa"/>
             </w:tcMar>
-            <w:shd w:fill="2E75B6" w:val="clear"/>
+            <w:tcBorders>
+              <w:top w:val="single" w:sz="4" w:space="0" w:color="000000"/>
+              <w:left w:val="single" w:sz="4" w:space="0" w:color="000000"/>
+              <w:bottom w:val="single" w:sz="4" w:space="0" w:color="000000"/>
+              <w:right w:val="single" w:sz="4" w:space="0" w:color="000000"/>
+            </w:tcBorders>
           </w:tcPr>
           <w:p>
             <w:pPr>
@@ -547,8 +632,8 @@
               <w:rPr>
                 <w:rFonts w:ascii="Times New Roman" w:hAnsi="Times New Roman" w:eastAsia="Times New Roman" w:cs="Times New Roman"/>
                 <w:b/>
-                <w:color w:val="FFFFFF"/>
-                <w:sz w:val="15"/>
+                <w:i w:val="0"/>
+                <w:sz w:val="22"/>
               </w:rPr>
               <w:t>Isany</w:t>
             </w:r>
@@ -556,15 +641,20 @@
         </w:tc>
         <w:tc>
           <w:tcPr>
-            <w:tcW w:type="dxa" w:w="1100"/>
+            <w:tcW w:type="dxa" w:w="1200"/>
             <w:vAlign w:val="center"/>
             <w:tcMar>
-              <w:top w:w="40" w:type="dxa"/>
-              <w:bottom w:w="40" w:type="dxa"/>
+              <w:top w:w="30" w:type="dxa"/>
+              <w:bottom w:w="30" w:type="dxa"/>
               <w:left w:w="40" w:type="dxa"/>
               <w:right w:w="40" w:type="dxa"/>
             </w:tcMar>
-            <w:shd w:fill="2E75B6" w:val="clear"/>
+            <w:tcBorders>
+              <w:top w:val="single" w:sz="4" w:space="0" w:color="000000"/>
+              <w:left w:val="single" w:sz="4" w:space="0" w:color="000000"/>
+              <w:bottom w:val="single" w:sz="4" w:space="0" w:color="000000"/>
+              <w:right w:val="single" w:sz="4" w:space="0" w:color="000000"/>
+            </w:tcBorders>
           </w:tcPr>
           <w:p>
             <w:pPr>
@@ -575,8 +665,8 @@
               <w:rPr>
                 <w:rFonts w:ascii="Times New Roman" w:hAnsi="Times New Roman" w:eastAsia="Times New Roman" w:cs="Times New Roman"/>
                 <w:b/>
-                <w:color w:val="FFFFFF"/>
-                <w:sz w:val="15"/>
+                <w:i w:val="0"/>
+                <w:sz w:val="22"/>
               </w:rPr>
               <w:t>Totaly</w:t>
             </w:r>
@@ -584,15 +674,20 @@
         </w:tc>
         <w:tc>
           <w:tcPr>
-            <w:tcW w:type="dxa" w:w="1200"/>
+            <w:tcW w:type="dxa" w:w="1400"/>
             <w:vAlign w:val="center"/>
             <w:tcMar>
-              <w:top w:w="40" w:type="dxa"/>
-              <w:bottom w:w="40" w:type="dxa"/>
+              <w:top w:w="30" w:type="dxa"/>
+              <w:bottom w:w="30" w:type="dxa"/>
               <w:left w:w="40" w:type="dxa"/>
               <w:right w:w="40" w:type="dxa"/>
             </w:tcMar>
-            <w:shd w:fill="2E75B6" w:val="clear"/>
+            <w:tcBorders>
+              <w:top w:val="single" w:sz="4" w:space="0" w:color="000000"/>
+              <w:left w:val="single" w:sz="4" w:space="0" w:color="000000"/>
+              <w:bottom w:val="single" w:sz="4" w:space="0" w:color="000000"/>
+              <w:right w:val="single" w:sz="4" w:space="0" w:color="000000"/>
+            </w:tcBorders>
             <w:vMerge/>
           </w:tcPr>
           <w:p>
@@ -604,23 +699,28 @@
               <w:rPr>
                 <w:rFonts w:ascii="Times New Roman" w:hAnsi="Times New Roman" w:eastAsia="Times New Roman" w:cs="Times New Roman"/>
                 <w:b/>
-                <w:color w:val="FFFFFF"/>
-                <w:sz w:val="15"/>
+                <w:i w:val="0"/>
+                <w:sz w:val="22"/>
               </w:rPr>
             </w:r>
           </w:p>
         </w:tc>
         <w:tc>
           <w:tcPr>
-            <w:tcW w:type="dxa" w:w="1100"/>
+            <w:tcW w:type="dxa" w:w="1000"/>
             <w:vAlign w:val="center"/>
             <w:tcMar>
-              <w:top w:w="40" w:type="dxa"/>
-              <w:bottom w:w="40" w:type="dxa"/>
+              <w:top w:w="30" w:type="dxa"/>
+              <w:bottom w:w="30" w:type="dxa"/>
               <w:left w:w="40" w:type="dxa"/>
               <w:right w:w="40" w:type="dxa"/>
             </w:tcMar>
-            <w:shd w:fill="2E75B6" w:val="clear"/>
+            <w:tcBorders>
+              <w:top w:val="single" w:sz="4" w:space="0" w:color="000000"/>
+              <w:left w:val="single" w:sz="4" w:space="0" w:color="000000"/>
+              <w:bottom w:val="single" w:sz="4" w:space="0" w:color="000000"/>
+              <w:right w:val="single" w:sz="4" w:space="0" w:color="000000"/>
+            </w:tcBorders>
             <w:vMerge/>
           </w:tcPr>
           <w:p>
@@ -632,8 +732,8 @@
               <w:rPr>
                 <w:rFonts w:ascii="Times New Roman" w:hAnsi="Times New Roman" w:eastAsia="Times New Roman" w:cs="Times New Roman"/>
                 <w:b/>
-                <w:color w:val="FFFFFF"/>
-                <w:sz w:val="15"/>
+                <w:i w:val="0"/>
+                <w:sz w:val="22"/>
               </w:rPr>
             </w:r>
           </w:p>
@@ -642,14 +742,20 @@
       <w:tr>
         <w:tc>
           <w:tcPr>
-            <w:tcW w:type="dxa" w:w="500"/>
+            <w:tcW w:type="dxa" w:w="550"/>
             <w:vAlign w:val="center"/>
             <w:tcMar>
-              <w:top w:w="40" w:type="dxa"/>
-              <w:bottom w:w="40" w:type="dxa"/>
+              <w:top w:w="30" w:type="dxa"/>
+              <w:bottom w:w="30" w:type="dxa"/>
               <w:left w:w="40" w:type="dxa"/>
               <w:right w:w="40" w:type="dxa"/>
             </w:tcMar>
+            <w:tcBorders>
+              <w:top w:val="single" w:sz="4" w:space="0" w:color="000000"/>
+              <w:left w:val="single" w:sz="4" w:space="0" w:color="000000"/>
+              <w:bottom w:val="single" w:sz="4" w:space="0" w:color="000000"/>
+              <w:right w:val="single" w:sz="4" w:space="0" w:color="000000"/>
+            </w:tcBorders>
           </w:tcPr>
           <w:p>
             <w:pPr>
@@ -660,7 +766,8 @@
               <w:rPr>
                 <w:rFonts w:ascii="Times New Roman" w:hAnsi="Times New Roman" w:eastAsia="Times New Roman" w:cs="Times New Roman"/>
                 <w:b w:val="0"/>
-                <w:sz w:val="15"/>
+                <w:i w:val="0"/>
+                <w:sz w:val="22"/>
               </w:rPr>
               <w:t>1</w:t>
             </w:r>
@@ -668,14 +775,20 @@
         </w:tc>
         <w:tc>
           <w:tcPr>
-            <w:tcW w:type="dxa" w:w="1800"/>
+            <w:tcW w:type="dxa" w:w="1900"/>
             <w:vAlign w:val="center"/>
             <w:tcMar>
-              <w:top w:w="40" w:type="dxa"/>
-              <w:bottom w:w="40" w:type="dxa"/>
+              <w:top w:w="30" w:type="dxa"/>
+              <w:bottom w:w="30" w:type="dxa"/>
               <w:left w:w="40" w:type="dxa"/>
               <w:right w:w="40" w:type="dxa"/>
             </w:tcMar>
+            <w:tcBorders>
+              <w:top w:val="single" w:sz="4" w:space="0" w:color="000000"/>
+              <w:left w:val="single" w:sz="4" w:space="0" w:color="000000"/>
+              <w:bottom w:val="single" w:sz="4" w:space="0" w:color="000000"/>
+              <w:right w:val="single" w:sz="4" w:space="0" w:color="000000"/>
+            </w:tcBorders>
             <w:vMerge w:val="restart"/>
           </w:tcPr>
           <w:p>
@@ -687,7 +800,8 @@
               <w:rPr>
                 <w:rFonts w:ascii="Times New Roman" w:hAnsi="Times New Roman" w:eastAsia="Times New Roman" w:cs="Times New Roman"/>
                 <w:b/>
-                <w:sz w:val="15"/>
+                <w:i w:val="0"/>
+                <w:sz w:val="22"/>
               </w:rPr>
               <w:t>Fanamboarana trano mpampianatra</w:t>
             </w:r>
@@ -695,14 +809,20 @@
         </w:tc>
         <w:tc>
           <w:tcPr>
-            <w:tcW w:type="dxa" w:w="2400"/>
+            <w:tcW w:type="dxa" w:w="2500"/>
             <w:vAlign w:val="center"/>
             <w:tcMar>
-              <w:top w:w="40" w:type="dxa"/>
-              <w:bottom w:w="40" w:type="dxa"/>
+              <w:top w:w="30" w:type="dxa"/>
+              <w:bottom w:w="30" w:type="dxa"/>
               <w:left w:w="40" w:type="dxa"/>
               <w:right w:w="40" w:type="dxa"/>
             </w:tcMar>
+            <w:tcBorders>
+              <w:top w:val="single" w:sz="4" w:space="0" w:color="000000"/>
+              <w:left w:val="single" w:sz="4" w:space="0" w:color="000000"/>
+              <w:bottom w:val="single" w:sz="4" w:space="0" w:color="000000"/>
+              <w:right w:val="single" w:sz="4" w:space="0" w:color="000000"/>
+            </w:tcBorders>
           </w:tcPr>
           <w:p>
             <w:pPr>
@@ -713,7 +833,8 @@
               <w:rPr>
                 <w:rFonts w:ascii="Times New Roman" w:hAnsi="Times New Roman" w:eastAsia="Times New Roman" w:cs="Times New Roman"/>
                 <w:b w:val="0"/>
-                <w:sz w:val="15"/>
+                <w:i w:val="0"/>
+                <w:sz w:val="22"/>
               </w:rPr>
               <w:t>Andry</w:t>
             </w:r>
@@ -721,14 +842,20 @@
         </w:tc>
         <w:tc>
           <w:tcPr>
-            <w:tcW w:type="dxa" w:w="1000"/>
+            <w:tcW w:type="dxa" w:w="1100"/>
             <w:vAlign w:val="center"/>
             <w:tcMar>
-              <w:top w:w="40" w:type="dxa"/>
-              <w:bottom w:w="40" w:type="dxa"/>
+              <w:top w:w="30" w:type="dxa"/>
+              <w:bottom w:w="30" w:type="dxa"/>
               <w:left w:w="40" w:type="dxa"/>
               <w:right w:w="40" w:type="dxa"/>
             </w:tcMar>
+            <w:tcBorders>
+              <w:top w:val="single" w:sz="4" w:space="0" w:color="000000"/>
+              <w:left w:val="single" w:sz="4" w:space="0" w:color="000000"/>
+              <w:bottom w:val="single" w:sz="4" w:space="0" w:color="000000"/>
+              <w:right w:val="single" w:sz="4" w:space="0" w:color="000000"/>
+            </w:tcBorders>
           </w:tcPr>
           <w:p>
             <w:pPr>
@@ -739,7 +866,8 @@
               <w:rPr>
                 <w:rFonts w:ascii="Times New Roman" w:hAnsi="Times New Roman" w:eastAsia="Times New Roman" w:cs="Times New Roman"/>
                 <w:b w:val="0"/>
-                <w:sz w:val="15"/>
+                <w:i w:val="0"/>
+                <w:sz w:val="22"/>
               </w:rPr>
               <w:t>60</w:t>
             </w:r>
@@ -747,14 +875,20 @@
         </w:tc>
         <w:tc>
           <w:tcPr>
-            <w:tcW w:type="dxa" w:w="700"/>
+            <w:tcW w:type="dxa" w:w="750"/>
             <w:vAlign w:val="center"/>
             <w:tcMar>
-              <w:top w:w="40" w:type="dxa"/>
-              <w:bottom w:w="40" w:type="dxa"/>
+              <w:top w:w="30" w:type="dxa"/>
+              <w:bottom w:w="30" w:type="dxa"/>
               <w:left w:w="40" w:type="dxa"/>
               <w:right w:w="40" w:type="dxa"/>
             </w:tcMar>
+            <w:tcBorders>
+              <w:top w:val="single" w:sz="4" w:space="0" w:color="000000"/>
+              <w:left w:val="single" w:sz="4" w:space="0" w:color="000000"/>
+              <w:bottom w:val="single" w:sz="4" w:space="0" w:color="000000"/>
+              <w:right w:val="single" w:sz="4" w:space="0" w:color="000000"/>
+            </w:tcBorders>
           </w:tcPr>
           <w:p>
             <w:pPr>
@@ -765,7 +899,8 @@
               <w:rPr>
                 <w:rFonts w:ascii="Times New Roman" w:hAnsi="Times New Roman" w:eastAsia="Times New Roman" w:cs="Times New Roman"/>
                 <w:b w:val="0"/>
-                <w:sz w:val="15"/>
+                <w:i w:val="0"/>
+                <w:sz w:val="22"/>
               </w:rPr>
               <w:t>6000</w:t>
             </w:r>
@@ -773,14 +908,20 @@
         </w:tc>
         <w:tc>
           <w:tcPr>
-            <w:tcW w:type="dxa" w:w="1100"/>
+            <w:tcW w:type="dxa" w:w="1200"/>
             <w:vAlign w:val="center"/>
             <w:tcMar>
-              <w:top w:w="40" w:type="dxa"/>
-              <w:bottom w:w="40" w:type="dxa"/>
+              <w:top w:w="30" w:type="dxa"/>
+              <w:bottom w:w="30" w:type="dxa"/>
               <w:left w:w="40" w:type="dxa"/>
               <w:right w:w="40" w:type="dxa"/>
             </w:tcMar>
+            <w:tcBorders>
+              <w:top w:val="single" w:sz="4" w:space="0" w:color="000000"/>
+              <w:left w:val="single" w:sz="4" w:space="0" w:color="000000"/>
+              <w:bottom w:val="single" w:sz="4" w:space="0" w:color="000000"/>
+              <w:right w:val="single" w:sz="4" w:space="0" w:color="000000"/>
+            </w:tcBorders>
           </w:tcPr>
           <w:p>
             <w:pPr>
@@ -791,7 +932,8 @@
               <w:rPr>
                 <w:rFonts w:ascii="Times New Roman" w:hAnsi="Times New Roman" w:eastAsia="Times New Roman" w:cs="Times New Roman"/>
                 <w:b w:val="0"/>
-                <w:sz w:val="15"/>
+                <w:i w:val="0"/>
+                <w:sz w:val="22"/>
               </w:rPr>
               <w:t>360 000</w:t>
             </w:r>
@@ -799,14 +941,20 @@
         </w:tc>
         <w:tc>
           <w:tcPr>
-            <w:tcW w:type="dxa" w:w="1200"/>
+            <w:tcW w:type="dxa" w:w="1400"/>
             <w:vAlign w:val="center"/>
             <w:tcMar>
-              <w:top w:w="40" w:type="dxa"/>
-              <w:bottom w:w="40" w:type="dxa"/>
+              <w:top w:w="30" w:type="dxa"/>
+              <w:bottom w:w="30" w:type="dxa"/>
               <w:left w:w="40" w:type="dxa"/>
               <w:right w:w="40" w:type="dxa"/>
             </w:tcMar>
+            <w:tcBorders>
+              <w:top w:val="single" w:sz="4" w:space="0" w:color="000000"/>
+              <w:left w:val="single" w:sz="4" w:space="0" w:color="000000"/>
+              <w:bottom w:val="single" w:sz="4" w:space="0" w:color="000000"/>
+              <w:right w:val="single" w:sz="4" w:space="0" w:color="000000"/>
+            </w:tcBorders>
             <w:vMerge w:val="restart"/>
           </w:tcPr>
           <w:p>
@@ -818,7 +966,8 @@
               <w:rPr>
                 <w:rFonts w:ascii="Times New Roman" w:hAnsi="Times New Roman" w:eastAsia="Times New Roman" w:cs="Times New Roman"/>
                 <w:b w:val="0"/>
-                <w:sz w:val="15"/>
+                <w:i w:val="0"/>
+                <w:sz w:val="22"/>
               </w:rPr>
               <w:t>VOI</w:t>
             </w:r>
@@ -826,14 +975,20 @@
         </w:tc>
         <w:tc>
           <w:tcPr>
-            <w:tcW w:type="dxa" w:w="1100"/>
+            <w:tcW w:type="dxa" w:w="1000"/>
             <w:vAlign w:val="center"/>
             <w:tcMar>
-              <w:top w:w="40" w:type="dxa"/>
-              <w:bottom w:w="40" w:type="dxa"/>
+              <w:top w:w="30" w:type="dxa"/>
+              <w:bottom w:w="30" w:type="dxa"/>
               <w:left w:w="40" w:type="dxa"/>
               <w:right w:w="40" w:type="dxa"/>
             </w:tcMar>
+            <w:tcBorders>
+              <w:top w:val="single" w:sz="4" w:space="0" w:color="000000"/>
+              <w:left w:val="single" w:sz="4" w:space="0" w:color="000000"/>
+              <w:bottom w:val="single" w:sz="4" w:space="0" w:color="000000"/>
+              <w:right w:val="single" w:sz="4" w:space="0" w:color="000000"/>
+            </w:tcBorders>
           </w:tcPr>
           <w:p>
             <w:pPr>
@@ -844,7 +999,8 @@
               <w:rPr>
                 <w:rFonts w:ascii="Times New Roman" w:hAnsi="Times New Roman" w:eastAsia="Times New Roman" w:cs="Times New Roman"/>
                 <w:b w:val="0"/>
-                <w:sz w:val="15"/>
+                <w:i w:val="0"/>
+                <w:sz w:val="22"/>
               </w:rPr>
             </w:r>
           </w:p>
@@ -853,14 +1009,20 @@
       <w:tr>
         <w:tc>
           <w:tcPr>
-            <w:tcW w:type="dxa" w:w="500"/>
+            <w:tcW w:type="dxa" w:w="550"/>
             <w:vAlign w:val="center"/>
             <w:tcMar>
-              <w:top w:w="40" w:type="dxa"/>
-              <w:bottom w:w="40" w:type="dxa"/>
+              <w:top w:w="30" w:type="dxa"/>
+              <w:bottom w:w="30" w:type="dxa"/>
               <w:left w:w="40" w:type="dxa"/>
               <w:right w:w="40" w:type="dxa"/>
             </w:tcMar>
+            <w:tcBorders>
+              <w:top w:val="single" w:sz="4" w:space="0" w:color="000000"/>
+              <w:left w:val="single" w:sz="4" w:space="0" w:color="000000"/>
+              <w:bottom w:val="single" w:sz="4" w:space="0" w:color="000000"/>
+              <w:right w:val="single" w:sz="4" w:space="0" w:color="000000"/>
+            </w:tcBorders>
           </w:tcPr>
           <w:p>
             <w:pPr>
@@ -871,7 +1033,8 @@
               <w:rPr>
                 <w:rFonts w:ascii="Times New Roman" w:hAnsi="Times New Roman" w:eastAsia="Times New Roman" w:cs="Times New Roman"/>
                 <w:b w:val="0"/>
-                <w:sz w:val="15"/>
+                <w:i w:val="0"/>
+                <w:sz w:val="22"/>
               </w:rPr>
               <w:t>2</w:t>
             </w:r>
@@ -879,14 +1042,20 @@
         </w:tc>
         <w:tc>
           <w:tcPr>
-            <w:tcW w:type="dxa" w:w="1800"/>
+            <w:tcW w:type="dxa" w:w="1900"/>
             <w:vAlign w:val="center"/>
             <w:tcMar>
-              <w:top w:w="40" w:type="dxa"/>
-              <w:bottom w:w="40" w:type="dxa"/>
+              <w:top w:w="30" w:type="dxa"/>
+              <w:bottom w:w="30" w:type="dxa"/>
               <w:left w:w="40" w:type="dxa"/>
               <w:right w:w="40" w:type="dxa"/>
             </w:tcMar>
+            <w:tcBorders>
+              <w:top w:val="single" w:sz="4" w:space="0" w:color="000000"/>
+              <w:left w:val="single" w:sz="4" w:space="0" w:color="000000"/>
+              <w:bottom w:val="single" w:sz="4" w:space="0" w:color="000000"/>
+              <w:right w:val="single" w:sz="4" w:space="0" w:color="000000"/>
+            </w:tcBorders>
             <w:vMerge/>
           </w:tcPr>
           <w:p>
@@ -898,21 +1067,28 @@
               <w:rPr>
                 <w:rFonts w:ascii="Times New Roman" w:hAnsi="Times New Roman" w:eastAsia="Times New Roman" w:cs="Times New Roman"/>
                 <w:b w:val="0"/>
-                <w:sz w:val="15"/>
+                <w:i w:val="0"/>
+                <w:sz w:val="22"/>
               </w:rPr>
             </w:r>
           </w:p>
         </w:tc>
         <w:tc>
           <w:tcPr>
-            <w:tcW w:type="dxa" w:w="2400"/>
+            <w:tcW w:type="dxa" w:w="2500"/>
             <w:vAlign w:val="center"/>
             <w:tcMar>
-              <w:top w:w="40" w:type="dxa"/>
-              <w:bottom w:w="40" w:type="dxa"/>
+              <w:top w:w="30" w:type="dxa"/>
+              <w:bottom w:w="30" w:type="dxa"/>
               <w:left w:w="40" w:type="dxa"/>
               <w:right w:w="40" w:type="dxa"/>
             </w:tcMar>
+            <w:tcBorders>
+              <w:top w:val="single" w:sz="4" w:space="0" w:color="000000"/>
+              <w:left w:val="single" w:sz="4" w:space="0" w:color="000000"/>
+              <w:bottom w:val="single" w:sz="4" w:space="0" w:color="000000"/>
+              <w:right w:val="single" w:sz="4" w:space="0" w:color="000000"/>
+            </w:tcBorders>
           </w:tcPr>
           <w:p>
             <w:pPr>
@@ -923,7 +1099,8 @@
               <w:rPr>
                 <w:rFonts w:ascii="Times New Roman" w:hAnsi="Times New Roman" w:eastAsia="Times New Roman" w:cs="Times New Roman"/>
                 <w:b w:val="0"/>
-                <w:sz w:val="15"/>
+                <w:i w:val="0"/>
+                <w:sz w:val="22"/>
               </w:rPr>
               <w:t>Chevron</w:t>
             </w:r>
@@ -931,14 +1108,20 @@
         </w:tc>
         <w:tc>
           <w:tcPr>
-            <w:tcW w:type="dxa" w:w="1000"/>
+            <w:tcW w:type="dxa" w:w="1100"/>
             <w:vAlign w:val="center"/>
             <w:tcMar>
-              <w:top w:w="40" w:type="dxa"/>
-              <w:bottom w:w="40" w:type="dxa"/>
+              <w:top w:w="30" w:type="dxa"/>
+              <w:bottom w:w="30" w:type="dxa"/>
               <w:left w:w="40" w:type="dxa"/>
               <w:right w:w="40" w:type="dxa"/>
             </w:tcMar>
+            <w:tcBorders>
+              <w:top w:val="single" w:sz="4" w:space="0" w:color="000000"/>
+              <w:left w:val="single" w:sz="4" w:space="0" w:color="000000"/>
+              <w:bottom w:val="single" w:sz="4" w:space="0" w:color="000000"/>
+              <w:right w:val="single" w:sz="4" w:space="0" w:color="000000"/>
+            </w:tcBorders>
           </w:tcPr>
           <w:p>
             <w:pPr>
@@ -949,7 +1132,8 @@
               <w:rPr>
                 <w:rFonts w:ascii="Times New Roman" w:hAnsi="Times New Roman" w:eastAsia="Times New Roman" w:cs="Times New Roman"/>
                 <w:b w:val="0"/>
-                <w:sz w:val="15"/>
+                <w:i w:val="0"/>
+                <w:sz w:val="22"/>
               </w:rPr>
               <w:t>45</w:t>
             </w:r>
@@ -957,14 +1141,20 @@
         </w:tc>
         <w:tc>
           <w:tcPr>
-            <w:tcW w:type="dxa" w:w="700"/>
+            <w:tcW w:type="dxa" w:w="750"/>
             <w:vAlign w:val="center"/>
             <w:tcMar>
-              <w:top w:w="40" w:type="dxa"/>
-              <w:bottom w:w="40" w:type="dxa"/>
+              <w:top w:w="30" w:type="dxa"/>
+              <w:bottom w:w="30" w:type="dxa"/>
               <w:left w:w="40" w:type="dxa"/>
               <w:right w:w="40" w:type="dxa"/>
             </w:tcMar>
+            <w:tcBorders>
+              <w:top w:val="single" w:sz="4" w:space="0" w:color="000000"/>
+              <w:left w:val="single" w:sz="4" w:space="0" w:color="000000"/>
+              <w:bottom w:val="single" w:sz="4" w:space="0" w:color="000000"/>
+              <w:right w:val="single" w:sz="4" w:space="0" w:color="000000"/>
+            </w:tcBorders>
           </w:tcPr>
           <w:p>
             <w:pPr>
@@ -975,7 +1165,8 @@
               <w:rPr>
                 <w:rFonts w:ascii="Times New Roman" w:hAnsi="Times New Roman" w:eastAsia="Times New Roman" w:cs="Times New Roman"/>
                 <w:b w:val="0"/>
-                <w:sz w:val="15"/>
+                <w:i w:val="0"/>
+                <w:sz w:val="22"/>
               </w:rPr>
               <w:t>6000</w:t>
             </w:r>
@@ -983,14 +1174,20 @@
         </w:tc>
         <w:tc>
           <w:tcPr>
-            <w:tcW w:type="dxa" w:w="1100"/>
+            <w:tcW w:type="dxa" w:w="1200"/>
             <w:vAlign w:val="center"/>
             <w:tcMar>
-              <w:top w:w="40" w:type="dxa"/>
-              <w:bottom w:w="40" w:type="dxa"/>
+              <w:top w:w="30" w:type="dxa"/>
+              <w:bottom w:w="30" w:type="dxa"/>
               <w:left w:w="40" w:type="dxa"/>
               <w:right w:w="40" w:type="dxa"/>
             </w:tcMar>
+            <w:tcBorders>
+              <w:top w:val="single" w:sz="4" w:space="0" w:color="000000"/>
+              <w:left w:val="single" w:sz="4" w:space="0" w:color="000000"/>
+              <w:bottom w:val="single" w:sz="4" w:space="0" w:color="000000"/>
+              <w:right w:val="single" w:sz="4" w:space="0" w:color="000000"/>
+            </w:tcBorders>
           </w:tcPr>
           <w:p>
             <w:pPr>
@@ -1001,7 +1198,8 @@
               <w:rPr>
                 <w:rFonts w:ascii="Times New Roman" w:hAnsi="Times New Roman" w:eastAsia="Times New Roman" w:cs="Times New Roman"/>
                 <w:b w:val="0"/>
-                <w:sz w:val="15"/>
+                <w:i w:val="0"/>
+                <w:sz w:val="22"/>
               </w:rPr>
               <w:t>270 000</w:t>
             </w:r>
@@ -1009,14 +1207,20 @@
         </w:tc>
         <w:tc>
           <w:tcPr>
-            <w:tcW w:type="dxa" w:w="1200"/>
+            <w:tcW w:type="dxa" w:w="1400"/>
             <w:vAlign w:val="center"/>
             <w:tcMar>
-              <w:top w:w="40" w:type="dxa"/>
-              <w:bottom w:w="40" w:type="dxa"/>
+              <w:top w:w="30" w:type="dxa"/>
+              <w:bottom w:w="30" w:type="dxa"/>
               <w:left w:w="40" w:type="dxa"/>
               <w:right w:w="40" w:type="dxa"/>
             </w:tcMar>
+            <w:tcBorders>
+              <w:top w:val="single" w:sz="4" w:space="0" w:color="000000"/>
+              <w:left w:val="single" w:sz="4" w:space="0" w:color="000000"/>
+              <w:bottom w:val="single" w:sz="4" w:space="0" w:color="000000"/>
+              <w:right w:val="single" w:sz="4" w:space="0" w:color="000000"/>
+            </w:tcBorders>
             <w:vMerge/>
           </w:tcPr>
           <w:p>
@@ -1028,21 +1232,28 @@
               <w:rPr>
                 <w:rFonts w:ascii="Times New Roman" w:hAnsi="Times New Roman" w:eastAsia="Times New Roman" w:cs="Times New Roman"/>
                 <w:b w:val="0"/>
-                <w:sz w:val="15"/>
+                <w:i w:val="0"/>
+                <w:sz w:val="22"/>
               </w:rPr>
             </w:r>
           </w:p>
         </w:tc>
         <w:tc>
           <w:tcPr>
-            <w:tcW w:type="dxa" w:w="1100"/>
+            <w:tcW w:type="dxa" w:w="1000"/>
             <w:vAlign w:val="center"/>
             <w:tcMar>
-              <w:top w:w="40" w:type="dxa"/>
-              <w:bottom w:w="40" w:type="dxa"/>
+              <w:top w:w="30" w:type="dxa"/>
+              <w:bottom w:w="30" w:type="dxa"/>
               <w:left w:w="40" w:type="dxa"/>
               <w:right w:w="40" w:type="dxa"/>
             </w:tcMar>
+            <w:tcBorders>
+              <w:top w:val="single" w:sz="4" w:space="0" w:color="000000"/>
+              <w:left w:val="single" w:sz="4" w:space="0" w:color="000000"/>
+              <w:bottom w:val="single" w:sz="4" w:space="0" w:color="000000"/>
+              <w:right w:val="single" w:sz="4" w:space="0" w:color="000000"/>
+            </w:tcBorders>
           </w:tcPr>
           <w:p>
             <w:pPr>
@@ -1053,7 +1264,8 @@
               <w:rPr>
                 <w:rFonts w:ascii="Times New Roman" w:hAnsi="Times New Roman" w:eastAsia="Times New Roman" w:cs="Times New Roman"/>
                 <w:b w:val="0"/>
-                <w:sz w:val="15"/>
+                <w:i w:val="0"/>
+                <w:sz w:val="22"/>
               </w:rPr>
             </w:r>
           </w:p>
@@ -1062,14 +1274,20 @@
       <w:tr>
         <w:tc>
           <w:tcPr>
-            <w:tcW w:type="dxa" w:w="500"/>
+            <w:tcW w:type="dxa" w:w="550"/>
             <w:vAlign w:val="center"/>
             <w:tcMar>
-              <w:top w:w="40" w:type="dxa"/>
-              <w:bottom w:w="40" w:type="dxa"/>
+              <w:top w:w="30" w:type="dxa"/>
+              <w:bottom w:w="30" w:type="dxa"/>
               <w:left w:w="40" w:type="dxa"/>
               <w:right w:w="40" w:type="dxa"/>
             </w:tcMar>
+            <w:tcBorders>
+              <w:top w:val="single" w:sz="4" w:space="0" w:color="000000"/>
+              <w:left w:val="single" w:sz="4" w:space="0" w:color="000000"/>
+              <w:bottom w:val="single" w:sz="4" w:space="0" w:color="000000"/>
+              <w:right w:val="single" w:sz="4" w:space="0" w:color="000000"/>
+            </w:tcBorders>
           </w:tcPr>
           <w:p>
             <w:pPr>
@@ -1080,7 +1298,8 @@
               <w:rPr>
                 <w:rFonts w:ascii="Times New Roman" w:hAnsi="Times New Roman" w:eastAsia="Times New Roman" w:cs="Times New Roman"/>
                 <w:b w:val="0"/>
-                <w:sz w:val="15"/>
+                <w:i w:val="0"/>
+                <w:sz w:val="22"/>
               </w:rPr>
               <w:t>3</w:t>
             </w:r>
@@ -1088,14 +1307,20 @@
         </w:tc>
         <w:tc>
           <w:tcPr>
-            <w:tcW w:type="dxa" w:w="1800"/>
+            <w:tcW w:type="dxa" w:w="1900"/>
             <w:vAlign w:val="center"/>
             <w:tcMar>
-              <w:top w:w="40" w:type="dxa"/>
-              <w:bottom w:w="40" w:type="dxa"/>
+              <w:top w:w="30" w:type="dxa"/>
+              <w:bottom w:w="30" w:type="dxa"/>
               <w:left w:w="40" w:type="dxa"/>
               <w:right w:w="40" w:type="dxa"/>
             </w:tcMar>
+            <w:tcBorders>
+              <w:top w:val="single" w:sz="4" w:space="0" w:color="000000"/>
+              <w:left w:val="single" w:sz="4" w:space="0" w:color="000000"/>
+              <w:bottom w:val="single" w:sz="4" w:space="0" w:color="000000"/>
+              <w:right w:val="single" w:sz="4" w:space="0" w:color="000000"/>
+            </w:tcBorders>
             <w:vMerge/>
           </w:tcPr>
           <w:p>
@@ -1107,21 +1332,28 @@
               <w:rPr>
                 <w:rFonts w:ascii="Times New Roman" w:hAnsi="Times New Roman" w:eastAsia="Times New Roman" w:cs="Times New Roman"/>
                 <w:b w:val="0"/>
-                <w:sz w:val="15"/>
+                <w:i w:val="0"/>
+                <w:sz w:val="22"/>
               </w:rPr>
             </w:r>
           </w:p>
         </w:tc>
         <w:tc>
           <w:tcPr>
-            <w:tcW w:type="dxa" w:w="2400"/>
+            <w:tcW w:type="dxa" w:w="2500"/>
             <w:vAlign w:val="center"/>
             <w:tcMar>
-              <w:top w:w="40" w:type="dxa"/>
-              <w:bottom w:w="40" w:type="dxa"/>
+              <w:top w:w="30" w:type="dxa"/>
+              <w:bottom w:w="30" w:type="dxa"/>
               <w:left w:w="40" w:type="dxa"/>
               <w:right w:w="40" w:type="dxa"/>
             </w:tcMar>
+            <w:tcBorders>
+              <w:top w:val="single" w:sz="4" w:space="0" w:color="000000"/>
+              <w:left w:val="single" w:sz="4" w:space="0" w:color="000000"/>
+              <w:bottom w:val="single" w:sz="4" w:space="0" w:color="000000"/>
+              <w:right w:val="single" w:sz="4" w:space="0" w:color="000000"/>
+            </w:tcBorders>
           </w:tcPr>
           <w:p>
             <w:pPr>
@@ -1132,7 +1364,8 @@
               <w:rPr>
                 <w:rFonts w:ascii="Times New Roman" w:hAnsi="Times New Roman" w:eastAsia="Times New Roman" w:cs="Times New Roman"/>
                 <w:b w:val="0"/>
-                <w:sz w:val="15"/>
+                <w:i w:val="0"/>
+                <w:sz w:val="22"/>
               </w:rPr>
               <w:t>Tôle 2,50</w:t>
             </w:r>
@@ -1140,14 +1373,20 @@
         </w:tc>
         <w:tc>
           <w:tcPr>
-            <w:tcW w:type="dxa" w:w="1000"/>
+            <w:tcW w:type="dxa" w:w="1100"/>
             <w:vAlign w:val="center"/>
             <w:tcMar>
-              <w:top w:w="40" w:type="dxa"/>
-              <w:bottom w:w="40" w:type="dxa"/>
+              <w:top w:w="30" w:type="dxa"/>
+              <w:bottom w:w="30" w:type="dxa"/>
               <w:left w:w="40" w:type="dxa"/>
               <w:right w:w="40" w:type="dxa"/>
             </w:tcMar>
+            <w:tcBorders>
+              <w:top w:val="single" w:sz="4" w:space="0" w:color="000000"/>
+              <w:left w:val="single" w:sz="4" w:space="0" w:color="000000"/>
+              <w:bottom w:val="single" w:sz="4" w:space="0" w:color="000000"/>
+              <w:right w:val="single" w:sz="4" w:space="0" w:color="000000"/>
+            </w:tcBorders>
           </w:tcPr>
           <w:p>
             <w:pPr>
@@ -1158,7 +1397,8 @@
               <w:rPr>
                 <w:rFonts w:ascii="Times New Roman" w:hAnsi="Times New Roman" w:eastAsia="Times New Roman" w:cs="Times New Roman"/>
                 <w:b w:val="0"/>
-                <w:sz w:val="15"/>
+                <w:i w:val="0"/>
+                <w:sz w:val="22"/>
               </w:rPr>
               <w:t>30</w:t>
             </w:r>
@@ -1166,14 +1406,20 @@
         </w:tc>
         <w:tc>
           <w:tcPr>
-            <w:tcW w:type="dxa" w:w="700"/>
+            <w:tcW w:type="dxa" w:w="750"/>
             <w:vAlign w:val="center"/>
             <w:tcMar>
-              <w:top w:w="40" w:type="dxa"/>
-              <w:bottom w:w="40" w:type="dxa"/>
+              <w:top w:w="30" w:type="dxa"/>
+              <w:bottom w:w="30" w:type="dxa"/>
               <w:left w:w="40" w:type="dxa"/>
               <w:right w:w="40" w:type="dxa"/>
             </w:tcMar>
+            <w:tcBorders>
+              <w:top w:val="single" w:sz="4" w:space="0" w:color="000000"/>
+              <w:left w:val="single" w:sz="4" w:space="0" w:color="000000"/>
+              <w:bottom w:val="single" w:sz="4" w:space="0" w:color="000000"/>
+              <w:right w:val="single" w:sz="4" w:space="0" w:color="000000"/>
+            </w:tcBorders>
           </w:tcPr>
           <w:p>
             <w:pPr>
@@ -1184,7 +1430,8 @@
               <w:rPr>
                 <w:rFonts w:ascii="Times New Roman" w:hAnsi="Times New Roman" w:eastAsia="Times New Roman" w:cs="Times New Roman"/>
                 <w:b w:val="0"/>
-                <w:sz w:val="15"/>
+                <w:i w:val="0"/>
+                <w:sz w:val="22"/>
               </w:rPr>
               <w:t>40000</w:t>
             </w:r>
@@ -1192,14 +1439,20 @@
         </w:tc>
         <w:tc>
           <w:tcPr>
-            <w:tcW w:type="dxa" w:w="1100"/>
+            <w:tcW w:type="dxa" w:w="1200"/>
             <w:vAlign w:val="center"/>
             <w:tcMar>
-              <w:top w:w="40" w:type="dxa"/>
-              <w:bottom w:w="40" w:type="dxa"/>
+              <w:top w:w="30" w:type="dxa"/>
+              <w:bottom w:w="30" w:type="dxa"/>
               <w:left w:w="40" w:type="dxa"/>
               <w:right w:w="40" w:type="dxa"/>
             </w:tcMar>
+            <w:tcBorders>
+              <w:top w:val="single" w:sz="4" w:space="0" w:color="000000"/>
+              <w:left w:val="single" w:sz="4" w:space="0" w:color="000000"/>
+              <w:bottom w:val="single" w:sz="4" w:space="0" w:color="000000"/>
+              <w:right w:val="single" w:sz="4" w:space="0" w:color="000000"/>
+            </w:tcBorders>
           </w:tcPr>
           <w:p>
             <w:pPr>
@@ -1210,7 +1463,8 @@
               <w:rPr>
                 <w:rFonts w:ascii="Times New Roman" w:hAnsi="Times New Roman" w:eastAsia="Times New Roman" w:cs="Times New Roman"/>
                 <w:b w:val="0"/>
-                <w:sz w:val="15"/>
+                <w:i w:val="0"/>
+                <w:sz w:val="22"/>
               </w:rPr>
               <w:t>1 200 000</w:t>
             </w:r>
@@ -1218,14 +1472,20 @@
         </w:tc>
         <w:tc>
           <w:tcPr>
-            <w:tcW w:type="dxa" w:w="1200"/>
+            <w:tcW w:type="dxa" w:w="1400"/>
             <w:vAlign w:val="center"/>
             <w:tcMar>
-              <w:top w:w="40" w:type="dxa"/>
-              <w:bottom w:w="40" w:type="dxa"/>
+              <w:top w:w="30" w:type="dxa"/>
+              <w:bottom w:w="30" w:type="dxa"/>
               <w:left w:w="40" w:type="dxa"/>
               <w:right w:w="40" w:type="dxa"/>
             </w:tcMar>
+            <w:tcBorders>
+              <w:top w:val="single" w:sz="4" w:space="0" w:color="000000"/>
+              <w:left w:val="single" w:sz="4" w:space="0" w:color="000000"/>
+              <w:bottom w:val="single" w:sz="4" w:space="0" w:color="000000"/>
+              <w:right w:val="single" w:sz="4" w:space="0" w:color="000000"/>
+            </w:tcBorders>
             <w:vMerge/>
           </w:tcPr>
           <w:p>
@@ -1237,21 +1497,28 @@
               <w:rPr>
                 <w:rFonts w:ascii="Times New Roman" w:hAnsi="Times New Roman" w:eastAsia="Times New Roman" w:cs="Times New Roman"/>
                 <w:b w:val="0"/>
-                <w:sz w:val="15"/>
+                <w:i w:val="0"/>
+                <w:sz w:val="22"/>
               </w:rPr>
             </w:r>
           </w:p>
         </w:tc>
         <w:tc>
           <w:tcPr>
-            <w:tcW w:type="dxa" w:w="1100"/>
+            <w:tcW w:type="dxa" w:w="1000"/>
             <w:vAlign w:val="center"/>
             <w:tcMar>
-              <w:top w:w="40" w:type="dxa"/>
-              <w:bottom w:w="40" w:type="dxa"/>
+              <w:top w:w="30" w:type="dxa"/>
+              <w:bottom w:w="30" w:type="dxa"/>
               <w:left w:w="40" w:type="dxa"/>
               <w:right w:w="40" w:type="dxa"/>
             </w:tcMar>
+            <w:tcBorders>
+              <w:top w:val="single" w:sz="4" w:space="0" w:color="000000"/>
+              <w:left w:val="single" w:sz="4" w:space="0" w:color="000000"/>
+              <w:bottom w:val="single" w:sz="4" w:space="0" w:color="000000"/>
+              <w:right w:val="single" w:sz="4" w:space="0" w:color="000000"/>
+            </w:tcBorders>
           </w:tcPr>
           <w:p>
             <w:pPr>
@@ -1262,7 +1529,8 @@
               <w:rPr>
                 <w:rFonts w:ascii="Times New Roman" w:hAnsi="Times New Roman" w:eastAsia="Times New Roman" w:cs="Times New Roman"/>
                 <w:b w:val="0"/>
-                <w:sz w:val="15"/>
+                <w:i w:val="0"/>
+                <w:sz w:val="22"/>
               </w:rPr>
             </w:r>
           </w:p>
@@ -1271,14 +1539,20 @@
       <w:tr>
         <w:tc>
           <w:tcPr>
-            <w:tcW w:type="dxa" w:w="500"/>
+            <w:tcW w:type="dxa" w:w="550"/>
             <w:vAlign w:val="center"/>
             <w:tcMar>
-              <w:top w:w="40" w:type="dxa"/>
-              <w:bottom w:w="40" w:type="dxa"/>
+              <w:top w:w="30" w:type="dxa"/>
+              <w:bottom w:w="30" w:type="dxa"/>
               <w:left w:w="40" w:type="dxa"/>
               <w:right w:w="40" w:type="dxa"/>
             </w:tcMar>
+            <w:tcBorders>
+              <w:top w:val="single" w:sz="4" w:space="0" w:color="000000"/>
+              <w:left w:val="single" w:sz="4" w:space="0" w:color="000000"/>
+              <w:bottom w:val="single" w:sz="4" w:space="0" w:color="000000"/>
+              <w:right w:val="single" w:sz="4" w:space="0" w:color="000000"/>
+            </w:tcBorders>
           </w:tcPr>
           <w:p>
             <w:pPr>
@@ -1289,7 +1563,8 @@
               <w:rPr>
                 <w:rFonts w:ascii="Times New Roman" w:hAnsi="Times New Roman" w:eastAsia="Times New Roman" w:cs="Times New Roman"/>
                 <w:b w:val="0"/>
-                <w:sz w:val="15"/>
+                <w:i w:val="0"/>
+                <w:sz w:val="22"/>
               </w:rPr>
               <w:t>4</w:t>
             </w:r>
@@ -1297,14 +1572,20 @@
         </w:tc>
         <w:tc>
           <w:tcPr>
-            <w:tcW w:type="dxa" w:w="1800"/>
+            <w:tcW w:type="dxa" w:w="1900"/>
             <w:vAlign w:val="center"/>
             <w:tcMar>
-              <w:top w:w="40" w:type="dxa"/>
-              <w:bottom w:w="40" w:type="dxa"/>
+              <w:top w:w="30" w:type="dxa"/>
+              <w:bottom w:w="30" w:type="dxa"/>
               <w:left w:w="40" w:type="dxa"/>
               <w:right w:w="40" w:type="dxa"/>
             </w:tcMar>
+            <w:tcBorders>
+              <w:top w:val="single" w:sz="4" w:space="0" w:color="000000"/>
+              <w:left w:val="single" w:sz="4" w:space="0" w:color="000000"/>
+              <w:bottom w:val="single" w:sz="4" w:space="0" w:color="000000"/>
+              <w:right w:val="single" w:sz="4" w:space="0" w:color="000000"/>
+            </w:tcBorders>
             <w:vMerge/>
           </w:tcPr>
           <w:p>
@@ -1316,21 +1597,28 @@
               <w:rPr>
                 <w:rFonts w:ascii="Times New Roman" w:hAnsi="Times New Roman" w:eastAsia="Times New Roman" w:cs="Times New Roman"/>
                 <w:b w:val="0"/>
-                <w:sz w:val="15"/>
+                <w:i w:val="0"/>
+                <w:sz w:val="22"/>
               </w:rPr>
             </w:r>
           </w:p>
         </w:tc>
         <w:tc>
           <w:tcPr>
-            <w:tcW w:type="dxa" w:w="2400"/>
+            <w:tcW w:type="dxa" w:w="2500"/>
             <w:vAlign w:val="center"/>
             <w:tcMar>
-              <w:top w:w="40" w:type="dxa"/>
-              <w:bottom w:w="40" w:type="dxa"/>
+              <w:top w:w="30" w:type="dxa"/>
+              <w:bottom w:w="30" w:type="dxa"/>
               <w:left w:w="40" w:type="dxa"/>
               <w:right w:w="40" w:type="dxa"/>
             </w:tcMar>
+            <w:tcBorders>
+              <w:top w:val="single" w:sz="4" w:space="0" w:color="000000"/>
+              <w:left w:val="single" w:sz="4" w:space="0" w:color="000000"/>
+              <w:bottom w:val="single" w:sz="4" w:space="0" w:color="000000"/>
+              <w:right w:val="single" w:sz="4" w:space="0" w:color="000000"/>
+            </w:tcBorders>
           </w:tcPr>
           <w:p>
             <w:pPr>
@@ -1341,7 +1629,8 @@
               <w:rPr>
                 <w:rFonts w:ascii="Times New Roman" w:hAnsi="Times New Roman" w:eastAsia="Times New Roman" w:cs="Times New Roman"/>
                 <w:b w:val="0"/>
-                <w:sz w:val="15"/>
+                <w:i w:val="0"/>
+                <w:sz w:val="22"/>
               </w:rPr>
               <w:t>Pointe tôle</w:t>
             </w:r>
@@ -1349,14 +1638,20 @@
         </w:tc>
         <w:tc>
           <w:tcPr>
-            <w:tcW w:type="dxa" w:w="1000"/>
+            <w:tcW w:type="dxa" w:w="1100"/>
             <w:vAlign w:val="center"/>
             <w:tcMar>
-              <w:top w:w="40" w:type="dxa"/>
-              <w:bottom w:w="40" w:type="dxa"/>
+              <w:top w:w="30" w:type="dxa"/>
+              <w:bottom w:w="30" w:type="dxa"/>
               <w:left w:w="40" w:type="dxa"/>
               <w:right w:w="40" w:type="dxa"/>
             </w:tcMar>
+            <w:tcBorders>
+              <w:top w:val="single" w:sz="4" w:space="0" w:color="000000"/>
+              <w:left w:val="single" w:sz="4" w:space="0" w:color="000000"/>
+              <w:bottom w:val="single" w:sz="4" w:space="0" w:color="000000"/>
+              <w:right w:val="single" w:sz="4" w:space="0" w:color="000000"/>
+            </w:tcBorders>
           </w:tcPr>
           <w:p>
             <w:pPr>
@@ -1367,7 +1662,8 @@
               <w:rPr>
                 <w:rFonts w:ascii="Times New Roman" w:hAnsi="Times New Roman" w:eastAsia="Times New Roman" w:cs="Times New Roman"/>
                 <w:b w:val="0"/>
-                <w:sz w:val="15"/>
+                <w:i w:val="0"/>
+                <w:sz w:val="22"/>
               </w:rPr>
               <w:t>3</w:t>
             </w:r>
@@ -1375,14 +1671,20 @@
         </w:tc>
         <w:tc>
           <w:tcPr>
-            <w:tcW w:type="dxa" w:w="700"/>
+            <w:tcW w:type="dxa" w:w="750"/>
             <w:vAlign w:val="center"/>
             <w:tcMar>
-              <w:top w:w="40" w:type="dxa"/>
-              <w:bottom w:w="40" w:type="dxa"/>
+              <w:top w:w="30" w:type="dxa"/>
+              <w:bottom w:w="30" w:type="dxa"/>
               <w:left w:w="40" w:type="dxa"/>
               <w:right w:w="40" w:type="dxa"/>
             </w:tcMar>
+            <w:tcBorders>
+              <w:top w:val="single" w:sz="4" w:space="0" w:color="000000"/>
+              <w:left w:val="single" w:sz="4" w:space="0" w:color="000000"/>
+              <w:bottom w:val="single" w:sz="4" w:space="0" w:color="000000"/>
+              <w:right w:val="single" w:sz="4" w:space="0" w:color="000000"/>
+            </w:tcBorders>
           </w:tcPr>
           <w:p>
             <w:pPr>
@@ -1393,7 +1695,8 @@
               <w:rPr>
                 <w:rFonts w:ascii="Times New Roman" w:hAnsi="Times New Roman" w:eastAsia="Times New Roman" w:cs="Times New Roman"/>
                 <w:b w:val="0"/>
-                <w:sz w:val="15"/>
+                <w:i w:val="0"/>
+                <w:sz w:val="22"/>
               </w:rPr>
               <w:t>9000</w:t>
             </w:r>
@@ -1401,14 +1704,20 @@
         </w:tc>
         <w:tc>
           <w:tcPr>
-            <w:tcW w:type="dxa" w:w="1100"/>
+            <w:tcW w:type="dxa" w:w="1200"/>
             <w:vAlign w:val="center"/>
             <w:tcMar>
-              <w:top w:w="40" w:type="dxa"/>
-              <w:bottom w:w="40" w:type="dxa"/>
+              <w:top w:w="30" w:type="dxa"/>
+              <w:bottom w:w="30" w:type="dxa"/>
               <w:left w:w="40" w:type="dxa"/>
               <w:right w:w="40" w:type="dxa"/>
             </w:tcMar>
+            <w:tcBorders>
+              <w:top w:val="single" w:sz="4" w:space="0" w:color="000000"/>
+              <w:left w:val="single" w:sz="4" w:space="0" w:color="000000"/>
+              <w:bottom w:val="single" w:sz="4" w:space="0" w:color="000000"/>
+              <w:right w:val="single" w:sz="4" w:space="0" w:color="000000"/>
+            </w:tcBorders>
           </w:tcPr>
           <w:p>
             <w:pPr>
@@ -1419,7 +1728,8 @@
               <w:rPr>
                 <w:rFonts w:ascii="Times New Roman" w:hAnsi="Times New Roman" w:eastAsia="Times New Roman" w:cs="Times New Roman"/>
                 <w:b w:val="0"/>
-                <w:sz w:val="15"/>
+                <w:i w:val="0"/>
+                <w:sz w:val="22"/>
               </w:rPr>
               <w:t>27 000</w:t>
             </w:r>
@@ -1427,14 +1737,20 @@
         </w:tc>
         <w:tc>
           <w:tcPr>
-            <w:tcW w:type="dxa" w:w="1200"/>
+            <w:tcW w:type="dxa" w:w="1400"/>
             <w:vAlign w:val="center"/>
             <w:tcMar>
-              <w:top w:w="40" w:type="dxa"/>
-              <w:bottom w:w="40" w:type="dxa"/>
+              <w:top w:w="30" w:type="dxa"/>
+              <w:bottom w:w="30" w:type="dxa"/>
               <w:left w:w="40" w:type="dxa"/>
               <w:right w:w="40" w:type="dxa"/>
             </w:tcMar>
+            <w:tcBorders>
+              <w:top w:val="single" w:sz="4" w:space="0" w:color="000000"/>
+              <w:left w:val="single" w:sz="4" w:space="0" w:color="000000"/>
+              <w:bottom w:val="single" w:sz="4" w:space="0" w:color="000000"/>
+              <w:right w:val="single" w:sz="4" w:space="0" w:color="000000"/>
+            </w:tcBorders>
             <w:vMerge/>
           </w:tcPr>
           <w:p>
@@ -1445,8 +1761,9 @@
             <w:r>
               <w:rPr>
                 <w:rFonts w:ascii="Times New Roman" w:hAnsi="Times New Roman" w:eastAsia="Times New Roman" w:cs="Times New Roman"/>
-                <w:b w:val="0"/>
-                <w:sz w:val="15"/>
+                <w:b/>
+                <w:i/>
+                <w:sz w:val="22"/>
               </w:rPr>
               <w:t>ST : 1 857 000</w:t>
             </w:r>
@@ -1454,14 +1771,20 @@
         </w:tc>
         <w:tc>
           <w:tcPr>
-            <w:tcW w:type="dxa" w:w="1100"/>
+            <w:tcW w:type="dxa" w:w="1000"/>
             <w:vAlign w:val="center"/>
             <w:tcMar>
-              <w:top w:w="40" w:type="dxa"/>
-              <w:bottom w:w="40" w:type="dxa"/>
+              <w:top w:w="30" w:type="dxa"/>
+              <w:bottom w:w="30" w:type="dxa"/>
               <w:left w:w="40" w:type="dxa"/>
               <w:right w:w="40" w:type="dxa"/>
             </w:tcMar>
+            <w:tcBorders>
+              <w:top w:val="single" w:sz="4" w:space="0" w:color="000000"/>
+              <w:left w:val="single" w:sz="4" w:space="0" w:color="000000"/>
+              <w:bottom w:val="single" w:sz="4" w:space="0" w:color="000000"/>
+              <w:right w:val="single" w:sz="4" w:space="0" w:color="000000"/>
+            </w:tcBorders>
           </w:tcPr>
           <w:p>
             <w:pPr>
@@ -1472,7 +1795,8 @@
               <w:rPr>
                 <w:rFonts w:ascii="Times New Roman" w:hAnsi="Times New Roman" w:eastAsia="Times New Roman" w:cs="Times New Roman"/>
                 <w:b w:val="0"/>
-                <w:sz w:val="15"/>
+                <w:i w:val="0"/>
+                <w:sz w:val="22"/>
               </w:rPr>
             </w:r>
           </w:p>
@@ -1481,15 +1805,20 @@
       <w:tr>
         <w:tc>
           <w:tcPr>
-            <w:tcW w:type="dxa" w:w="500"/>
+            <w:tcW w:type="dxa" w:w="550"/>
             <w:vAlign w:val="center"/>
             <w:tcMar>
-              <w:top w:w="40" w:type="dxa"/>
-              <w:bottom w:w="40" w:type="dxa"/>
+              <w:top w:w="30" w:type="dxa"/>
+              <w:bottom w:w="30" w:type="dxa"/>
               <w:left w:w="40" w:type="dxa"/>
               <w:right w:w="40" w:type="dxa"/>
             </w:tcMar>
-            <w:shd w:fill="F7F7F7" w:val="clear"/>
+            <w:tcBorders>
+              <w:top w:val="single" w:sz="4" w:space="0" w:color="000000"/>
+              <w:left w:val="single" w:sz="4" w:space="0" w:color="000000"/>
+              <w:bottom w:val="single" w:sz="4" w:space="0" w:color="000000"/>
+              <w:right w:val="single" w:sz="4" w:space="0" w:color="000000"/>
+            </w:tcBorders>
           </w:tcPr>
           <w:p>
             <w:pPr>
@@ -1500,7 +1829,8 @@
               <w:rPr>
                 <w:rFonts w:ascii="Times New Roman" w:hAnsi="Times New Roman" w:eastAsia="Times New Roman" w:cs="Times New Roman"/>
                 <w:b w:val="0"/>
-                <w:sz w:val="15"/>
+                <w:i w:val="0"/>
+                <w:sz w:val="22"/>
               </w:rPr>
               <w:t>5</w:t>
             </w:r>
@@ -1508,15 +1838,20 @@
         </w:tc>
         <w:tc>
           <w:tcPr>
-            <w:tcW w:type="dxa" w:w="1800"/>
+            <w:tcW w:type="dxa" w:w="1900"/>
             <w:vAlign w:val="center"/>
             <w:tcMar>
-              <w:top w:w="40" w:type="dxa"/>
-              <w:bottom w:w="40" w:type="dxa"/>
+              <w:top w:w="30" w:type="dxa"/>
+              <w:bottom w:w="30" w:type="dxa"/>
               <w:left w:w="40" w:type="dxa"/>
               <w:right w:w="40" w:type="dxa"/>
             </w:tcMar>
-            <w:shd w:fill="F7F7F7" w:val="clear"/>
+            <w:tcBorders>
+              <w:top w:val="single" w:sz="4" w:space="0" w:color="000000"/>
+              <w:left w:val="single" w:sz="4" w:space="0" w:color="000000"/>
+              <w:bottom w:val="single" w:sz="4" w:space="0" w:color="000000"/>
+              <w:right w:val="single" w:sz="4" w:space="0" w:color="000000"/>
+            </w:tcBorders>
           </w:tcPr>
           <w:p>
             <w:pPr>
@@ -1527,7 +1862,8 @@
               <w:rPr>
                 <w:rFonts w:ascii="Times New Roman" w:hAnsi="Times New Roman" w:eastAsia="Times New Roman" w:cs="Times New Roman"/>
                 <w:b/>
-                <w:sz w:val="15"/>
+                <w:i w:val="0"/>
+                <w:sz w:val="22"/>
               </w:rPr>
               <w:t>Fividianana fitaovana ho an’ny mpampianatra</w:t>
             </w:r>
@@ -1535,15 +1871,20 @@
         </w:tc>
         <w:tc>
           <w:tcPr>
-            <w:tcW w:type="dxa" w:w="2400"/>
+            <w:tcW w:type="dxa" w:w="2500"/>
             <w:vAlign w:val="center"/>
             <w:tcMar>
-              <w:top w:w="40" w:type="dxa"/>
-              <w:bottom w:w="40" w:type="dxa"/>
+              <w:top w:w="30" w:type="dxa"/>
+              <w:bottom w:w="30" w:type="dxa"/>
               <w:left w:w="40" w:type="dxa"/>
               <w:right w:w="40" w:type="dxa"/>
             </w:tcMar>
-            <w:shd w:fill="F7F7F7" w:val="clear"/>
+            <w:tcBorders>
+              <w:top w:val="single" w:sz="4" w:space="0" w:color="000000"/>
+              <w:left w:val="single" w:sz="4" w:space="0" w:color="000000"/>
+              <w:bottom w:val="single" w:sz="4" w:space="0" w:color="000000"/>
+              <w:right w:val="single" w:sz="4" w:space="0" w:color="000000"/>
+            </w:tcBorders>
           </w:tcPr>
           <w:p>
             <w:pPr>
@@ -1554,7 +1895,8 @@
               <w:rPr>
                 <w:rFonts w:ascii="Times New Roman" w:hAnsi="Times New Roman" w:eastAsia="Times New Roman" w:cs="Times New Roman"/>
                 <w:b w:val="0"/>
-                <w:sz w:val="15"/>
+                <w:i w:val="0"/>
+                <w:sz w:val="22"/>
               </w:rPr>
               <w:t>Programme d’études complet (6 sections, préscolaire inclus)</w:t>
             </w:r>
@@ -1562,15 +1904,20 @@
         </w:tc>
         <w:tc>
           <w:tcPr>
-            <w:tcW w:type="dxa" w:w="1000"/>
+            <w:tcW w:type="dxa" w:w="1100"/>
             <w:vAlign w:val="center"/>
             <w:tcMar>
-              <w:top w:w="40" w:type="dxa"/>
-              <w:bottom w:w="40" w:type="dxa"/>
+              <w:top w:w="30" w:type="dxa"/>
+              <w:bottom w:w="30" w:type="dxa"/>
               <w:left w:w="40" w:type="dxa"/>
               <w:right w:w="40" w:type="dxa"/>
             </w:tcMar>
-            <w:shd w:fill="F7F7F7" w:val="clear"/>
+            <w:tcBorders>
+              <w:top w:val="single" w:sz="4" w:space="0" w:color="000000"/>
+              <w:left w:val="single" w:sz="4" w:space="0" w:color="000000"/>
+              <w:bottom w:val="single" w:sz="4" w:space="0" w:color="000000"/>
+              <w:right w:val="single" w:sz="4" w:space="0" w:color="000000"/>
+            </w:tcBorders>
           </w:tcPr>
           <w:p>
             <w:pPr>
@@ -1581,7 +1928,8 @@
               <w:rPr>
                 <w:rFonts w:ascii="Times New Roman" w:hAnsi="Times New Roman" w:eastAsia="Times New Roman" w:cs="Times New Roman"/>
                 <w:b w:val="0"/>
-                <w:sz w:val="15"/>
+                <w:i w:val="0"/>
+                <w:sz w:val="22"/>
               </w:rPr>
               <w:t>1</w:t>
             </w:r>
@@ -1589,15 +1937,20 @@
         </w:tc>
         <w:tc>
           <w:tcPr>
-            <w:tcW w:type="dxa" w:w="700"/>
+            <w:tcW w:type="dxa" w:w="750"/>
             <w:vAlign w:val="center"/>
             <w:tcMar>
-              <w:top w:w="40" w:type="dxa"/>
-              <w:bottom w:w="40" w:type="dxa"/>
+              <w:top w:w="30" w:type="dxa"/>
+              <w:bottom w:w="30" w:type="dxa"/>
               <w:left w:w="40" w:type="dxa"/>
               <w:right w:w="40" w:type="dxa"/>
             </w:tcMar>
-            <w:shd w:fill="F7F7F7" w:val="clear"/>
+            <w:tcBorders>
+              <w:top w:val="single" w:sz="4" w:space="0" w:color="000000"/>
+              <w:left w:val="single" w:sz="4" w:space="0" w:color="000000"/>
+              <w:bottom w:val="single" w:sz="4" w:space="0" w:color="000000"/>
+              <w:right w:val="single" w:sz="4" w:space="0" w:color="000000"/>
+            </w:tcBorders>
           </w:tcPr>
           <w:p>
             <w:pPr>
@@ -1608,7 +1961,8 @@
               <w:rPr>
                 <w:rFonts w:ascii="Times New Roman" w:hAnsi="Times New Roman" w:eastAsia="Times New Roman" w:cs="Times New Roman"/>
                 <w:b w:val="0"/>
-                <w:sz w:val="15"/>
+                <w:i w:val="0"/>
+                <w:sz w:val="22"/>
               </w:rPr>
               <w:t>100000</w:t>
             </w:r>
@@ -1616,15 +1970,20 @@
         </w:tc>
         <w:tc>
           <w:tcPr>
-            <w:tcW w:type="dxa" w:w="1100"/>
+            <w:tcW w:type="dxa" w:w="1200"/>
             <w:vAlign w:val="center"/>
             <w:tcMar>
-              <w:top w:w="40" w:type="dxa"/>
-              <w:bottom w:w="40" w:type="dxa"/>
+              <w:top w:w="30" w:type="dxa"/>
+              <w:bottom w:w="30" w:type="dxa"/>
               <w:left w:w="40" w:type="dxa"/>
               <w:right w:w="40" w:type="dxa"/>
             </w:tcMar>
-            <w:shd w:fill="F7F7F7" w:val="clear"/>
+            <w:tcBorders>
+              <w:top w:val="single" w:sz="4" w:space="0" w:color="000000"/>
+              <w:left w:val="single" w:sz="4" w:space="0" w:color="000000"/>
+              <w:bottom w:val="single" w:sz="4" w:space="0" w:color="000000"/>
+              <w:right w:val="single" w:sz="4" w:space="0" w:color="000000"/>
+            </w:tcBorders>
           </w:tcPr>
           <w:p>
             <w:pPr>
@@ -1635,7 +1994,8 @@
               <w:rPr>
                 <w:rFonts w:ascii="Times New Roman" w:hAnsi="Times New Roman" w:eastAsia="Times New Roman" w:cs="Times New Roman"/>
                 <w:b w:val="0"/>
-                <w:sz w:val="15"/>
+                <w:i w:val="0"/>
+                <w:sz w:val="22"/>
               </w:rPr>
               <w:t>100 000</w:t>
             </w:r>
@@ -1643,15 +2003,20 @@
         </w:tc>
         <w:tc>
           <w:tcPr>
-            <w:tcW w:type="dxa" w:w="1200"/>
+            <w:tcW w:type="dxa" w:w="1400"/>
             <w:vAlign w:val="center"/>
             <w:tcMar>
-              <w:top w:w="40" w:type="dxa"/>
-              <w:bottom w:w="40" w:type="dxa"/>
+              <w:top w:w="30" w:type="dxa"/>
+              <w:bottom w:w="30" w:type="dxa"/>
               <w:left w:w="40" w:type="dxa"/>
               <w:right w:w="40" w:type="dxa"/>
             </w:tcMar>
-            <w:shd w:fill="F7F7F7" w:val="clear"/>
+            <w:tcBorders>
+              <w:top w:val="single" w:sz="4" w:space="0" w:color="000000"/>
+              <w:left w:val="single" w:sz="4" w:space="0" w:color="000000"/>
+              <w:bottom w:val="single" w:sz="4" w:space="0" w:color="000000"/>
+              <w:right w:val="single" w:sz="4" w:space="0" w:color="000000"/>
+            </w:tcBorders>
           </w:tcPr>
           <w:p>
             <w:pPr>
@@ -1662,7 +2027,8 @@
               <w:rPr>
                 <w:rFonts w:ascii="Times New Roman" w:hAnsi="Times New Roman" w:eastAsia="Times New Roman" w:cs="Times New Roman"/>
                 <w:b w:val="0"/>
-                <w:sz w:val="15"/>
+                <w:i w:val="0"/>
+                <w:sz w:val="22"/>
               </w:rPr>
               <w:t>VOI</w:t>
             </w:r>
@@ -1675,8 +2041,9 @@
             <w:r>
               <w:rPr>
                 <w:rFonts w:ascii="Times New Roman" w:hAnsi="Times New Roman" w:eastAsia="Times New Roman" w:cs="Times New Roman"/>
-                <w:b w:val="0"/>
-                <w:sz w:val="15"/>
+                <w:b/>
+                <w:i/>
+                <w:sz w:val="22"/>
               </w:rPr>
               <w:t>ST : 100 000</w:t>
             </w:r>
@@ -1684,15 +2051,20 @@
         </w:tc>
         <w:tc>
           <w:tcPr>
-            <w:tcW w:type="dxa" w:w="1100"/>
+            <w:tcW w:type="dxa" w:w="1000"/>
             <w:vAlign w:val="center"/>
             <w:tcMar>
-              <w:top w:w="40" w:type="dxa"/>
-              <w:bottom w:w="40" w:type="dxa"/>
+              <w:top w:w="30" w:type="dxa"/>
+              <w:bottom w:w="30" w:type="dxa"/>
               <w:left w:w="40" w:type="dxa"/>
               <w:right w:w="40" w:type="dxa"/>
             </w:tcMar>
-            <w:shd w:fill="F7F7F7" w:val="clear"/>
+            <w:tcBorders>
+              <w:top w:val="single" w:sz="4" w:space="0" w:color="000000"/>
+              <w:left w:val="single" w:sz="4" w:space="0" w:color="000000"/>
+              <w:bottom w:val="single" w:sz="4" w:space="0" w:color="000000"/>
+              <w:right w:val="single" w:sz="4" w:space="0" w:color="000000"/>
+            </w:tcBorders>
           </w:tcPr>
           <w:p>
             <w:pPr>
@@ -1703,7 +2075,8 @@
               <w:rPr>
                 <w:rFonts w:ascii="Times New Roman" w:hAnsi="Times New Roman" w:eastAsia="Times New Roman" w:cs="Times New Roman"/>
                 <w:b w:val="0"/>
-                <w:sz w:val="15"/>
+                <w:i w:val="0"/>
+                <w:sz w:val="22"/>
               </w:rPr>
             </w:r>
           </w:p>
@@ -1712,14 +2085,20 @@
       <w:tr>
         <w:tc>
           <w:tcPr>
-            <w:tcW w:type="dxa" w:w="500"/>
+            <w:tcW w:type="dxa" w:w="550"/>
             <w:vAlign w:val="center"/>
             <w:tcMar>
-              <w:top w:w="40" w:type="dxa"/>
-              <w:bottom w:w="40" w:type="dxa"/>
+              <w:top w:w="30" w:type="dxa"/>
+              <w:bottom w:w="30" w:type="dxa"/>
               <w:left w:w="40" w:type="dxa"/>
               <w:right w:w="40" w:type="dxa"/>
             </w:tcMar>
+            <w:tcBorders>
+              <w:top w:val="single" w:sz="4" w:space="0" w:color="000000"/>
+              <w:left w:val="single" w:sz="4" w:space="0" w:color="000000"/>
+              <w:bottom w:val="single" w:sz="4" w:space="0" w:color="000000"/>
+              <w:right w:val="single" w:sz="4" w:space="0" w:color="000000"/>
+            </w:tcBorders>
           </w:tcPr>
           <w:p>
             <w:pPr>
@@ -1730,7 +2109,8 @@
               <w:rPr>
                 <w:rFonts w:ascii="Times New Roman" w:hAnsi="Times New Roman" w:eastAsia="Times New Roman" w:cs="Times New Roman"/>
                 <w:b w:val="0"/>
-                <w:sz w:val="15"/>
+                <w:i w:val="0"/>
+                <w:sz w:val="22"/>
               </w:rPr>
               <w:t>6</w:t>
             </w:r>
@@ -1738,14 +2118,20 @@
         </w:tc>
         <w:tc>
           <w:tcPr>
-            <w:tcW w:type="dxa" w:w="1800"/>
+            <w:tcW w:type="dxa" w:w="1900"/>
             <w:vAlign w:val="center"/>
             <w:tcMar>
-              <w:top w:w="40" w:type="dxa"/>
-              <w:bottom w:w="40" w:type="dxa"/>
+              <w:top w:w="30" w:type="dxa"/>
+              <w:bottom w:w="30" w:type="dxa"/>
               <w:left w:w="40" w:type="dxa"/>
               <w:right w:w="40" w:type="dxa"/>
             </w:tcMar>
+            <w:tcBorders>
+              <w:top w:val="single" w:sz="4" w:space="0" w:color="000000"/>
+              <w:left w:val="single" w:sz="4" w:space="0" w:color="000000"/>
+              <w:bottom w:val="single" w:sz="4" w:space="0" w:color="000000"/>
+              <w:right w:val="single" w:sz="4" w:space="0" w:color="000000"/>
+            </w:tcBorders>
           </w:tcPr>
           <w:p>
             <w:pPr>
@@ -1756,7 +2142,8 @@
               <w:rPr>
                 <w:rFonts w:ascii="Times New Roman" w:hAnsi="Times New Roman" w:eastAsia="Times New Roman" w:cs="Times New Roman"/>
                 <w:b/>
-                <w:sz w:val="15"/>
+                <w:i w:val="0"/>
+                <w:sz w:val="22"/>
               </w:rPr>
               <w:t>Fandraisana mpampianatra</w:t>
             </w:r>
@@ -1764,14 +2151,20 @@
         </w:tc>
         <w:tc>
           <w:tcPr>
-            <w:tcW w:type="dxa" w:w="2400"/>
+            <w:tcW w:type="dxa" w:w="2500"/>
             <w:vAlign w:val="center"/>
             <w:tcMar>
-              <w:top w:w="40" w:type="dxa"/>
-              <w:bottom w:w="40" w:type="dxa"/>
+              <w:top w:w="30" w:type="dxa"/>
+              <w:bottom w:w="30" w:type="dxa"/>
               <w:left w:w="40" w:type="dxa"/>
               <w:right w:w="40" w:type="dxa"/>
             </w:tcMar>
+            <w:tcBorders>
+              <w:top w:val="single" w:sz="4" w:space="0" w:color="000000"/>
+              <w:left w:val="single" w:sz="4" w:space="0" w:color="000000"/>
+              <w:bottom w:val="single" w:sz="4" w:space="0" w:color="000000"/>
+              <w:right w:val="single" w:sz="4" w:space="0" w:color="000000"/>
+            </w:tcBorders>
           </w:tcPr>
           <w:p>
             <w:pPr>
@@ -1782,7 +2175,8 @@
               <w:rPr>
                 <w:rFonts w:ascii="Times New Roman" w:hAnsi="Times New Roman" w:eastAsia="Times New Roman" w:cs="Times New Roman"/>
                 <w:b w:val="0"/>
-                <w:sz w:val="15"/>
+                <w:i w:val="0"/>
+                <w:sz w:val="22"/>
               </w:rPr>
               <w:t>Karamana mpampianatra</w:t>
             </w:r>
@@ -1790,14 +2184,20 @@
         </w:tc>
         <w:tc>
           <w:tcPr>
-            <w:tcW w:type="dxa" w:w="1000"/>
+            <w:tcW w:type="dxa" w:w="1100"/>
             <w:vAlign w:val="center"/>
             <w:tcMar>
-              <w:top w:w="40" w:type="dxa"/>
-              <w:bottom w:w="40" w:type="dxa"/>
+              <w:top w:w="30" w:type="dxa"/>
+              <w:bottom w:w="30" w:type="dxa"/>
               <w:left w:w="40" w:type="dxa"/>
               <w:right w:w="40" w:type="dxa"/>
             </w:tcMar>
+            <w:tcBorders>
+              <w:top w:val="single" w:sz="4" w:space="0" w:color="000000"/>
+              <w:left w:val="single" w:sz="4" w:space="0" w:color="000000"/>
+              <w:bottom w:val="single" w:sz="4" w:space="0" w:color="000000"/>
+              <w:right w:val="single" w:sz="4" w:space="0" w:color="000000"/>
+            </w:tcBorders>
           </w:tcPr>
           <w:p>
             <w:pPr>
@@ -1808,7 +2208,8 @@
               <w:rPr>
                 <w:rFonts w:ascii="Times New Roman" w:hAnsi="Times New Roman" w:eastAsia="Times New Roman" w:cs="Times New Roman"/>
                 <w:b w:val="0"/>
-                <w:sz w:val="15"/>
+                <w:i w:val="0"/>
+                <w:sz w:val="22"/>
               </w:rPr>
               <w:t>4</w:t>
             </w:r>
@@ -1816,14 +2217,20 @@
         </w:tc>
         <w:tc>
           <w:tcPr>
-            <w:tcW w:type="dxa" w:w="700"/>
+            <w:tcW w:type="dxa" w:w="750"/>
             <w:vAlign w:val="center"/>
             <w:tcMar>
-              <w:top w:w="40" w:type="dxa"/>
-              <w:bottom w:w="40" w:type="dxa"/>
+              <w:top w:w="30" w:type="dxa"/>
+              <w:bottom w:w="30" w:type="dxa"/>
               <w:left w:w="40" w:type="dxa"/>
               <w:right w:w="40" w:type="dxa"/>
             </w:tcMar>
+            <w:tcBorders>
+              <w:top w:val="single" w:sz="4" w:space="0" w:color="000000"/>
+              <w:left w:val="single" w:sz="4" w:space="0" w:color="000000"/>
+              <w:bottom w:val="single" w:sz="4" w:space="0" w:color="000000"/>
+              <w:right w:val="single" w:sz="4" w:space="0" w:color="000000"/>
+            </w:tcBorders>
           </w:tcPr>
           <w:p>
             <w:pPr>
@@ -1834,7 +2241,8 @@
               <w:rPr>
                 <w:rFonts w:ascii="Times New Roman" w:hAnsi="Times New Roman" w:eastAsia="Times New Roman" w:cs="Times New Roman"/>
                 <w:b w:val="0"/>
-                <w:sz w:val="15"/>
+                <w:i w:val="0"/>
+                <w:sz w:val="22"/>
               </w:rPr>
               <w:t>1250000</w:t>
             </w:r>
@@ -1842,14 +2250,20 @@
         </w:tc>
         <w:tc>
           <w:tcPr>
-            <w:tcW w:type="dxa" w:w="1100"/>
+            <w:tcW w:type="dxa" w:w="1200"/>
             <w:vAlign w:val="center"/>
             <w:tcMar>
-              <w:top w:w="40" w:type="dxa"/>
-              <w:bottom w:w="40" w:type="dxa"/>
+              <w:top w:w="30" w:type="dxa"/>
+              <w:bottom w:w="30" w:type="dxa"/>
               <w:left w:w="40" w:type="dxa"/>
               <w:right w:w="40" w:type="dxa"/>
             </w:tcMar>
+            <w:tcBorders>
+              <w:top w:val="single" w:sz="4" w:space="0" w:color="000000"/>
+              <w:left w:val="single" w:sz="4" w:space="0" w:color="000000"/>
+              <w:bottom w:val="single" w:sz="4" w:space="0" w:color="000000"/>
+              <w:right w:val="single" w:sz="4" w:space="0" w:color="000000"/>
+            </w:tcBorders>
           </w:tcPr>
           <w:p>
             <w:pPr>
@@ -1860,7 +2274,8 @@
               <w:rPr>
                 <w:rFonts w:ascii="Times New Roman" w:hAnsi="Times New Roman" w:eastAsia="Times New Roman" w:cs="Times New Roman"/>
                 <w:b w:val="0"/>
-                <w:sz w:val="15"/>
+                <w:i w:val="0"/>
+                <w:sz w:val="22"/>
               </w:rPr>
               <w:t>5 000 000</w:t>
             </w:r>
@@ -1868,14 +2283,20 @@
         </w:tc>
         <w:tc>
           <w:tcPr>
-            <w:tcW w:type="dxa" w:w="1200"/>
+            <w:tcW w:type="dxa" w:w="1400"/>
             <w:vAlign w:val="center"/>
             <w:tcMar>
-              <w:top w:w="40" w:type="dxa"/>
-              <w:bottom w:w="40" w:type="dxa"/>
+              <w:top w:w="30" w:type="dxa"/>
+              <w:bottom w:w="30" w:type="dxa"/>
               <w:left w:w="40" w:type="dxa"/>
               <w:right w:w="40" w:type="dxa"/>
             </w:tcMar>
+            <w:tcBorders>
+              <w:top w:val="single" w:sz="4" w:space="0" w:color="000000"/>
+              <w:left w:val="single" w:sz="4" w:space="0" w:color="000000"/>
+              <w:bottom w:val="single" w:sz="4" w:space="0" w:color="000000"/>
+              <w:right w:val="single" w:sz="4" w:space="0" w:color="000000"/>
+            </w:tcBorders>
           </w:tcPr>
           <w:p>
             <w:pPr>
@@ -1886,7 +2307,8 @@
               <w:rPr>
                 <w:rFonts w:ascii="Times New Roman" w:hAnsi="Times New Roman" w:eastAsia="Times New Roman" w:cs="Times New Roman"/>
                 <w:b w:val="0"/>
-                <w:sz w:val="15"/>
+                <w:i w:val="0"/>
+                <w:sz w:val="22"/>
               </w:rPr>
               <w:t>VOI</w:t>
             </w:r>
@@ -1899,8 +2321,9 @@
             <w:r>
               <w:rPr>
                 <w:rFonts w:ascii="Times New Roman" w:hAnsi="Times New Roman" w:eastAsia="Times New Roman" w:cs="Times New Roman"/>
-                <w:b w:val="0"/>
-                <w:sz w:val="15"/>
+                <w:b/>
+                <w:i/>
+                <w:sz w:val="22"/>
               </w:rPr>
               <w:t>ST : 5 000 000</w:t>
             </w:r>
@@ -1908,14 +2331,20 @@
         </w:tc>
         <w:tc>
           <w:tcPr>
-            <w:tcW w:type="dxa" w:w="1100"/>
+            <w:tcW w:type="dxa" w:w="1000"/>
             <w:vAlign w:val="center"/>
             <w:tcMar>
-              <w:top w:w="40" w:type="dxa"/>
-              <w:bottom w:w="40" w:type="dxa"/>
+              <w:top w:w="30" w:type="dxa"/>
+              <w:bottom w:w="30" w:type="dxa"/>
               <w:left w:w="40" w:type="dxa"/>
               <w:right w:w="40" w:type="dxa"/>
             </w:tcMar>
+            <w:tcBorders>
+              <w:top w:val="single" w:sz="4" w:space="0" w:color="000000"/>
+              <w:left w:val="single" w:sz="4" w:space="0" w:color="000000"/>
+              <w:bottom w:val="single" w:sz="4" w:space="0" w:color="000000"/>
+              <w:right w:val="single" w:sz="4" w:space="0" w:color="000000"/>
+            </w:tcBorders>
           </w:tcPr>
           <w:p>
             <w:pPr>
@@ -1926,7 +2355,8 @@
               <w:rPr>
                 <w:rFonts w:ascii="Times New Roman" w:hAnsi="Times New Roman" w:eastAsia="Times New Roman" w:cs="Times New Roman"/>
                 <w:b w:val="0"/>
-                <w:sz w:val="15"/>
+                <w:i w:val="0"/>
+                <w:sz w:val="22"/>
               </w:rPr>
             </w:r>
           </w:p>
@@ -1935,15 +2365,20 @@
       <w:tr>
         <w:tc>
           <w:tcPr>
-            <w:tcW w:type="dxa" w:w="500"/>
+            <w:tcW w:type="dxa" w:w="550"/>
             <w:vAlign w:val="center"/>
             <w:tcMar>
-              <w:top w:w="40" w:type="dxa"/>
-              <w:bottom w:w="40" w:type="dxa"/>
+              <w:top w:w="30" w:type="dxa"/>
+              <w:bottom w:w="30" w:type="dxa"/>
               <w:left w:w="40" w:type="dxa"/>
               <w:right w:w="40" w:type="dxa"/>
             </w:tcMar>
-            <w:shd w:fill="F7F7F7" w:val="clear"/>
+            <w:tcBorders>
+              <w:top w:val="single" w:sz="4" w:space="0" w:color="000000"/>
+              <w:left w:val="single" w:sz="4" w:space="0" w:color="000000"/>
+              <w:bottom w:val="single" w:sz="4" w:space="0" w:color="000000"/>
+              <w:right w:val="single" w:sz="4" w:space="0" w:color="000000"/>
+            </w:tcBorders>
           </w:tcPr>
           <w:p>
             <w:pPr>
@@ -1954,7 +2389,8 @@
               <w:rPr>
                 <w:rFonts w:ascii="Times New Roman" w:hAnsi="Times New Roman" w:eastAsia="Times New Roman" w:cs="Times New Roman"/>
                 <w:b w:val="0"/>
-                <w:sz w:val="15"/>
+                <w:i w:val="0"/>
+                <w:sz w:val="22"/>
               </w:rPr>
               <w:t>7</w:t>
             </w:r>
@@ -1962,15 +2398,20 @@
         </w:tc>
         <w:tc>
           <w:tcPr>
-            <w:tcW w:type="dxa" w:w="1800"/>
+            <w:tcW w:type="dxa" w:w="1900"/>
             <w:vAlign w:val="center"/>
             <w:tcMar>
-              <w:top w:w="40" w:type="dxa"/>
-              <w:bottom w:w="40" w:type="dxa"/>
+              <w:top w:w="30" w:type="dxa"/>
+              <w:bottom w:w="30" w:type="dxa"/>
               <w:left w:w="40" w:type="dxa"/>
               <w:right w:w="40" w:type="dxa"/>
             </w:tcMar>
-            <w:shd w:fill="F7F7F7" w:val="clear"/>
+            <w:tcBorders>
+              <w:top w:val="single" w:sz="4" w:space="0" w:color="000000"/>
+              <w:left w:val="single" w:sz="4" w:space="0" w:color="000000"/>
+              <w:bottom w:val="single" w:sz="4" w:space="0" w:color="000000"/>
+              <w:right w:val="single" w:sz="4" w:space="0" w:color="000000"/>
+            </w:tcBorders>
             <w:vMerge w:val="restart"/>
           </w:tcPr>
           <w:p>
@@ -1982,7 +2423,8 @@
               <w:rPr>
                 <w:rFonts w:ascii="Times New Roman" w:hAnsi="Times New Roman" w:eastAsia="Times New Roman" w:cs="Times New Roman"/>
                 <w:b/>
-                <w:sz w:val="15"/>
+                <w:i w:val="0"/>
+                <w:sz w:val="22"/>
               </w:rPr>
               <w:t>Famonjena JP / Sports scolaires / Hetsika vokatra</w:t>
             </w:r>
@@ -1990,15 +2432,20 @@
         </w:tc>
         <w:tc>
           <w:tcPr>
-            <w:tcW w:type="dxa" w:w="2400"/>
+            <w:tcW w:type="dxa" w:w="2500"/>
             <w:vAlign w:val="center"/>
             <w:tcMar>
-              <w:top w:w="40" w:type="dxa"/>
-              <w:bottom w:w="40" w:type="dxa"/>
+              <w:top w:w="30" w:type="dxa"/>
+              <w:bottom w:w="30" w:type="dxa"/>
               <w:left w:w="40" w:type="dxa"/>
               <w:right w:w="40" w:type="dxa"/>
             </w:tcMar>
-            <w:shd w:fill="F7F7F7" w:val="clear"/>
+            <w:tcBorders>
+              <w:top w:val="single" w:sz="4" w:space="0" w:color="000000"/>
+              <w:left w:val="single" w:sz="4" w:space="0" w:color="000000"/>
+              <w:bottom w:val="single" w:sz="4" w:space="0" w:color="000000"/>
+              <w:right w:val="single" w:sz="4" w:space="0" w:color="000000"/>
+            </w:tcBorders>
           </w:tcPr>
           <w:p>
             <w:pPr>
@@ -2009,7 +2456,8 @@
               <w:rPr>
                 <w:rFonts w:ascii="Times New Roman" w:hAnsi="Times New Roman" w:eastAsia="Times New Roman" w:cs="Times New Roman"/>
                 <w:b w:val="0"/>
-                <w:sz w:val="15"/>
+                <w:i w:val="0"/>
+                <w:sz w:val="22"/>
               </w:rPr>
               <w:t>Journées Pédagogique</w:t>
             </w:r>
@@ -2017,15 +2465,20 @@
         </w:tc>
         <w:tc>
           <w:tcPr>
-            <w:tcW w:type="dxa" w:w="1000"/>
+            <w:tcW w:type="dxa" w:w="1100"/>
             <w:vAlign w:val="center"/>
             <w:tcMar>
-              <w:top w:w="40" w:type="dxa"/>
-              <w:bottom w:w="40" w:type="dxa"/>
+              <w:top w:w="30" w:type="dxa"/>
+              <w:bottom w:w="30" w:type="dxa"/>
               <w:left w:w="40" w:type="dxa"/>
               <w:right w:w="40" w:type="dxa"/>
             </w:tcMar>
-            <w:shd w:fill="F7F7F7" w:val="clear"/>
+            <w:tcBorders>
+              <w:top w:val="single" w:sz="4" w:space="0" w:color="000000"/>
+              <w:left w:val="single" w:sz="4" w:space="0" w:color="000000"/>
+              <w:bottom w:val="single" w:sz="4" w:space="0" w:color="000000"/>
+              <w:right w:val="single" w:sz="4" w:space="0" w:color="000000"/>
+            </w:tcBorders>
           </w:tcPr>
           <w:p>
             <w:pPr>
@@ -2036,7 +2489,8 @@
               <w:rPr>
                 <w:rFonts w:ascii="Times New Roman" w:hAnsi="Times New Roman" w:eastAsia="Times New Roman" w:cs="Times New Roman"/>
                 <w:b w:val="0"/>
-                <w:sz w:val="15"/>
+                <w:i w:val="0"/>
+                <w:sz w:val="22"/>
               </w:rPr>
               <w:t>5</w:t>
             </w:r>
@@ -2044,15 +2498,20 @@
         </w:tc>
         <w:tc>
           <w:tcPr>
-            <w:tcW w:type="dxa" w:w="700"/>
+            <w:tcW w:type="dxa" w:w="750"/>
             <w:vAlign w:val="center"/>
             <w:tcMar>
-              <w:top w:w="40" w:type="dxa"/>
-              <w:bottom w:w="40" w:type="dxa"/>
+              <w:top w:w="30" w:type="dxa"/>
+              <w:bottom w:w="30" w:type="dxa"/>
               <w:left w:w="40" w:type="dxa"/>
               <w:right w:w="40" w:type="dxa"/>
             </w:tcMar>
-            <w:shd w:fill="F7F7F7" w:val="clear"/>
+            <w:tcBorders>
+              <w:top w:val="single" w:sz="4" w:space="0" w:color="000000"/>
+              <w:left w:val="single" w:sz="4" w:space="0" w:color="000000"/>
+              <w:bottom w:val="single" w:sz="4" w:space="0" w:color="000000"/>
+              <w:right w:val="single" w:sz="4" w:space="0" w:color="000000"/>
+            </w:tcBorders>
           </w:tcPr>
           <w:p>
             <w:pPr>
@@ -2063,7 +2522,8 @@
               <w:rPr>
                 <w:rFonts w:ascii="Times New Roman" w:hAnsi="Times New Roman" w:eastAsia="Times New Roman" w:cs="Times New Roman"/>
                 <w:b w:val="0"/>
-                <w:sz w:val="15"/>
+                <w:i w:val="0"/>
+                <w:sz w:val="22"/>
               </w:rPr>
               <w:t>72000</w:t>
             </w:r>
@@ -2071,15 +2531,20 @@
         </w:tc>
         <w:tc>
           <w:tcPr>
-            <w:tcW w:type="dxa" w:w="1100"/>
+            <w:tcW w:type="dxa" w:w="1200"/>
             <w:vAlign w:val="center"/>
             <w:tcMar>
-              <w:top w:w="40" w:type="dxa"/>
-              <w:bottom w:w="40" w:type="dxa"/>
+              <w:top w:w="30" w:type="dxa"/>
+              <w:bottom w:w="30" w:type="dxa"/>
               <w:left w:w="40" w:type="dxa"/>
               <w:right w:w="40" w:type="dxa"/>
             </w:tcMar>
-            <w:shd w:fill="F7F7F7" w:val="clear"/>
+            <w:tcBorders>
+              <w:top w:val="single" w:sz="4" w:space="0" w:color="000000"/>
+              <w:left w:val="single" w:sz="4" w:space="0" w:color="000000"/>
+              <w:bottom w:val="single" w:sz="4" w:space="0" w:color="000000"/>
+              <w:right w:val="single" w:sz="4" w:space="0" w:color="000000"/>
+            </w:tcBorders>
           </w:tcPr>
           <w:p>
             <w:pPr>
@@ -2090,7 +2555,8 @@
               <w:rPr>
                 <w:rFonts w:ascii="Times New Roman" w:hAnsi="Times New Roman" w:eastAsia="Times New Roman" w:cs="Times New Roman"/>
                 <w:b w:val="0"/>
-                <w:sz w:val="15"/>
+                <w:i w:val="0"/>
+                <w:sz w:val="22"/>
               </w:rPr>
               <w:t>360 000</w:t>
             </w:r>
@@ -2098,15 +2564,20 @@
         </w:tc>
         <w:tc>
           <w:tcPr>
-            <w:tcW w:type="dxa" w:w="1200"/>
+            <w:tcW w:type="dxa" w:w="1400"/>
             <w:vAlign w:val="center"/>
             <w:tcMar>
-              <w:top w:w="40" w:type="dxa"/>
-              <w:bottom w:w="40" w:type="dxa"/>
+              <w:top w:w="30" w:type="dxa"/>
+              <w:bottom w:w="30" w:type="dxa"/>
               <w:left w:w="40" w:type="dxa"/>
               <w:right w:w="40" w:type="dxa"/>
             </w:tcMar>
-            <w:shd w:fill="F7F7F7" w:val="clear"/>
+            <w:tcBorders>
+              <w:top w:val="single" w:sz="4" w:space="0" w:color="000000"/>
+              <w:left w:val="single" w:sz="4" w:space="0" w:color="000000"/>
+              <w:bottom w:val="single" w:sz="4" w:space="0" w:color="000000"/>
+              <w:right w:val="single" w:sz="4" w:space="0" w:color="000000"/>
+            </w:tcBorders>
             <w:vMerge w:val="restart"/>
           </w:tcPr>
           <w:p>
@@ -2118,7 +2589,8 @@
               <w:rPr>
                 <w:rFonts w:ascii="Times New Roman" w:hAnsi="Times New Roman" w:eastAsia="Times New Roman" w:cs="Times New Roman"/>
                 <w:b w:val="0"/>
-                <w:sz w:val="15"/>
+                <w:i w:val="0"/>
+                <w:sz w:val="22"/>
               </w:rPr>
               <w:t>VOI</w:t>
             </w:r>
@@ -2126,15 +2598,20 @@
         </w:tc>
         <w:tc>
           <w:tcPr>
-            <w:tcW w:type="dxa" w:w="1100"/>
+            <w:tcW w:type="dxa" w:w="1000"/>
             <w:vAlign w:val="center"/>
             <w:tcMar>
-              <w:top w:w="40" w:type="dxa"/>
-              <w:bottom w:w="40" w:type="dxa"/>
+              <w:top w:w="30" w:type="dxa"/>
+              <w:bottom w:w="30" w:type="dxa"/>
               <w:left w:w="40" w:type="dxa"/>
               <w:right w:w="40" w:type="dxa"/>
             </w:tcMar>
-            <w:shd w:fill="F7F7F7" w:val="clear"/>
+            <w:tcBorders>
+              <w:top w:val="single" w:sz="4" w:space="0" w:color="000000"/>
+              <w:left w:val="single" w:sz="4" w:space="0" w:color="000000"/>
+              <w:bottom w:val="single" w:sz="4" w:space="0" w:color="000000"/>
+              <w:right w:val="single" w:sz="4" w:space="0" w:color="000000"/>
+            </w:tcBorders>
           </w:tcPr>
           <w:p>
             <w:pPr>
@@ -2145,7 +2622,8 @@
               <w:rPr>
                 <w:rFonts w:ascii="Times New Roman" w:hAnsi="Times New Roman" w:eastAsia="Times New Roman" w:cs="Times New Roman"/>
                 <w:b w:val="0"/>
-                <w:sz w:val="15"/>
+                <w:i w:val="0"/>
+                <w:sz w:val="22"/>
               </w:rPr>
             </w:r>
           </w:p>
@@ -2154,15 +2632,20 @@
       <w:tr>
         <w:tc>
           <w:tcPr>
-            <w:tcW w:type="dxa" w:w="500"/>
+            <w:tcW w:type="dxa" w:w="550"/>
             <w:vAlign w:val="center"/>
             <w:tcMar>
-              <w:top w:w="40" w:type="dxa"/>
-              <w:bottom w:w="40" w:type="dxa"/>
+              <w:top w:w="30" w:type="dxa"/>
+              <w:bottom w:w="30" w:type="dxa"/>
               <w:left w:w="40" w:type="dxa"/>
               <w:right w:w="40" w:type="dxa"/>
             </w:tcMar>
-            <w:shd w:fill="F7F7F7" w:val="clear"/>
+            <w:tcBorders>
+              <w:top w:val="single" w:sz="4" w:space="0" w:color="000000"/>
+              <w:left w:val="single" w:sz="4" w:space="0" w:color="000000"/>
+              <w:bottom w:val="single" w:sz="4" w:space="0" w:color="000000"/>
+              <w:right w:val="single" w:sz="4" w:space="0" w:color="000000"/>
+            </w:tcBorders>
           </w:tcPr>
           <w:p>
             <w:pPr>
@@ -2173,7 +2656,8 @@
               <w:rPr>
                 <w:rFonts w:ascii="Times New Roman" w:hAnsi="Times New Roman" w:eastAsia="Times New Roman" w:cs="Times New Roman"/>
                 <w:b w:val="0"/>
-                <w:sz w:val="15"/>
+                <w:i w:val="0"/>
+                <w:sz w:val="22"/>
               </w:rPr>
               <w:t>8</w:t>
             </w:r>
@@ -2181,15 +2665,20 @@
         </w:tc>
         <w:tc>
           <w:tcPr>
-            <w:tcW w:type="dxa" w:w="1800"/>
+            <w:tcW w:type="dxa" w:w="1900"/>
             <w:vAlign w:val="center"/>
             <w:tcMar>
-              <w:top w:w="40" w:type="dxa"/>
-              <w:bottom w:w="40" w:type="dxa"/>
+              <w:top w:w="30" w:type="dxa"/>
+              <w:bottom w:w="30" w:type="dxa"/>
               <w:left w:w="40" w:type="dxa"/>
               <w:right w:w="40" w:type="dxa"/>
             </w:tcMar>
-            <w:shd w:fill="F7F7F7" w:val="clear"/>
+            <w:tcBorders>
+              <w:top w:val="single" w:sz="4" w:space="0" w:color="000000"/>
+              <w:left w:val="single" w:sz="4" w:space="0" w:color="000000"/>
+              <w:bottom w:val="single" w:sz="4" w:space="0" w:color="000000"/>
+              <w:right w:val="single" w:sz="4" w:space="0" w:color="000000"/>
+            </w:tcBorders>
             <w:vMerge/>
           </w:tcPr>
           <w:p>
@@ -2201,22 +2690,28 @@
               <w:rPr>
                 <w:rFonts w:ascii="Times New Roman" w:hAnsi="Times New Roman" w:eastAsia="Times New Roman" w:cs="Times New Roman"/>
                 <w:b w:val="0"/>
-                <w:sz w:val="15"/>
+                <w:i w:val="0"/>
+                <w:sz w:val="22"/>
               </w:rPr>
             </w:r>
           </w:p>
         </w:tc>
         <w:tc>
           <w:tcPr>
-            <w:tcW w:type="dxa" w:w="2400"/>
+            <w:tcW w:type="dxa" w:w="2500"/>
             <w:vAlign w:val="center"/>
             <w:tcMar>
-              <w:top w:w="40" w:type="dxa"/>
-              <w:bottom w:w="40" w:type="dxa"/>
+              <w:top w:w="30" w:type="dxa"/>
+              <w:bottom w:w="30" w:type="dxa"/>
               <w:left w:w="40" w:type="dxa"/>
               <w:right w:w="40" w:type="dxa"/>
             </w:tcMar>
-            <w:shd w:fill="F7F7F7" w:val="clear"/>
+            <w:tcBorders>
+              <w:top w:val="single" w:sz="4" w:space="0" w:color="000000"/>
+              <w:left w:val="single" w:sz="4" w:space="0" w:color="000000"/>
+              <w:bottom w:val="single" w:sz="4" w:space="0" w:color="000000"/>
+              <w:right w:val="single" w:sz="4" w:space="0" w:color="000000"/>
+            </w:tcBorders>
           </w:tcPr>
           <w:p>
             <w:pPr>
@@ -2227,7 +2722,8 @@
               <w:rPr>
                 <w:rFonts w:ascii="Times New Roman" w:hAnsi="Times New Roman" w:eastAsia="Times New Roman" w:cs="Times New Roman"/>
                 <w:b w:val="0"/>
-                <w:sz w:val="15"/>
+                <w:i w:val="0"/>
+                <w:sz w:val="22"/>
               </w:rPr>
               <w:t>Sports scolaires</w:t>
             </w:r>
@@ -2235,15 +2731,20 @@
         </w:tc>
         <w:tc>
           <w:tcPr>
-            <w:tcW w:type="dxa" w:w="1000"/>
+            <w:tcW w:type="dxa" w:w="1100"/>
             <w:vAlign w:val="center"/>
             <w:tcMar>
-              <w:top w:w="40" w:type="dxa"/>
-              <w:bottom w:w="40" w:type="dxa"/>
+              <w:top w:w="30" w:type="dxa"/>
+              <w:bottom w:w="30" w:type="dxa"/>
               <w:left w:w="40" w:type="dxa"/>
               <w:right w:w="40" w:type="dxa"/>
             </w:tcMar>
-            <w:shd w:fill="F7F7F7" w:val="clear"/>
+            <w:tcBorders>
+              <w:top w:val="single" w:sz="4" w:space="0" w:color="000000"/>
+              <w:left w:val="single" w:sz="4" w:space="0" w:color="000000"/>
+              <w:bottom w:val="single" w:sz="4" w:space="0" w:color="000000"/>
+              <w:right w:val="single" w:sz="4" w:space="0" w:color="000000"/>
+            </w:tcBorders>
           </w:tcPr>
           <w:p>
             <w:pPr>
@@ -2254,7 +2755,8 @@
               <w:rPr>
                 <w:rFonts w:ascii="Times New Roman" w:hAnsi="Times New Roman" w:eastAsia="Times New Roman" w:cs="Times New Roman"/>
                 <w:b w:val="0"/>
-                <w:sz w:val="15"/>
+                <w:i w:val="0"/>
+                <w:sz w:val="22"/>
               </w:rPr>
               <w:t>5</w:t>
             </w:r>
@@ -2262,15 +2764,20 @@
         </w:tc>
         <w:tc>
           <w:tcPr>
-            <w:tcW w:type="dxa" w:w="700"/>
+            <w:tcW w:type="dxa" w:w="750"/>
             <w:vAlign w:val="center"/>
             <w:tcMar>
-              <w:top w:w="40" w:type="dxa"/>
-              <w:bottom w:w="40" w:type="dxa"/>
+              <w:top w:w="30" w:type="dxa"/>
+              <w:bottom w:w="30" w:type="dxa"/>
               <w:left w:w="40" w:type="dxa"/>
               <w:right w:w="40" w:type="dxa"/>
             </w:tcMar>
-            <w:shd w:fill="F7F7F7" w:val="clear"/>
+            <w:tcBorders>
+              <w:top w:val="single" w:sz="4" w:space="0" w:color="000000"/>
+              <w:left w:val="single" w:sz="4" w:space="0" w:color="000000"/>
+              <w:bottom w:val="single" w:sz="4" w:space="0" w:color="000000"/>
+              <w:right w:val="single" w:sz="4" w:space="0" w:color="000000"/>
+            </w:tcBorders>
           </w:tcPr>
           <w:p>
             <w:pPr>
@@ -2281,7 +2788,8 @@
               <w:rPr>
                 <w:rFonts w:ascii="Times New Roman" w:hAnsi="Times New Roman" w:eastAsia="Times New Roman" w:cs="Times New Roman"/>
                 <w:b w:val="0"/>
-                <w:sz w:val="15"/>
+                <w:i w:val="0"/>
+                <w:sz w:val="22"/>
               </w:rPr>
               <w:t>50000</w:t>
             </w:r>
@@ -2289,15 +2797,20 @@
         </w:tc>
         <w:tc>
           <w:tcPr>
-            <w:tcW w:type="dxa" w:w="1100"/>
+            <w:tcW w:type="dxa" w:w="1200"/>
             <w:vAlign w:val="center"/>
             <w:tcMar>
-              <w:top w:w="40" w:type="dxa"/>
-              <w:bottom w:w="40" w:type="dxa"/>
+              <w:top w:w="30" w:type="dxa"/>
+              <w:bottom w:w="30" w:type="dxa"/>
               <w:left w:w="40" w:type="dxa"/>
               <w:right w:w="40" w:type="dxa"/>
             </w:tcMar>
-            <w:shd w:fill="F7F7F7" w:val="clear"/>
+            <w:tcBorders>
+              <w:top w:val="single" w:sz="4" w:space="0" w:color="000000"/>
+              <w:left w:val="single" w:sz="4" w:space="0" w:color="000000"/>
+              <w:bottom w:val="single" w:sz="4" w:space="0" w:color="000000"/>
+              <w:right w:val="single" w:sz="4" w:space="0" w:color="000000"/>
+            </w:tcBorders>
           </w:tcPr>
           <w:p>
             <w:pPr>
@@ -2308,7 +2821,8 @@
               <w:rPr>
                 <w:rFonts w:ascii="Times New Roman" w:hAnsi="Times New Roman" w:eastAsia="Times New Roman" w:cs="Times New Roman"/>
                 <w:b w:val="0"/>
-                <w:sz w:val="15"/>
+                <w:i w:val="0"/>
+                <w:sz w:val="22"/>
               </w:rPr>
               <w:t>250 000</w:t>
             </w:r>
@@ -2316,15 +2830,20 @@
         </w:tc>
         <w:tc>
           <w:tcPr>
-            <w:tcW w:type="dxa" w:w="1200"/>
+            <w:tcW w:type="dxa" w:w="1400"/>
             <w:vAlign w:val="center"/>
             <w:tcMar>
-              <w:top w:w="40" w:type="dxa"/>
-              <w:bottom w:w="40" w:type="dxa"/>
+              <w:top w:w="30" w:type="dxa"/>
+              <w:bottom w:w="30" w:type="dxa"/>
               <w:left w:w="40" w:type="dxa"/>
               <w:right w:w="40" w:type="dxa"/>
             </w:tcMar>
-            <w:shd w:fill="F7F7F7" w:val="clear"/>
+            <w:tcBorders>
+              <w:top w:val="single" w:sz="4" w:space="0" w:color="000000"/>
+              <w:left w:val="single" w:sz="4" w:space="0" w:color="000000"/>
+              <w:bottom w:val="single" w:sz="4" w:space="0" w:color="000000"/>
+              <w:right w:val="single" w:sz="4" w:space="0" w:color="000000"/>
+            </w:tcBorders>
             <w:vMerge/>
           </w:tcPr>
           <w:p>
@@ -2336,22 +2855,28 @@
               <w:rPr>
                 <w:rFonts w:ascii="Times New Roman" w:hAnsi="Times New Roman" w:eastAsia="Times New Roman" w:cs="Times New Roman"/>
                 <w:b w:val="0"/>
-                <w:sz w:val="15"/>
+                <w:i w:val="0"/>
+                <w:sz w:val="22"/>
               </w:rPr>
             </w:r>
           </w:p>
         </w:tc>
         <w:tc>
           <w:tcPr>
-            <w:tcW w:type="dxa" w:w="1100"/>
+            <w:tcW w:type="dxa" w:w="1000"/>
             <w:vAlign w:val="center"/>
             <w:tcMar>
-              <w:top w:w="40" w:type="dxa"/>
-              <w:bottom w:w="40" w:type="dxa"/>
+              <w:top w:w="30" w:type="dxa"/>
+              <w:bottom w:w="30" w:type="dxa"/>
               <w:left w:w="40" w:type="dxa"/>
               <w:right w:w="40" w:type="dxa"/>
             </w:tcMar>
-            <w:shd w:fill="F7F7F7" w:val="clear"/>
+            <w:tcBorders>
+              <w:top w:val="single" w:sz="4" w:space="0" w:color="000000"/>
+              <w:left w:val="single" w:sz="4" w:space="0" w:color="000000"/>
+              <w:bottom w:val="single" w:sz="4" w:space="0" w:color="000000"/>
+              <w:right w:val="single" w:sz="4" w:space="0" w:color="000000"/>
+            </w:tcBorders>
           </w:tcPr>
           <w:p>
             <w:pPr>
@@ -2362,7 +2887,8 @@
               <w:rPr>
                 <w:rFonts w:ascii="Times New Roman" w:hAnsi="Times New Roman" w:eastAsia="Times New Roman" w:cs="Times New Roman"/>
                 <w:b w:val="0"/>
-                <w:sz w:val="15"/>
+                <w:i w:val="0"/>
+                <w:sz w:val="22"/>
               </w:rPr>
             </w:r>
           </w:p>
@@ -2371,15 +2897,20 @@
       <w:tr>
         <w:tc>
           <w:tcPr>
-            <w:tcW w:type="dxa" w:w="500"/>
+            <w:tcW w:type="dxa" w:w="550"/>
             <w:vAlign w:val="center"/>
             <w:tcMar>
-              <w:top w:w="40" w:type="dxa"/>
-              <w:bottom w:w="40" w:type="dxa"/>
+              <w:top w:w="30" w:type="dxa"/>
+              <w:bottom w:w="30" w:type="dxa"/>
               <w:left w:w="40" w:type="dxa"/>
               <w:right w:w="40" w:type="dxa"/>
             </w:tcMar>
-            <w:shd w:fill="F7F7F7" w:val="clear"/>
+            <w:tcBorders>
+              <w:top w:val="single" w:sz="4" w:space="0" w:color="000000"/>
+              <w:left w:val="single" w:sz="4" w:space="0" w:color="000000"/>
+              <w:bottom w:val="single" w:sz="4" w:space="0" w:color="000000"/>
+              <w:right w:val="single" w:sz="4" w:space="0" w:color="000000"/>
+            </w:tcBorders>
           </w:tcPr>
           <w:p>
             <w:pPr>
@@ -2390,7 +2921,8 @@
               <w:rPr>
                 <w:rFonts w:ascii="Times New Roman" w:hAnsi="Times New Roman" w:eastAsia="Times New Roman" w:cs="Times New Roman"/>
                 <w:b w:val="0"/>
-                <w:sz w:val="15"/>
+                <w:i w:val="0"/>
+                <w:sz w:val="22"/>
               </w:rPr>
               <w:t>9</w:t>
             </w:r>
@@ -2398,15 +2930,20 @@
         </w:tc>
         <w:tc>
           <w:tcPr>
-            <w:tcW w:type="dxa" w:w="1800"/>
+            <w:tcW w:type="dxa" w:w="1900"/>
             <w:vAlign w:val="center"/>
             <w:tcMar>
-              <w:top w:w="40" w:type="dxa"/>
-              <w:bottom w:w="40" w:type="dxa"/>
+              <w:top w:w="30" w:type="dxa"/>
+              <w:bottom w:w="30" w:type="dxa"/>
               <w:left w:w="40" w:type="dxa"/>
               <w:right w:w="40" w:type="dxa"/>
             </w:tcMar>
-            <w:shd w:fill="F7F7F7" w:val="clear"/>
+            <w:tcBorders>
+              <w:top w:val="single" w:sz="4" w:space="0" w:color="000000"/>
+              <w:left w:val="single" w:sz="4" w:space="0" w:color="000000"/>
+              <w:bottom w:val="single" w:sz="4" w:space="0" w:color="000000"/>
+              <w:right w:val="single" w:sz="4" w:space="0" w:color="000000"/>
+            </w:tcBorders>
             <w:vMerge/>
           </w:tcPr>
           <w:p>
@@ -2418,22 +2955,28 @@
               <w:rPr>
                 <w:rFonts w:ascii="Times New Roman" w:hAnsi="Times New Roman" w:eastAsia="Times New Roman" w:cs="Times New Roman"/>
                 <w:b w:val="0"/>
-                <w:sz w:val="15"/>
+                <w:i w:val="0"/>
+                <w:sz w:val="22"/>
               </w:rPr>
             </w:r>
           </w:p>
         </w:tc>
         <w:tc>
           <w:tcPr>
-            <w:tcW w:type="dxa" w:w="2400"/>
+            <w:tcW w:type="dxa" w:w="2500"/>
             <w:vAlign w:val="center"/>
             <w:tcMar>
-              <w:top w:w="40" w:type="dxa"/>
-              <w:bottom w:w="40" w:type="dxa"/>
+              <w:top w:w="30" w:type="dxa"/>
+              <w:bottom w:w="30" w:type="dxa"/>
               <w:left w:w="40" w:type="dxa"/>
               <w:right w:w="40" w:type="dxa"/>
             </w:tcMar>
-            <w:shd w:fill="F7F7F7" w:val="clear"/>
+            <w:tcBorders>
+              <w:top w:val="single" w:sz="4" w:space="0" w:color="000000"/>
+              <w:left w:val="single" w:sz="4" w:space="0" w:color="000000"/>
+              <w:bottom w:val="single" w:sz="4" w:space="0" w:color="000000"/>
+              <w:right w:val="single" w:sz="4" w:space="0" w:color="000000"/>
+            </w:tcBorders>
           </w:tcPr>
           <w:p>
             <w:pPr>
@@ -2444,7 +2987,8 @@
               <w:rPr>
                 <w:rFonts w:ascii="Times New Roman" w:hAnsi="Times New Roman" w:eastAsia="Times New Roman" w:cs="Times New Roman"/>
                 <w:b w:val="0"/>
-                <w:sz w:val="15"/>
+                <w:i w:val="0"/>
+                <w:sz w:val="22"/>
               </w:rPr>
               <w:t>Hetsika « vokatra »</w:t>
             </w:r>
@@ -2452,15 +2996,20 @@
         </w:tc>
         <w:tc>
           <w:tcPr>
-            <w:tcW w:type="dxa" w:w="1000"/>
+            <w:tcW w:type="dxa" w:w="1100"/>
             <w:vAlign w:val="center"/>
             <w:tcMar>
-              <w:top w:w="40" w:type="dxa"/>
-              <w:bottom w:w="40" w:type="dxa"/>
+              <w:top w:w="30" w:type="dxa"/>
+              <w:bottom w:w="30" w:type="dxa"/>
               <w:left w:w="40" w:type="dxa"/>
               <w:right w:w="40" w:type="dxa"/>
             </w:tcMar>
-            <w:shd w:fill="F7F7F7" w:val="clear"/>
+            <w:tcBorders>
+              <w:top w:val="single" w:sz="4" w:space="0" w:color="000000"/>
+              <w:left w:val="single" w:sz="4" w:space="0" w:color="000000"/>
+              <w:bottom w:val="single" w:sz="4" w:space="0" w:color="000000"/>
+              <w:right w:val="single" w:sz="4" w:space="0" w:color="000000"/>
+            </w:tcBorders>
           </w:tcPr>
           <w:p>
             <w:pPr>
@@ -2471,7 +3020,8 @@
               <w:rPr>
                 <w:rFonts w:ascii="Times New Roman" w:hAnsi="Times New Roman" w:eastAsia="Times New Roman" w:cs="Times New Roman"/>
                 <w:b w:val="0"/>
-                <w:sz w:val="15"/>
+                <w:i w:val="0"/>
+                <w:sz w:val="22"/>
               </w:rPr>
               <w:t>2</w:t>
             </w:r>
@@ -2479,15 +3029,20 @@
         </w:tc>
         <w:tc>
           <w:tcPr>
-            <w:tcW w:type="dxa" w:w="700"/>
+            <w:tcW w:type="dxa" w:w="750"/>
             <w:vAlign w:val="center"/>
             <w:tcMar>
-              <w:top w:w="40" w:type="dxa"/>
-              <w:bottom w:w="40" w:type="dxa"/>
+              <w:top w:w="30" w:type="dxa"/>
+              <w:bottom w:w="30" w:type="dxa"/>
               <w:left w:w="40" w:type="dxa"/>
               <w:right w:w="40" w:type="dxa"/>
             </w:tcMar>
-            <w:shd w:fill="F7F7F7" w:val="clear"/>
+            <w:tcBorders>
+              <w:top w:val="single" w:sz="4" w:space="0" w:color="000000"/>
+              <w:left w:val="single" w:sz="4" w:space="0" w:color="000000"/>
+              <w:bottom w:val="single" w:sz="4" w:space="0" w:color="000000"/>
+              <w:right w:val="single" w:sz="4" w:space="0" w:color="000000"/>
+            </w:tcBorders>
           </w:tcPr>
           <w:p>
             <w:pPr>
@@ -2498,7 +3053,8 @@
               <w:rPr>
                 <w:rFonts w:ascii="Times New Roman" w:hAnsi="Times New Roman" w:eastAsia="Times New Roman" w:cs="Times New Roman"/>
                 <w:b w:val="0"/>
-                <w:sz w:val="15"/>
+                <w:i w:val="0"/>
+                <w:sz w:val="22"/>
               </w:rPr>
               <w:t>35000</w:t>
             </w:r>
@@ -2506,15 +3062,20 @@
         </w:tc>
         <w:tc>
           <w:tcPr>
-            <w:tcW w:type="dxa" w:w="1100"/>
+            <w:tcW w:type="dxa" w:w="1200"/>
             <w:vAlign w:val="center"/>
             <w:tcMar>
-              <w:top w:w="40" w:type="dxa"/>
-              <w:bottom w:w="40" w:type="dxa"/>
+              <w:top w:w="30" w:type="dxa"/>
+              <w:bottom w:w="30" w:type="dxa"/>
               <w:left w:w="40" w:type="dxa"/>
               <w:right w:w="40" w:type="dxa"/>
             </w:tcMar>
-            <w:shd w:fill="F7F7F7" w:val="clear"/>
+            <w:tcBorders>
+              <w:top w:val="single" w:sz="4" w:space="0" w:color="000000"/>
+              <w:left w:val="single" w:sz="4" w:space="0" w:color="000000"/>
+              <w:bottom w:val="single" w:sz="4" w:space="0" w:color="000000"/>
+              <w:right w:val="single" w:sz="4" w:space="0" w:color="000000"/>
+            </w:tcBorders>
           </w:tcPr>
           <w:p>
             <w:pPr>
@@ -2525,7 +3086,8 @@
               <w:rPr>
                 <w:rFonts w:ascii="Times New Roman" w:hAnsi="Times New Roman" w:eastAsia="Times New Roman" w:cs="Times New Roman"/>
                 <w:b w:val="0"/>
-                <w:sz w:val="15"/>
+                <w:i w:val="0"/>
+                <w:sz w:val="22"/>
               </w:rPr>
               <w:t>70 000</w:t>
             </w:r>
@@ -2533,15 +3095,20 @@
         </w:tc>
         <w:tc>
           <w:tcPr>
-            <w:tcW w:type="dxa" w:w="1200"/>
+            <w:tcW w:type="dxa" w:w="1400"/>
             <w:vAlign w:val="center"/>
             <w:tcMar>
-              <w:top w:w="40" w:type="dxa"/>
-              <w:bottom w:w="40" w:type="dxa"/>
+              <w:top w:w="30" w:type="dxa"/>
+              <w:bottom w:w="30" w:type="dxa"/>
               <w:left w:w="40" w:type="dxa"/>
               <w:right w:w="40" w:type="dxa"/>
             </w:tcMar>
-            <w:shd w:fill="F7F7F7" w:val="clear"/>
+            <w:tcBorders>
+              <w:top w:val="single" w:sz="4" w:space="0" w:color="000000"/>
+              <w:left w:val="single" w:sz="4" w:space="0" w:color="000000"/>
+              <w:bottom w:val="single" w:sz="4" w:space="0" w:color="000000"/>
+              <w:right w:val="single" w:sz="4" w:space="0" w:color="000000"/>
+            </w:tcBorders>
             <w:vMerge/>
           </w:tcPr>
           <w:p>
@@ -2552,8 +3119,9 @@
             <w:r>
               <w:rPr>
                 <w:rFonts w:ascii="Times New Roman" w:hAnsi="Times New Roman" w:eastAsia="Times New Roman" w:cs="Times New Roman"/>
-                <w:b w:val="0"/>
-                <w:sz w:val="15"/>
+                <w:b/>
+                <w:i/>
+                <w:sz w:val="22"/>
               </w:rPr>
               <w:t>ST : 680 000</w:t>
             </w:r>
@@ -2561,15 +3129,20 @@
         </w:tc>
         <w:tc>
           <w:tcPr>
-            <w:tcW w:type="dxa" w:w="1100"/>
+            <w:tcW w:type="dxa" w:w="1000"/>
             <w:vAlign w:val="center"/>
             <w:tcMar>
-              <w:top w:w="40" w:type="dxa"/>
-              <w:bottom w:w="40" w:type="dxa"/>
+              <w:top w:w="30" w:type="dxa"/>
+              <w:bottom w:w="30" w:type="dxa"/>
               <w:left w:w="40" w:type="dxa"/>
               <w:right w:w="40" w:type="dxa"/>
             </w:tcMar>
-            <w:shd w:fill="F7F7F7" w:val="clear"/>
+            <w:tcBorders>
+              <w:top w:val="single" w:sz="4" w:space="0" w:color="000000"/>
+              <w:left w:val="single" w:sz="4" w:space="0" w:color="000000"/>
+              <w:bottom w:val="single" w:sz="4" w:space="0" w:color="000000"/>
+              <w:right w:val="single" w:sz="4" w:space="0" w:color="000000"/>
+            </w:tcBorders>
           </w:tcPr>
           <w:p>
             <w:pPr>
@@ -2580,7 +3153,8 @@
               <w:rPr>
                 <w:rFonts w:ascii="Times New Roman" w:hAnsi="Times New Roman" w:eastAsia="Times New Roman" w:cs="Times New Roman"/>
                 <w:b w:val="0"/>
-                <w:sz w:val="15"/>
+                <w:i w:val="0"/>
+                <w:sz w:val="22"/>
               </w:rPr>
             </w:r>
           </w:p>
@@ -2589,14 +3163,20 @@
       <w:tr>
         <w:tc>
           <w:tcPr>
-            <w:tcW w:type="dxa" w:w="500"/>
+            <w:tcW w:type="dxa" w:w="550"/>
             <w:vAlign w:val="center"/>
             <w:tcMar>
-              <w:top w:w="40" w:type="dxa"/>
-              <w:bottom w:w="40" w:type="dxa"/>
+              <w:top w:w="30" w:type="dxa"/>
+              <w:bottom w:w="30" w:type="dxa"/>
               <w:left w:w="40" w:type="dxa"/>
               <w:right w:w="40" w:type="dxa"/>
             </w:tcMar>
+            <w:tcBorders>
+              <w:top w:val="single" w:sz="4" w:space="0" w:color="000000"/>
+              <w:left w:val="single" w:sz="4" w:space="0" w:color="000000"/>
+              <w:bottom w:val="single" w:sz="4" w:space="0" w:color="000000"/>
+              <w:right w:val="single" w:sz="4" w:space="0" w:color="000000"/>
+            </w:tcBorders>
           </w:tcPr>
           <w:p>
             <w:pPr>
@@ -2607,7 +3187,8 @@
               <w:rPr>
                 <w:rFonts w:ascii="Times New Roman" w:hAnsi="Times New Roman" w:eastAsia="Times New Roman" w:cs="Times New Roman"/>
                 <w:b w:val="0"/>
-                <w:sz w:val="15"/>
+                <w:i w:val="0"/>
+                <w:sz w:val="22"/>
               </w:rPr>
               <w:t>10</w:t>
             </w:r>
@@ -2615,14 +3196,20 @@
         </w:tc>
         <w:tc>
           <w:tcPr>
-            <w:tcW w:type="dxa" w:w="1800"/>
+            <w:tcW w:type="dxa" w:w="1900"/>
             <w:vAlign w:val="center"/>
             <w:tcMar>
-              <w:top w:w="40" w:type="dxa"/>
-              <w:bottom w:w="40" w:type="dxa"/>
+              <w:top w:w="30" w:type="dxa"/>
+              <w:bottom w:w="30" w:type="dxa"/>
               <w:left w:w="40" w:type="dxa"/>
               <w:right w:w="40" w:type="dxa"/>
             </w:tcMar>
+            <w:tcBorders>
+              <w:top w:val="single" w:sz="4" w:space="0" w:color="000000"/>
+              <w:left w:val="single" w:sz="4" w:space="0" w:color="000000"/>
+              <w:bottom w:val="single" w:sz="4" w:space="0" w:color="000000"/>
+              <w:right w:val="single" w:sz="4" w:space="0" w:color="000000"/>
+            </w:tcBorders>
           </w:tcPr>
           <w:p>
             <w:pPr>
@@ -2633,7 +3220,8 @@
               <w:rPr>
                 <w:rFonts w:ascii="Times New Roman" w:hAnsi="Times New Roman" w:eastAsia="Times New Roman" w:cs="Times New Roman"/>
                 <w:b/>
-                <w:sz w:val="15"/>
+                <w:i w:val="0"/>
+                <w:sz w:val="22"/>
               </w:rPr>
               <w:t>Fandoavana ny fiantohana « Pascoma »</w:t>
             </w:r>
@@ -2641,14 +3229,20 @@
         </w:tc>
         <w:tc>
           <w:tcPr>
-            <w:tcW w:type="dxa" w:w="2400"/>
+            <w:tcW w:type="dxa" w:w="2500"/>
             <w:vAlign w:val="center"/>
             <w:tcMar>
-              <w:top w:w="40" w:type="dxa"/>
-              <w:bottom w:w="40" w:type="dxa"/>
+              <w:top w:w="30" w:type="dxa"/>
+              <w:bottom w:w="30" w:type="dxa"/>
               <w:left w:w="40" w:type="dxa"/>
               <w:right w:w="40" w:type="dxa"/>
             </w:tcMar>
+            <w:tcBorders>
+              <w:top w:val="single" w:sz="4" w:space="0" w:color="000000"/>
+              <w:left w:val="single" w:sz="4" w:space="0" w:color="000000"/>
+              <w:bottom w:val="single" w:sz="4" w:space="0" w:color="000000"/>
+              <w:right w:val="single" w:sz="4" w:space="0" w:color="000000"/>
+            </w:tcBorders>
           </w:tcPr>
           <w:p>
             <w:pPr>
@@ -2659,7 +3253,8 @@
               <w:rPr>
                 <w:rFonts w:ascii="Times New Roman" w:hAnsi="Times New Roman" w:eastAsia="Times New Roman" w:cs="Times New Roman"/>
                 <w:b w:val="0"/>
-                <w:sz w:val="15"/>
+                <w:i w:val="0"/>
+                <w:sz w:val="22"/>
               </w:rPr>
               <w:t>Pascoma</w:t>
             </w:r>
@@ -2667,14 +3262,20 @@
         </w:tc>
         <w:tc>
           <w:tcPr>
-            <w:tcW w:type="dxa" w:w="1000"/>
+            <w:tcW w:type="dxa" w:w="1100"/>
             <w:vAlign w:val="center"/>
             <w:tcMar>
-              <w:top w:w="40" w:type="dxa"/>
-              <w:bottom w:w="40" w:type="dxa"/>
+              <w:top w:w="30" w:type="dxa"/>
+              <w:bottom w:w="30" w:type="dxa"/>
               <w:left w:w="40" w:type="dxa"/>
               <w:right w:w="40" w:type="dxa"/>
             </w:tcMar>
+            <w:tcBorders>
+              <w:top w:val="single" w:sz="4" w:space="0" w:color="000000"/>
+              <w:left w:val="single" w:sz="4" w:space="0" w:color="000000"/>
+              <w:bottom w:val="single" w:sz="4" w:space="0" w:color="000000"/>
+              <w:right w:val="single" w:sz="4" w:space="0" w:color="000000"/>
+            </w:tcBorders>
           </w:tcPr>
           <w:p>
             <w:pPr>
@@ -2685,22 +3286,29 @@
               <w:rPr>
                 <w:rFonts w:ascii="Times New Roman" w:hAnsi="Times New Roman" w:eastAsia="Times New Roman" w:cs="Times New Roman"/>
                 <w:b w:val="0"/>
-                <w:sz w:val="15"/>
+                <w:i w:val="0"/>
+                <w:sz w:val="22"/>
               </w:rPr>
-              <w:t>140</w:t>
+              <w:t>145</w:t>
             </w:r>
           </w:p>
         </w:tc>
         <w:tc>
           <w:tcPr>
-            <w:tcW w:type="dxa" w:w="700"/>
+            <w:tcW w:type="dxa" w:w="750"/>
             <w:vAlign w:val="center"/>
             <w:tcMar>
-              <w:top w:w="40" w:type="dxa"/>
-              <w:bottom w:w="40" w:type="dxa"/>
+              <w:top w:w="30" w:type="dxa"/>
+              <w:bottom w:w="30" w:type="dxa"/>
               <w:left w:w="40" w:type="dxa"/>
               <w:right w:w="40" w:type="dxa"/>
             </w:tcMar>
+            <w:tcBorders>
+              <w:top w:val="single" w:sz="4" w:space="0" w:color="000000"/>
+              <w:left w:val="single" w:sz="4" w:space="0" w:color="000000"/>
+              <w:bottom w:val="single" w:sz="4" w:space="0" w:color="000000"/>
+              <w:right w:val="single" w:sz="4" w:space="0" w:color="000000"/>
+            </w:tcBorders>
           </w:tcPr>
           <w:p>
             <w:pPr>
@@ -2711,7 +3319,8 @@
               <w:rPr>
                 <w:rFonts w:ascii="Times New Roman" w:hAnsi="Times New Roman" w:eastAsia="Times New Roman" w:cs="Times New Roman"/>
                 <w:b w:val="0"/>
-                <w:sz w:val="15"/>
+                <w:i w:val="0"/>
+                <w:sz w:val="22"/>
               </w:rPr>
               <w:t>200</w:t>
             </w:r>
@@ -2719,14 +3328,20 @@
         </w:tc>
         <w:tc>
           <w:tcPr>
-            <w:tcW w:type="dxa" w:w="1100"/>
+            <w:tcW w:type="dxa" w:w="1200"/>
             <w:vAlign w:val="center"/>
             <w:tcMar>
-              <w:top w:w="40" w:type="dxa"/>
-              <w:bottom w:w="40" w:type="dxa"/>
+              <w:top w:w="30" w:type="dxa"/>
+              <w:bottom w:w="30" w:type="dxa"/>
               <w:left w:w="40" w:type="dxa"/>
               <w:right w:w="40" w:type="dxa"/>
             </w:tcMar>
+            <w:tcBorders>
+              <w:top w:val="single" w:sz="4" w:space="0" w:color="000000"/>
+              <w:left w:val="single" w:sz="4" w:space="0" w:color="000000"/>
+              <w:bottom w:val="single" w:sz="4" w:space="0" w:color="000000"/>
+              <w:right w:val="single" w:sz="4" w:space="0" w:color="000000"/>
+            </w:tcBorders>
           </w:tcPr>
           <w:p>
             <w:pPr>
@@ -2737,22 +3352,29 @@
               <w:rPr>
                 <w:rFonts w:ascii="Times New Roman" w:hAnsi="Times New Roman" w:eastAsia="Times New Roman" w:cs="Times New Roman"/>
                 <w:b w:val="0"/>
-                <w:sz w:val="15"/>
+                <w:i w:val="0"/>
+                <w:sz w:val="22"/>
               </w:rPr>
-              <w:t>28 000</w:t>
+              <w:t>29 000</w:t>
             </w:r>
           </w:p>
         </w:tc>
         <w:tc>
           <w:tcPr>
-            <w:tcW w:type="dxa" w:w="1200"/>
+            <w:tcW w:type="dxa" w:w="1400"/>
             <w:vAlign w:val="center"/>
             <w:tcMar>
-              <w:top w:w="40" w:type="dxa"/>
-              <w:bottom w:w="40" w:type="dxa"/>
+              <w:top w:w="30" w:type="dxa"/>
+              <w:bottom w:w="30" w:type="dxa"/>
               <w:left w:w="40" w:type="dxa"/>
               <w:right w:w="40" w:type="dxa"/>
             </w:tcMar>
+            <w:tcBorders>
+              <w:top w:val="single" w:sz="4" w:space="0" w:color="000000"/>
+              <w:left w:val="single" w:sz="4" w:space="0" w:color="000000"/>
+              <w:bottom w:val="single" w:sz="4" w:space="0" w:color="000000"/>
+              <w:right w:val="single" w:sz="4" w:space="0" w:color="000000"/>
+            </w:tcBorders>
           </w:tcPr>
           <w:p>
             <w:pPr>
@@ -2763,7 +3385,8 @@
               <w:rPr>
                 <w:rFonts w:ascii="Times New Roman" w:hAnsi="Times New Roman" w:eastAsia="Times New Roman" w:cs="Times New Roman"/>
                 <w:b w:val="0"/>
-                <w:sz w:val="15"/>
+                <w:i w:val="0"/>
+                <w:sz w:val="22"/>
               </w:rPr>
               <w:t>VOI</w:t>
             </w:r>
@@ -2776,23 +3399,30 @@
             <w:r>
               <w:rPr>
                 <w:rFonts w:ascii="Times New Roman" w:hAnsi="Times New Roman" w:eastAsia="Times New Roman" w:cs="Times New Roman"/>
-                <w:b w:val="0"/>
-                <w:sz w:val="15"/>
+                <w:b/>
+                <w:i/>
+                <w:sz w:val="22"/>
               </w:rPr>
-              <w:t>ST : 28 000</w:t>
+              <w:t>ST : 29 000</w:t>
             </w:r>
           </w:p>
         </w:tc>
         <w:tc>
           <w:tcPr>
-            <w:tcW w:type="dxa" w:w="1100"/>
+            <w:tcW w:type="dxa" w:w="1000"/>
             <w:vAlign w:val="center"/>
             <w:tcMar>
-              <w:top w:w="40" w:type="dxa"/>
-              <w:bottom w:w="40" w:type="dxa"/>
+              <w:top w:w="30" w:type="dxa"/>
+              <w:bottom w:w="30" w:type="dxa"/>
               <w:left w:w="40" w:type="dxa"/>
               <w:right w:w="40" w:type="dxa"/>
             </w:tcMar>
+            <w:tcBorders>
+              <w:top w:val="single" w:sz="4" w:space="0" w:color="000000"/>
+              <w:left w:val="single" w:sz="4" w:space="0" w:color="000000"/>
+              <w:bottom w:val="single" w:sz="4" w:space="0" w:color="000000"/>
+              <w:right w:val="single" w:sz="4" w:space="0" w:color="000000"/>
+            </w:tcBorders>
           </w:tcPr>
           <w:p>
             <w:pPr>
@@ -2803,7 +3433,8 @@
               <w:rPr>
                 <w:rFonts w:ascii="Times New Roman" w:hAnsi="Times New Roman" w:eastAsia="Times New Roman" w:cs="Times New Roman"/>
                 <w:b w:val="0"/>
-                <w:sz w:val="15"/>
+                <w:i w:val="0"/>
+                <w:sz w:val="22"/>
               </w:rPr>
             </w:r>
           </w:p>
@@ -2812,15 +3443,20 @@
       <w:tr>
         <w:tc>
           <w:tcPr>
-            <w:tcW w:type="dxa" w:w="500"/>
+            <w:tcW w:type="dxa" w:w="550"/>
             <w:vAlign w:val="center"/>
             <w:tcMar>
-              <w:top w:w="40" w:type="dxa"/>
-              <w:bottom w:w="40" w:type="dxa"/>
+              <w:top w:w="30" w:type="dxa"/>
+              <w:bottom w:w="30" w:type="dxa"/>
               <w:left w:w="40" w:type="dxa"/>
               <w:right w:w="40" w:type="dxa"/>
             </w:tcMar>
-            <w:shd w:fill="F7F7F7" w:val="clear"/>
+            <w:tcBorders>
+              <w:top w:val="single" w:sz="4" w:space="0" w:color="000000"/>
+              <w:left w:val="single" w:sz="4" w:space="0" w:color="000000"/>
+              <w:bottom w:val="single" w:sz="4" w:space="0" w:color="000000"/>
+              <w:right w:val="single" w:sz="4" w:space="0" w:color="000000"/>
+            </w:tcBorders>
           </w:tcPr>
           <w:p>
             <w:pPr>
@@ -2831,7 +3467,8 @@
               <w:rPr>
                 <w:rFonts w:ascii="Times New Roman" w:hAnsi="Times New Roman" w:eastAsia="Times New Roman" w:cs="Times New Roman"/>
                 <w:b w:val="0"/>
-                <w:sz w:val="15"/>
+                <w:i w:val="0"/>
+                <w:sz w:val="22"/>
               </w:rPr>
               <w:t>11</w:t>
             </w:r>
@@ -2839,15 +3476,20 @@
         </w:tc>
         <w:tc>
           <w:tcPr>
-            <w:tcW w:type="dxa" w:w="1800"/>
+            <w:tcW w:type="dxa" w:w="1900"/>
             <w:vAlign w:val="center"/>
             <w:tcMar>
-              <w:top w:w="40" w:type="dxa"/>
-              <w:bottom w:w="40" w:type="dxa"/>
+              <w:top w:w="30" w:type="dxa"/>
+              <w:bottom w:w="30" w:type="dxa"/>
               <w:left w:w="40" w:type="dxa"/>
               <w:right w:w="40" w:type="dxa"/>
             </w:tcMar>
-            <w:shd w:fill="F7F7F7" w:val="clear"/>
+            <w:tcBorders>
+              <w:top w:val="single" w:sz="4" w:space="0" w:color="000000"/>
+              <w:left w:val="single" w:sz="4" w:space="0" w:color="000000"/>
+              <w:bottom w:val="single" w:sz="4" w:space="0" w:color="000000"/>
+              <w:right w:val="single" w:sz="4" w:space="0" w:color="000000"/>
+            </w:tcBorders>
             <w:vMerge w:val="restart"/>
           </w:tcPr>
           <w:p>
@@ -2859,7 +3501,8 @@
               <w:rPr>
                 <w:rFonts w:ascii="Times New Roman" w:hAnsi="Times New Roman" w:eastAsia="Times New Roman" w:cs="Times New Roman"/>
                 <w:b/>
-                <w:sz w:val="15"/>
+                <w:i w:val="0"/>
+                <w:sz w:val="22"/>
               </w:rPr>
               <w:t>Fampisakafoanana an-tsekoly</w:t>
             </w:r>
@@ -2867,15 +3510,20 @@
         </w:tc>
         <w:tc>
           <w:tcPr>
-            <w:tcW w:type="dxa" w:w="2400"/>
+            <w:tcW w:type="dxa" w:w="2500"/>
             <w:vAlign w:val="center"/>
             <w:tcMar>
-              <w:top w:w="40" w:type="dxa"/>
-              <w:bottom w:w="40" w:type="dxa"/>
+              <w:top w:w="30" w:type="dxa"/>
+              <w:bottom w:w="30" w:type="dxa"/>
               <w:left w:w="40" w:type="dxa"/>
               <w:right w:w="40" w:type="dxa"/>
             </w:tcMar>
-            <w:shd w:fill="F7F7F7" w:val="clear"/>
+            <w:tcBorders>
+              <w:top w:val="single" w:sz="4" w:space="0" w:color="000000"/>
+              <w:left w:val="single" w:sz="4" w:space="0" w:color="000000"/>
+              <w:bottom w:val="single" w:sz="4" w:space="0" w:color="000000"/>
+              <w:right w:val="single" w:sz="4" w:space="0" w:color="000000"/>
+            </w:tcBorders>
           </w:tcPr>
           <w:p>
             <w:pPr>
@@ -2886,7 +3534,8 @@
               <w:rPr>
                 <w:rFonts w:ascii="Times New Roman" w:hAnsi="Times New Roman" w:eastAsia="Times New Roman" w:cs="Times New Roman"/>
                 <w:b w:val="0"/>
-                <w:sz w:val="15"/>
+                <w:i w:val="0"/>
+                <w:sz w:val="22"/>
               </w:rPr>
               <w:t>Mangahazo (totony)</w:t>
             </w:r>
@@ -2894,15 +3543,20 @@
         </w:tc>
         <w:tc>
           <w:tcPr>
-            <w:tcW w:type="dxa" w:w="1000"/>
+            <w:tcW w:type="dxa" w:w="1100"/>
             <w:vAlign w:val="center"/>
             <w:tcMar>
-              <w:top w:w="40" w:type="dxa"/>
-              <w:bottom w:w="40" w:type="dxa"/>
+              <w:top w:w="30" w:type="dxa"/>
+              <w:bottom w:w="30" w:type="dxa"/>
               <w:left w:w="40" w:type="dxa"/>
               <w:right w:w="40" w:type="dxa"/>
             </w:tcMar>
-            <w:shd w:fill="F7F7F7" w:val="clear"/>
+            <w:tcBorders>
+              <w:top w:val="single" w:sz="4" w:space="0" w:color="000000"/>
+              <w:left w:val="single" w:sz="4" w:space="0" w:color="000000"/>
+              <w:bottom w:val="single" w:sz="4" w:space="0" w:color="000000"/>
+              <w:right w:val="single" w:sz="4" w:space="0" w:color="000000"/>
+            </w:tcBorders>
           </w:tcPr>
           <w:p>
             <w:pPr>
@@ -2913,7 +3567,8 @@
               <w:rPr>
                 <w:rFonts w:ascii="Times New Roman" w:hAnsi="Times New Roman" w:eastAsia="Times New Roman" w:cs="Times New Roman"/>
                 <w:b w:val="0"/>
-                <w:sz w:val="15"/>
+                <w:i w:val="0"/>
+                <w:sz w:val="22"/>
               </w:rPr>
               <w:t>60</w:t>
             </w:r>
@@ -2921,15 +3576,20 @@
         </w:tc>
         <w:tc>
           <w:tcPr>
-            <w:tcW w:type="dxa" w:w="700"/>
+            <w:tcW w:type="dxa" w:w="750"/>
             <w:vAlign w:val="center"/>
             <w:tcMar>
-              <w:top w:w="40" w:type="dxa"/>
-              <w:bottom w:w="40" w:type="dxa"/>
+              <w:top w:w="30" w:type="dxa"/>
+              <w:bottom w:w="30" w:type="dxa"/>
               <w:left w:w="40" w:type="dxa"/>
               <w:right w:w="40" w:type="dxa"/>
             </w:tcMar>
-            <w:shd w:fill="F7F7F7" w:val="clear"/>
+            <w:tcBorders>
+              <w:top w:val="single" w:sz="4" w:space="0" w:color="000000"/>
+              <w:left w:val="single" w:sz="4" w:space="0" w:color="000000"/>
+              <w:bottom w:val="single" w:sz="4" w:space="0" w:color="000000"/>
+              <w:right w:val="single" w:sz="4" w:space="0" w:color="000000"/>
+            </w:tcBorders>
           </w:tcPr>
           <w:p>
             <w:pPr>
@@ -2940,7 +3600,8 @@
               <w:rPr>
                 <w:rFonts w:ascii="Times New Roman" w:hAnsi="Times New Roman" w:eastAsia="Times New Roman" w:cs="Times New Roman"/>
                 <w:b w:val="0"/>
-                <w:sz w:val="15"/>
+                <w:i w:val="0"/>
+                <w:sz w:val="22"/>
               </w:rPr>
               <w:t>1000</w:t>
             </w:r>
@@ -2948,15 +3609,20 @@
         </w:tc>
         <w:tc>
           <w:tcPr>
-            <w:tcW w:type="dxa" w:w="1100"/>
+            <w:tcW w:type="dxa" w:w="1200"/>
             <w:vAlign w:val="center"/>
             <w:tcMar>
-              <w:top w:w="40" w:type="dxa"/>
-              <w:bottom w:w="40" w:type="dxa"/>
+              <w:top w:w="30" w:type="dxa"/>
+              <w:bottom w:w="30" w:type="dxa"/>
               <w:left w:w="40" w:type="dxa"/>
               <w:right w:w="40" w:type="dxa"/>
             </w:tcMar>
-            <w:shd w:fill="F7F7F7" w:val="clear"/>
+            <w:tcBorders>
+              <w:top w:val="single" w:sz="4" w:space="0" w:color="000000"/>
+              <w:left w:val="single" w:sz="4" w:space="0" w:color="000000"/>
+              <w:bottom w:val="single" w:sz="4" w:space="0" w:color="000000"/>
+              <w:right w:val="single" w:sz="4" w:space="0" w:color="000000"/>
+            </w:tcBorders>
           </w:tcPr>
           <w:p>
             <w:pPr>
@@ -2967,7 +3633,8 @@
               <w:rPr>
                 <w:rFonts w:ascii="Times New Roman" w:hAnsi="Times New Roman" w:eastAsia="Times New Roman" w:cs="Times New Roman"/>
                 <w:b w:val="0"/>
-                <w:sz w:val="15"/>
+                <w:i w:val="0"/>
+                <w:sz w:val="22"/>
               </w:rPr>
               <w:t>60 000</w:t>
             </w:r>
@@ -2975,15 +3642,20 @@
         </w:tc>
         <w:tc>
           <w:tcPr>
-            <w:tcW w:type="dxa" w:w="1200"/>
+            <w:tcW w:type="dxa" w:w="1400"/>
             <w:vAlign w:val="center"/>
             <w:tcMar>
-              <w:top w:w="40" w:type="dxa"/>
-              <w:bottom w:w="40" w:type="dxa"/>
+              <w:top w:w="30" w:type="dxa"/>
+              <w:bottom w:w="30" w:type="dxa"/>
               <w:left w:w="40" w:type="dxa"/>
               <w:right w:w="40" w:type="dxa"/>
             </w:tcMar>
-            <w:shd w:fill="F7F7F7" w:val="clear"/>
+            <w:tcBorders>
+              <w:top w:val="single" w:sz="4" w:space="0" w:color="000000"/>
+              <w:left w:val="single" w:sz="4" w:space="0" w:color="000000"/>
+              <w:bottom w:val="single" w:sz="4" w:space="0" w:color="000000"/>
+              <w:right w:val="single" w:sz="4" w:space="0" w:color="000000"/>
+            </w:tcBorders>
             <w:vMerge w:val="restart"/>
           </w:tcPr>
           <w:p>
@@ -2995,7 +3667,8 @@
               <w:rPr>
                 <w:rFonts w:ascii="Times New Roman" w:hAnsi="Times New Roman" w:eastAsia="Times New Roman" w:cs="Times New Roman"/>
                 <w:b w:val="0"/>
-                <w:sz w:val="15"/>
+                <w:i w:val="0"/>
+                <w:sz w:val="22"/>
               </w:rPr>
               <w:t>VOI</w:t>
             </w:r>
@@ -3003,15 +3676,20 @@
         </w:tc>
         <w:tc>
           <w:tcPr>
-            <w:tcW w:type="dxa" w:w="1100"/>
+            <w:tcW w:type="dxa" w:w="1000"/>
             <w:vAlign w:val="center"/>
             <w:tcMar>
-              <w:top w:w="40" w:type="dxa"/>
-              <w:bottom w:w="40" w:type="dxa"/>
+              <w:top w:w="30" w:type="dxa"/>
+              <w:bottom w:w="30" w:type="dxa"/>
               <w:left w:w="40" w:type="dxa"/>
               <w:right w:w="40" w:type="dxa"/>
             </w:tcMar>
-            <w:shd w:fill="F7F7F7" w:val="clear"/>
+            <w:tcBorders>
+              <w:top w:val="single" w:sz="4" w:space="0" w:color="000000"/>
+              <w:left w:val="single" w:sz="4" w:space="0" w:color="000000"/>
+              <w:bottom w:val="single" w:sz="4" w:space="0" w:color="000000"/>
+              <w:right w:val="single" w:sz="4" w:space="0" w:color="000000"/>
+            </w:tcBorders>
           </w:tcPr>
           <w:p>
             <w:pPr>
@@ -3022,7 +3700,8 @@
               <w:rPr>
                 <w:rFonts w:ascii="Times New Roman" w:hAnsi="Times New Roman" w:eastAsia="Times New Roman" w:cs="Times New Roman"/>
                 <w:b w:val="0"/>
-                <w:sz w:val="15"/>
+                <w:i w:val="0"/>
+                <w:sz w:val="22"/>
               </w:rPr>
             </w:r>
           </w:p>
@@ -3031,15 +3710,20 @@
       <w:tr>
         <w:tc>
           <w:tcPr>
-            <w:tcW w:type="dxa" w:w="500"/>
+            <w:tcW w:type="dxa" w:w="550"/>
             <w:vAlign w:val="center"/>
             <w:tcMar>
-              <w:top w:w="40" w:type="dxa"/>
-              <w:bottom w:w="40" w:type="dxa"/>
+              <w:top w:w="30" w:type="dxa"/>
+              <w:bottom w:w="30" w:type="dxa"/>
               <w:left w:w="40" w:type="dxa"/>
               <w:right w:w="40" w:type="dxa"/>
             </w:tcMar>
-            <w:shd w:fill="F7F7F7" w:val="clear"/>
+            <w:tcBorders>
+              <w:top w:val="single" w:sz="4" w:space="0" w:color="000000"/>
+              <w:left w:val="single" w:sz="4" w:space="0" w:color="000000"/>
+              <w:bottom w:val="single" w:sz="4" w:space="0" w:color="000000"/>
+              <w:right w:val="single" w:sz="4" w:space="0" w:color="000000"/>
+            </w:tcBorders>
           </w:tcPr>
           <w:p>
             <w:pPr>
@@ -3050,7 +3734,8 @@
               <w:rPr>
                 <w:rFonts w:ascii="Times New Roman" w:hAnsi="Times New Roman" w:eastAsia="Times New Roman" w:cs="Times New Roman"/>
                 <w:b w:val="0"/>
-                <w:sz w:val="15"/>
+                <w:i w:val="0"/>
+                <w:sz w:val="22"/>
               </w:rPr>
               <w:t>12</w:t>
             </w:r>
@@ -3058,15 +3743,20 @@
         </w:tc>
         <w:tc>
           <w:tcPr>
-            <w:tcW w:type="dxa" w:w="1800"/>
+            <w:tcW w:type="dxa" w:w="1900"/>
             <w:vAlign w:val="center"/>
             <w:tcMar>
-              <w:top w:w="40" w:type="dxa"/>
-              <w:bottom w:w="40" w:type="dxa"/>
+              <w:top w:w="30" w:type="dxa"/>
+              <w:bottom w:w="30" w:type="dxa"/>
               <w:left w:w="40" w:type="dxa"/>
               <w:right w:w="40" w:type="dxa"/>
             </w:tcMar>
-            <w:shd w:fill="F7F7F7" w:val="clear"/>
+            <w:tcBorders>
+              <w:top w:val="single" w:sz="4" w:space="0" w:color="000000"/>
+              <w:left w:val="single" w:sz="4" w:space="0" w:color="000000"/>
+              <w:bottom w:val="single" w:sz="4" w:space="0" w:color="000000"/>
+              <w:right w:val="single" w:sz="4" w:space="0" w:color="000000"/>
+            </w:tcBorders>
             <w:vMerge/>
           </w:tcPr>
           <w:p>
@@ -3078,22 +3768,28 @@
               <w:rPr>
                 <w:rFonts w:ascii="Times New Roman" w:hAnsi="Times New Roman" w:eastAsia="Times New Roman" w:cs="Times New Roman"/>
                 <w:b w:val="0"/>
-                <w:sz w:val="15"/>
+                <w:i w:val="0"/>
+                <w:sz w:val="22"/>
               </w:rPr>
             </w:r>
           </w:p>
         </w:tc>
         <w:tc>
           <w:tcPr>
-            <w:tcW w:type="dxa" w:w="2400"/>
+            <w:tcW w:type="dxa" w:w="2500"/>
             <w:vAlign w:val="center"/>
             <w:tcMar>
-              <w:top w:w="40" w:type="dxa"/>
-              <w:bottom w:w="40" w:type="dxa"/>
+              <w:top w:w="30" w:type="dxa"/>
+              <w:bottom w:w="30" w:type="dxa"/>
               <w:left w:w="40" w:type="dxa"/>
               <w:right w:w="40" w:type="dxa"/>
             </w:tcMar>
-            <w:shd w:fill="F7F7F7" w:val="clear"/>
+            <w:tcBorders>
+              <w:top w:val="single" w:sz="4" w:space="0" w:color="000000"/>
+              <w:left w:val="single" w:sz="4" w:space="0" w:color="000000"/>
+              <w:bottom w:val="single" w:sz="4" w:space="0" w:color="000000"/>
+              <w:right w:val="single" w:sz="4" w:space="0" w:color="000000"/>
+            </w:tcBorders>
           </w:tcPr>
           <w:p>
             <w:pPr>
@@ -3104,7 +3800,8 @@
               <w:rPr>
                 <w:rFonts w:ascii="Times New Roman" w:hAnsi="Times New Roman" w:eastAsia="Times New Roman" w:cs="Times New Roman"/>
                 <w:b w:val="0"/>
-                <w:sz w:val="15"/>
+                <w:i w:val="0"/>
+                <w:sz w:val="22"/>
               </w:rPr>
               <w:t>Siramamy (kg)</w:t>
             </w:r>
@@ -3112,15 +3809,20 @@
         </w:tc>
         <w:tc>
           <w:tcPr>
-            <w:tcW w:type="dxa" w:w="1000"/>
+            <w:tcW w:type="dxa" w:w="1100"/>
             <w:vAlign w:val="center"/>
             <w:tcMar>
-              <w:top w:w="40" w:type="dxa"/>
-              <w:bottom w:w="40" w:type="dxa"/>
+              <w:top w:w="30" w:type="dxa"/>
+              <w:bottom w:w="30" w:type="dxa"/>
               <w:left w:w="40" w:type="dxa"/>
               <w:right w:w="40" w:type="dxa"/>
             </w:tcMar>
-            <w:shd w:fill="F7F7F7" w:val="clear"/>
+            <w:tcBorders>
+              <w:top w:val="single" w:sz="4" w:space="0" w:color="000000"/>
+              <w:left w:val="single" w:sz="4" w:space="0" w:color="000000"/>
+              <w:bottom w:val="single" w:sz="4" w:space="0" w:color="000000"/>
+              <w:right w:val="single" w:sz="4" w:space="0" w:color="000000"/>
+            </w:tcBorders>
           </w:tcPr>
           <w:p>
             <w:pPr>
@@ -3131,7 +3833,8 @@
               <w:rPr>
                 <w:rFonts w:ascii="Times New Roman" w:hAnsi="Times New Roman" w:eastAsia="Times New Roman" w:cs="Times New Roman"/>
                 <w:b w:val="0"/>
-                <w:sz w:val="15"/>
+                <w:i w:val="0"/>
+                <w:sz w:val="22"/>
               </w:rPr>
               <w:t>20</w:t>
             </w:r>
@@ -3139,15 +3842,20 @@
         </w:tc>
         <w:tc>
           <w:tcPr>
-            <w:tcW w:type="dxa" w:w="700"/>
+            <w:tcW w:type="dxa" w:w="750"/>
             <w:vAlign w:val="center"/>
             <w:tcMar>
-              <w:top w:w="40" w:type="dxa"/>
-              <w:bottom w:w="40" w:type="dxa"/>
+              <w:top w:w="30" w:type="dxa"/>
+              <w:bottom w:w="30" w:type="dxa"/>
               <w:left w:w="40" w:type="dxa"/>
               <w:right w:w="40" w:type="dxa"/>
             </w:tcMar>
-            <w:shd w:fill="F7F7F7" w:val="clear"/>
+            <w:tcBorders>
+              <w:top w:val="single" w:sz="4" w:space="0" w:color="000000"/>
+              <w:left w:val="single" w:sz="4" w:space="0" w:color="000000"/>
+              <w:bottom w:val="single" w:sz="4" w:space="0" w:color="000000"/>
+              <w:right w:val="single" w:sz="4" w:space="0" w:color="000000"/>
+            </w:tcBorders>
           </w:tcPr>
           <w:p>
             <w:pPr>
@@ -3158,7 +3866,8 @@
               <w:rPr>
                 <w:rFonts w:ascii="Times New Roman" w:hAnsi="Times New Roman" w:eastAsia="Times New Roman" w:cs="Times New Roman"/>
                 <w:b w:val="0"/>
-                <w:sz w:val="15"/>
+                <w:i w:val="0"/>
+                <w:sz w:val="22"/>
               </w:rPr>
               <w:t>6000</w:t>
             </w:r>
@@ -3166,15 +3875,20 @@
         </w:tc>
         <w:tc>
           <w:tcPr>
-            <w:tcW w:type="dxa" w:w="1100"/>
+            <w:tcW w:type="dxa" w:w="1200"/>
             <w:vAlign w:val="center"/>
             <w:tcMar>
-              <w:top w:w="40" w:type="dxa"/>
-              <w:bottom w:w="40" w:type="dxa"/>
+              <w:top w:w="30" w:type="dxa"/>
+              <w:bottom w:w="30" w:type="dxa"/>
               <w:left w:w="40" w:type="dxa"/>
               <w:right w:w="40" w:type="dxa"/>
             </w:tcMar>
-            <w:shd w:fill="F7F7F7" w:val="clear"/>
+            <w:tcBorders>
+              <w:top w:val="single" w:sz="4" w:space="0" w:color="000000"/>
+              <w:left w:val="single" w:sz="4" w:space="0" w:color="000000"/>
+              <w:bottom w:val="single" w:sz="4" w:space="0" w:color="000000"/>
+              <w:right w:val="single" w:sz="4" w:space="0" w:color="000000"/>
+            </w:tcBorders>
           </w:tcPr>
           <w:p>
             <w:pPr>
@@ -3185,7 +3899,8 @@
               <w:rPr>
                 <w:rFonts w:ascii="Times New Roman" w:hAnsi="Times New Roman" w:eastAsia="Times New Roman" w:cs="Times New Roman"/>
                 <w:b w:val="0"/>
-                <w:sz w:val="15"/>
+                <w:i w:val="0"/>
+                <w:sz w:val="22"/>
               </w:rPr>
               <w:t>120 000</w:t>
             </w:r>
@@ -3193,15 +3908,20 @@
         </w:tc>
         <w:tc>
           <w:tcPr>
-            <w:tcW w:type="dxa" w:w="1200"/>
+            <w:tcW w:type="dxa" w:w="1400"/>
             <w:vAlign w:val="center"/>
             <w:tcMar>
-              <w:top w:w="40" w:type="dxa"/>
-              <w:bottom w:w="40" w:type="dxa"/>
+              <w:top w:w="30" w:type="dxa"/>
+              <w:bottom w:w="30" w:type="dxa"/>
               <w:left w:w="40" w:type="dxa"/>
               <w:right w:w="40" w:type="dxa"/>
             </w:tcMar>
-            <w:shd w:fill="F7F7F7" w:val="clear"/>
+            <w:tcBorders>
+              <w:top w:val="single" w:sz="4" w:space="0" w:color="000000"/>
+              <w:left w:val="single" w:sz="4" w:space="0" w:color="000000"/>
+              <w:bottom w:val="single" w:sz="4" w:space="0" w:color="000000"/>
+              <w:right w:val="single" w:sz="4" w:space="0" w:color="000000"/>
+            </w:tcBorders>
             <w:vMerge/>
           </w:tcPr>
           <w:p>
@@ -3212,8 +3932,9 @@
             <w:r>
               <w:rPr>
                 <w:rFonts w:ascii="Times New Roman" w:hAnsi="Times New Roman" w:eastAsia="Times New Roman" w:cs="Times New Roman"/>
-                <w:b w:val="0"/>
-                <w:sz w:val="15"/>
+                <w:b/>
+                <w:i/>
+                <w:sz w:val="22"/>
               </w:rPr>
               <w:t>ST : 180 000</w:t>
             </w:r>
@@ -3221,15 +3942,20 @@
         </w:tc>
         <w:tc>
           <w:tcPr>
-            <w:tcW w:type="dxa" w:w="1100"/>
+            <w:tcW w:type="dxa" w:w="1000"/>
             <w:vAlign w:val="center"/>
             <w:tcMar>
-              <w:top w:w="40" w:type="dxa"/>
-              <w:bottom w:w="40" w:type="dxa"/>
+              <w:top w:w="30" w:type="dxa"/>
+              <w:bottom w:w="30" w:type="dxa"/>
               <w:left w:w="40" w:type="dxa"/>
               <w:right w:w="40" w:type="dxa"/>
             </w:tcMar>
-            <w:shd w:fill="F7F7F7" w:val="clear"/>
+            <w:tcBorders>
+              <w:top w:val="single" w:sz="4" w:space="0" w:color="000000"/>
+              <w:left w:val="single" w:sz="4" w:space="0" w:color="000000"/>
+              <w:bottom w:val="single" w:sz="4" w:space="0" w:color="000000"/>
+              <w:right w:val="single" w:sz="4" w:space="0" w:color="000000"/>
+            </w:tcBorders>
           </w:tcPr>
           <w:p>
             <w:pPr>
@@ -3240,7 +3966,8 @@
               <w:rPr>
                 <w:rFonts w:ascii="Times New Roman" w:hAnsi="Times New Roman" w:eastAsia="Times New Roman" w:cs="Times New Roman"/>
                 <w:b w:val="0"/>
-                <w:sz w:val="15"/>
+                <w:i w:val="0"/>
+                <w:sz w:val="22"/>
               </w:rPr>
             </w:r>
           </w:p>
@@ -3249,14 +3976,20 @@
       <w:tr>
         <w:tc>
           <w:tcPr>
-            <w:tcW w:type="dxa" w:w="500"/>
+            <w:tcW w:type="dxa" w:w="550"/>
             <w:vAlign w:val="center"/>
             <w:tcMar>
-              <w:top w:w="40" w:type="dxa"/>
-              <w:bottom w:w="40" w:type="dxa"/>
+              <w:top w:w="30" w:type="dxa"/>
+              <w:bottom w:w="30" w:type="dxa"/>
               <w:left w:w="40" w:type="dxa"/>
               <w:right w:w="40" w:type="dxa"/>
             </w:tcMar>
+            <w:tcBorders>
+              <w:top w:val="single" w:sz="4" w:space="0" w:color="000000"/>
+              <w:left w:val="single" w:sz="4" w:space="0" w:color="000000"/>
+              <w:bottom w:val="single" w:sz="4" w:space="0" w:color="000000"/>
+              <w:right w:val="single" w:sz="4" w:space="0" w:color="000000"/>
+            </w:tcBorders>
           </w:tcPr>
           <w:p>
             <w:pPr>
@@ -3267,7 +4000,8 @@
               <w:rPr>
                 <w:rFonts w:ascii="Times New Roman" w:hAnsi="Times New Roman" w:eastAsia="Times New Roman" w:cs="Times New Roman"/>
                 <w:b w:val="0"/>
-                <w:sz w:val="15"/>
+                <w:i w:val="0"/>
+                <w:sz w:val="22"/>
               </w:rPr>
               <w:t>13</w:t>
             </w:r>
@@ -3275,14 +4009,20 @@
         </w:tc>
         <w:tc>
           <w:tcPr>
-            <w:tcW w:type="dxa" w:w="1800"/>
+            <w:tcW w:type="dxa" w:w="1900"/>
             <w:vAlign w:val="center"/>
             <w:tcMar>
-              <w:top w:w="40" w:type="dxa"/>
-              <w:bottom w:w="40" w:type="dxa"/>
+              <w:top w:w="30" w:type="dxa"/>
+              <w:bottom w:w="30" w:type="dxa"/>
               <w:left w:w="40" w:type="dxa"/>
               <w:right w:w="40" w:type="dxa"/>
             </w:tcMar>
+            <w:tcBorders>
+              <w:top w:val="single" w:sz="4" w:space="0" w:color="000000"/>
+              <w:left w:val="single" w:sz="4" w:space="0" w:color="000000"/>
+              <w:bottom w:val="single" w:sz="4" w:space="0" w:color="000000"/>
+              <w:right w:val="single" w:sz="4" w:space="0" w:color="000000"/>
+            </w:tcBorders>
           </w:tcPr>
           <w:p>
             <w:pPr>
@@ -3293,7 +4033,8 @@
               <w:rPr>
                 <w:rFonts w:ascii="Times New Roman" w:hAnsi="Times New Roman" w:eastAsia="Times New Roman" w:cs="Times New Roman"/>
                 <w:b/>
-                <w:sz w:val="15"/>
+                <w:i w:val="0"/>
+                <w:sz w:val="22"/>
               </w:rPr>
               <w:t>Fampandehanana ny VFF</w:t>
             </w:r>
@@ -3301,14 +4042,20 @@
         </w:tc>
         <w:tc>
           <w:tcPr>
-            <w:tcW w:type="dxa" w:w="2400"/>
+            <w:tcW w:type="dxa" w:w="2500"/>
             <w:vAlign w:val="center"/>
             <w:tcMar>
-              <w:top w:w="40" w:type="dxa"/>
-              <w:bottom w:w="40" w:type="dxa"/>
+              <w:top w:w="30" w:type="dxa"/>
+              <w:bottom w:w="30" w:type="dxa"/>
               <w:left w:w="40" w:type="dxa"/>
               <w:right w:w="40" w:type="dxa"/>
             </w:tcMar>
+            <w:tcBorders>
+              <w:top w:val="single" w:sz="4" w:space="0" w:color="000000"/>
+              <w:left w:val="single" w:sz="4" w:space="0" w:color="000000"/>
+              <w:bottom w:val="single" w:sz="4" w:space="0" w:color="000000"/>
+              <w:right w:val="single" w:sz="4" w:space="0" w:color="000000"/>
+            </w:tcBorders>
           </w:tcPr>
           <w:p>
             <w:pPr>
@@ -3319,7 +4066,8 @@
               <w:rPr>
                 <w:rFonts w:ascii="Times New Roman" w:hAnsi="Times New Roman" w:eastAsia="Times New Roman" w:cs="Times New Roman"/>
                 <w:b w:val="0"/>
-                <w:sz w:val="15"/>
+                <w:i w:val="0"/>
+                <w:sz w:val="22"/>
               </w:rPr>
               <w:t>Hetsika VFF</w:t>
             </w:r>
@@ -3327,14 +4075,20 @@
         </w:tc>
         <w:tc>
           <w:tcPr>
-            <w:tcW w:type="dxa" w:w="1000"/>
+            <w:tcW w:type="dxa" w:w="1100"/>
             <w:vAlign w:val="center"/>
             <w:tcMar>
-              <w:top w:w="40" w:type="dxa"/>
-              <w:bottom w:w="40" w:type="dxa"/>
+              <w:top w:w="30" w:type="dxa"/>
+              <w:bottom w:w="30" w:type="dxa"/>
               <w:left w:w="40" w:type="dxa"/>
               <w:right w:w="40" w:type="dxa"/>
             </w:tcMar>
+            <w:tcBorders>
+              <w:top w:val="single" w:sz="4" w:space="0" w:color="000000"/>
+              <w:left w:val="single" w:sz="4" w:space="0" w:color="000000"/>
+              <w:bottom w:val="single" w:sz="4" w:space="0" w:color="000000"/>
+              <w:right w:val="single" w:sz="4" w:space="0" w:color="000000"/>
+            </w:tcBorders>
           </w:tcPr>
           <w:p>
             <w:pPr>
@@ -3345,7 +4099,8 @@
               <w:rPr>
                 <w:rFonts w:ascii="Times New Roman" w:hAnsi="Times New Roman" w:eastAsia="Times New Roman" w:cs="Times New Roman"/>
                 <w:b w:val="0"/>
-                <w:sz w:val="15"/>
+                <w:i w:val="0"/>
+                <w:sz w:val="22"/>
               </w:rPr>
               <w:t>1</w:t>
             </w:r>
@@ -3353,14 +4108,20 @@
         </w:tc>
         <w:tc>
           <w:tcPr>
-            <w:tcW w:type="dxa" w:w="700"/>
+            <w:tcW w:type="dxa" w:w="750"/>
             <w:vAlign w:val="center"/>
             <w:tcMar>
-              <w:top w:w="40" w:type="dxa"/>
-              <w:bottom w:w="40" w:type="dxa"/>
+              <w:top w:w="30" w:type="dxa"/>
+              <w:bottom w:w="30" w:type="dxa"/>
               <w:left w:w="40" w:type="dxa"/>
               <w:right w:w="40" w:type="dxa"/>
             </w:tcMar>
+            <w:tcBorders>
+              <w:top w:val="single" w:sz="4" w:space="0" w:color="000000"/>
+              <w:left w:val="single" w:sz="4" w:space="0" w:color="000000"/>
+              <w:bottom w:val="single" w:sz="4" w:space="0" w:color="000000"/>
+              <w:right w:val="single" w:sz="4" w:space="0" w:color="000000"/>
+            </w:tcBorders>
           </w:tcPr>
           <w:p>
             <w:pPr>
@@ -3371,7 +4132,8 @@
               <w:rPr>
                 <w:rFonts w:ascii="Times New Roman" w:hAnsi="Times New Roman" w:eastAsia="Times New Roman" w:cs="Times New Roman"/>
                 <w:b w:val="0"/>
-                <w:sz w:val="15"/>
+                <w:i w:val="0"/>
+                <w:sz w:val="22"/>
               </w:rPr>
               <w:t>50000</w:t>
             </w:r>
@@ -3379,14 +4141,20 @@
         </w:tc>
         <w:tc>
           <w:tcPr>
-            <w:tcW w:type="dxa" w:w="1100"/>
+            <w:tcW w:type="dxa" w:w="1200"/>
             <w:vAlign w:val="center"/>
             <w:tcMar>
-              <w:top w:w="40" w:type="dxa"/>
-              <w:bottom w:w="40" w:type="dxa"/>
+              <w:top w:w="30" w:type="dxa"/>
+              <w:bottom w:w="30" w:type="dxa"/>
               <w:left w:w="40" w:type="dxa"/>
               <w:right w:w="40" w:type="dxa"/>
             </w:tcMar>
+            <w:tcBorders>
+              <w:top w:val="single" w:sz="4" w:space="0" w:color="000000"/>
+              <w:left w:val="single" w:sz="4" w:space="0" w:color="000000"/>
+              <w:bottom w:val="single" w:sz="4" w:space="0" w:color="000000"/>
+              <w:right w:val="single" w:sz="4" w:space="0" w:color="000000"/>
+            </w:tcBorders>
           </w:tcPr>
           <w:p>
             <w:pPr>
@@ -3397,7 +4165,8 @@
               <w:rPr>
                 <w:rFonts w:ascii="Times New Roman" w:hAnsi="Times New Roman" w:eastAsia="Times New Roman" w:cs="Times New Roman"/>
                 <w:b w:val="0"/>
-                <w:sz w:val="15"/>
+                <w:i w:val="0"/>
+                <w:sz w:val="22"/>
               </w:rPr>
               <w:t>50 000</w:t>
             </w:r>
@@ -3405,14 +4174,20 @@
         </w:tc>
         <w:tc>
           <w:tcPr>
-            <w:tcW w:type="dxa" w:w="1200"/>
+            <w:tcW w:type="dxa" w:w="1400"/>
             <w:vAlign w:val="center"/>
             <w:tcMar>
-              <w:top w:w="40" w:type="dxa"/>
-              <w:bottom w:w="40" w:type="dxa"/>
+              <w:top w:w="30" w:type="dxa"/>
+              <w:bottom w:w="30" w:type="dxa"/>
               <w:left w:w="40" w:type="dxa"/>
               <w:right w:w="40" w:type="dxa"/>
             </w:tcMar>
+            <w:tcBorders>
+              <w:top w:val="single" w:sz="4" w:space="0" w:color="000000"/>
+              <w:left w:val="single" w:sz="4" w:space="0" w:color="000000"/>
+              <w:bottom w:val="single" w:sz="4" w:space="0" w:color="000000"/>
+              <w:right w:val="single" w:sz="4" w:space="0" w:color="000000"/>
+            </w:tcBorders>
           </w:tcPr>
           <w:p>
             <w:pPr>
@@ -3423,7 +4198,8 @@
               <w:rPr>
                 <w:rFonts w:ascii="Times New Roman" w:hAnsi="Times New Roman" w:eastAsia="Times New Roman" w:cs="Times New Roman"/>
                 <w:b w:val="0"/>
-                <w:sz w:val="15"/>
+                <w:i w:val="0"/>
+                <w:sz w:val="22"/>
               </w:rPr>
               <w:t>VOI</w:t>
             </w:r>
@@ -3436,8 +4212,9 @@
             <w:r>
               <w:rPr>
                 <w:rFonts w:ascii="Times New Roman" w:hAnsi="Times New Roman" w:eastAsia="Times New Roman" w:cs="Times New Roman"/>
-                <w:b w:val="0"/>
-                <w:sz w:val="15"/>
+                <w:b/>
+                <w:i/>
+                <w:sz w:val="22"/>
               </w:rPr>
               <w:t>ST : 50 000</w:t>
             </w:r>
@@ -3445,14 +4222,20 @@
         </w:tc>
         <w:tc>
           <w:tcPr>
-            <w:tcW w:type="dxa" w:w="1100"/>
+            <w:tcW w:type="dxa" w:w="1000"/>
             <w:vAlign w:val="center"/>
             <w:tcMar>
-              <w:top w:w="40" w:type="dxa"/>
-              <w:bottom w:w="40" w:type="dxa"/>
+              <w:top w:w="30" w:type="dxa"/>
+              <w:bottom w:w="30" w:type="dxa"/>
               <w:left w:w="40" w:type="dxa"/>
               <w:right w:w="40" w:type="dxa"/>
             </w:tcMar>
+            <w:tcBorders>
+              <w:top w:val="single" w:sz="4" w:space="0" w:color="000000"/>
+              <w:left w:val="single" w:sz="4" w:space="0" w:color="000000"/>
+              <w:bottom w:val="single" w:sz="4" w:space="0" w:color="000000"/>
+              <w:right w:val="single" w:sz="4" w:space="0" w:color="000000"/>
+            </w:tcBorders>
           </w:tcPr>
           <w:p>
             <w:pPr>
@@ -3463,7 +4246,8 @@
               <w:rPr>
                 <w:rFonts w:ascii="Times New Roman" w:hAnsi="Times New Roman" w:eastAsia="Times New Roman" w:cs="Times New Roman"/>
                 <w:b w:val="0"/>
-                <w:sz w:val="15"/>
+                <w:i w:val="0"/>
+                <w:sz w:val="22"/>
               </w:rPr>
             </w:r>
           </w:p>
@@ -3472,27 +4256,29 @@
     </w:tbl>
     <w:p>
       <w:pPr>
-        <w:spacing w:before="160" w:after="0"/>
+        <w:spacing w:before="200" w:after="0"/>
       </w:pPr>
       <w:r>
         <w:rPr>
           <w:rFonts w:ascii="Times New Roman" w:hAnsi="Times New Roman" w:eastAsia="Times New Roman" w:cs="Times New Roman"/>
           <w:b/>
-          <w:sz w:val="18"/>
+          <w:i w:val="0"/>
+          <w:sz w:val="24"/>
         </w:rPr>
-        <w:t>Nofaranana tamin’ny tetibola : 7 895 000 Ar (VOI)</w:t>
+        <w:t>Nofaranana tamin’ny tetibola : 7 896 000 Ar (VOI)</w:t>
       </w:r>
     </w:p>
     <w:p>
       <w:pPr>
-        <w:spacing w:before="120" w:after="0"/>
-        <w:jc w:val="center"/>
+        <w:spacing w:before="160" w:after="0"/>
+        <w:jc w:val="right"/>
       </w:pPr>
       <w:r>
         <w:rPr>
           <w:rFonts w:ascii="Times New Roman" w:hAnsi="Times New Roman" w:eastAsia="Times New Roman" w:cs="Times New Roman"/>
           <w:b w:val="0"/>
-          <w:sz w:val="18"/>
+          <w:i w:val="0"/>
+          <w:sz w:val="24"/>
         </w:rPr>
         <w:t>Natao teto Andranomafana, androany faha-04 Septambra 2026</w:t>
       </w:r>
@@ -3503,21 +4289,27 @@
         <w:tblLook w:firstColumn="1" w:firstRow="1" w:lastColumn="0" w:lastRow="0" w:noHBand="0" w:noVBand="1" w:val="04A0"/>
       </w:tblPr>
       <w:tblGrid>
-        <w:gridCol w:w="3515"/>
-        <w:gridCol w:w="3515"/>
-        <w:gridCol w:w="3515"/>
+        <w:gridCol w:w="3402"/>
+        <w:gridCol w:w="3402"/>
+        <w:gridCol w:w="3402"/>
       </w:tblGrid>
       <w:tr>
         <w:tc>
           <w:tcPr>
-            <w:tcW w:type="dxa" w:w="3515"/>
+            <w:tcW w:type="dxa" w:w="3402"/>
             <w:vAlign w:val="center"/>
             <w:tcMar>
-              <w:top w:w="40" w:type="dxa"/>
-              <w:bottom w:w="40" w:type="dxa"/>
+              <w:top w:w="30" w:type="dxa"/>
+              <w:bottom w:w="30" w:type="dxa"/>
               <w:left w:w="40" w:type="dxa"/>
               <w:right w:w="40" w:type="dxa"/>
             </w:tcMar>
+            <w:tcBorders>
+              <w:top w:val="nil"/>
+              <w:left w:val="nil"/>
+              <w:bottom w:val="nil"/>
+              <w:right w:val="nil"/>
+            </w:tcBorders>
           </w:tcPr>
           <w:p>
             <w:pPr>
@@ -3528,7 +4320,8 @@
               <w:rPr>
                 <w:rFonts w:ascii="Times New Roman" w:hAnsi="Times New Roman" w:eastAsia="Times New Roman" w:cs="Times New Roman"/>
                 <w:b w:val="0"/>
-                <w:sz w:val="16"/>
+                <w:i w:val="0"/>
+                <w:sz w:val="24"/>
               </w:rPr>
             </w:r>
           </w:p>
@@ -3541,7 +4334,8 @@
               <w:rPr>
                 <w:rFonts w:ascii="Times New Roman" w:hAnsi="Times New Roman" w:eastAsia="Times New Roman" w:cs="Times New Roman"/>
                 <w:b w:val="0"/>
-                <w:sz w:val="16"/>
+                <w:i w:val="0"/>
+                <w:sz w:val="24"/>
               </w:rPr>
             </w:r>
           </w:p>
@@ -3554,32 +4348,8 @@
               <w:rPr>
                 <w:rFonts w:ascii="Times New Roman" w:hAnsi="Times New Roman" w:eastAsia="Times New Roman" w:cs="Times New Roman"/>
                 <w:b w:val="0"/>
-                <w:sz w:val="16"/>
-              </w:rPr>
-            </w:r>
-          </w:p>
-        </w:tc>
-        <w:tc>
-          <w:tcPr>
-            <w:tcW w:type="dxa" w:w="3515"/>
-            <w:vAlign w:val="center"/>
-            <w:tcMar>
-              <w:top w:w="40" w:type="dxa"/>
-              <w:bottom w:w="40" w:type="dxa"/>
-              <w:left w:w="40" w:type="dxa"/>
-              <w:right w:w="40" w:type="dxa"/>
-            </w:tcMar>
-          </w:tcPr>
-          <w:p>
-            <w:pPr>
-              <w:spacing w:before="0" w:after="0" w:line="240" w:lineRule="auto"/>
-              <w:jc w:val="center"/>
-            </w:pPr>
-            <w:r>
-              <w:rPr>
-                <w:rFonts w:ascii="Times New Roman" w:hAnsi="Times New Roman" w:eastAsia="Times New Roman" w:cs="Times New Roman"/>
-                <w:b w:val="0"/>
-                <w:sz w:val="16"/>
+                <w:i w:val="0"/>
+                <w:sz w:val="24"/>
               </w:rPr>
             </w:r>
           </w:p>
@@ -3592,7 +4362,8 @@
               <w:rPr>
                 <w:rFonts w:ascii="Times New Roman" w:hAnsi="Times New Roman" w:eastAsia="Times New Roman" w:cs="Times New Roman"/>
                 <w:b w:val="0"/>
-                <w:sz w:val="16"/>
+                <w:i w:val="0"/>
+                <w:sz w:val="24"/>
               </w:rPr>
             </w:r>
           </w:p>
@@ -3605,32 +4376,8 @@
               <w:rPr>
                 <w:rFonts w:ascii="Times New Roman" w:hAnsi="Times New Roman" w:eastAsia="Times New Roman" w:cs="Times New Roman"/>
                 <w:b w:val="0"/>
-                <w:sz w:val="16"/>
-              </w:rPr>
-            </w:r>
-          </w:p>
-        </w:tc>
-        <w:tc>
-          <w:tcPr>
-            <w:tcW w:type="dxa" w:w="3515"/>
-            <w:vAlign w:val="center"/>
-            <w:tcMar>
-              <w:top w:w="40" w:type="dxa"/>
-              <w:bottom w:w="40" w:type="dxa"/>
-              <w:left w:w="40" w:type="dxa"/>
-              <w:right w:w="40" w:type="dxa"/>
-            </w:tcMar>
-          </w:tcPr>
-          <w:p>
-            <w:pPr>
-              <w:spacing w:before="0" w:after="0" w:line="240" w:lineRule="auto"/>
-              <w:jc w:val="center"/>
-            </w:pPr>
-            <w:r>
-              <w:rPr>
-                <w:rFonts w:ascii="Times New Roman" w:hAnsi="Times New Roman" w:eastAsia="Times New Roman" w:cs="Times New Roman"/>
-                <w:b w:val="0"/>
-                <w:sz w:val="16"/>
+                <w:i w:val="0"/>
+                <w:sz w:val="24"/>
               </w:rPr>
             </w:r>
           </w:p>
@@ -3643,7 +4390,40 @@
               <w:rPr>
                 <w:rFonts w:ascii="Times New Roman" w:hAnsi="Times New Roman" w:eastAsia="Times New Roman" w:cs="Times New Roman"/>
                 <w:b w:val="0"/>
-                <w:sz w:val="16"/>
+                <w:i w:val="0"/>
+                <w:sz w:val="24"/>
+              </w:rPr>
+            </w:r>
+          </w:p>
+        </w:tc>
+        <w:tc>
+          <w:tcPr>
+            <w:tcW w:type="dxa" w:w="3402"/>
+            <w:vAlign w:val="center"/>
+            <w:tcMar>
+              <w:top w:w="30" w:type="dxa"/>
+              <w:bottom w:w="30" w:type="dxa"/>
+              <w:left w:w="40" w:type="dxa"/>
+              <w:right w:w="40" w:type="dxa"/>
+            </w:tcMar>
+            <w:tcBorders>
+              <w:top w:val="nil"/>
+              <w:left w:val="nil"/>
+              <w:bottom w:val="nil"/>
+              <w:right w:val="nil"/>
+            </w:tcBorders>
+          </w:tcPr>
+          <w:p>
+            <w:pPr>
+              <w:spacing w:before="0" w:after="0" w:line="240" w:lineRule="auto"/>
+              <w:jc w:val="center"/>
+            </w:pPr>
+            <w:r>
+              <w:rPr>
+                <w:rFonts w:ascii="Times New Roman" w:hAnsi="Times New Roman" w:eastAsia="Times New Roman" w:cs="Times New Roman"/>
+                <w:b w:val="0"/>
+                <w:i w:val="0"/>
+                <w:sz w:val="24"/>
               </w:rPr>
             </w:r>
           </w:p>
@@ -3656,7 +4436,166 @@
               <w:rPr>
                 <w:rFonts w:ascii="Times New Roman" w:hAnsi="Times New Roman" w:eastAsia="Times New Roman" w:cs="Times New Roman"/>
                 <w:b w:val="0"/>
-                <w:sz w:val="16"/>
+                <w:i w:val="0"/>
+                <w:sz w:val="24"/>
+              </w:rPr>
+            </w:r>
+          </w:p>
+          <w:p>
+            <w:pPr>
+              <w:spacing w:before="0" w:after="0" w:line="240" w:lineRule="auto"/>
+              <w:jc w:val="center"/>
+            </w:pPr>
+            <w:r>
+              <w:rPr>
+                <w:rFonts w:ascii="Times New Roman" w:hAnsi="Times New Roman" w:eastAsia="Times New Roman" w:cs="Times New Roman"/>
+                <w:b w:val="0"/>
+                <w:i w:val="0"/>
+                <w:sz w:val="24"/>
+              </w:rPr>
+            </w:r>
+          </w:p>
+          <w:p>
+            <w:pPr>
+              <w:spacing w:before="0" w:after="0" w:line="240" w:lineRule="auto"/>
+              <w:jc w:val="center"/>
+            </w:pPr>
+            <w:r>
+              <w:rPr>
+                <w:rFonts w:ascii="Times New Roman" w:hAnsi="Times New Roman" w:eastAsia="Times New Roman" w:cs="Times New Roman"/>
+                <w:b w:val="0"/>
+                <w:i w:val="0"/>
+                <w:sz w:val="24"/>
+              </w:rPr>
+            </w:r>
+          </w:p>
+          <w:p>
+            <w:pPr>
+              <w:spacing w:before="0" w:after="0" w:line="240" w:lineRule="auto"/>
+              <w:jc w:val="center"/>
+            </w:pPr>
+            <w:r>
+              <w:rPr>
+                <w:rFonts w:ascii="Times New Roman" w:hAnsi="Times New Roman" w:eastAsia="Times New Roman" w:cs="Times New Roman"/>
+                <w:b w:val="0"/>
+                <w:i w:val="0"/>
+                <w:sz w:val="24"/>
+              </w:rPr>
+            </w:r>
+          </w:p>
+          <w:p>
+            <w:pPr>
+              <w:spacing w:before="0" w:after="0" w:line="240" w:lineRule="auto"/>
+              <w:jc w:val="center"/>
+            </w:pPr>
+            <w:r>
+              <w:rPr>
+                <w:rFonts w:ascii="Times New Roman" w:hAnsi="Times New Roman" w:eastAsia="Times New Roman" w:cs="Times New Roman"/>
+                <w:b w:val="0"/>
+                <w:i w:val="0"/>
+                <w:sz w:val="24"/>
+              </w:rPr>
+            </w:r>
+          </w:p>
+        </w:tc>
+        <w:tc>
+          <w:tcPr>
+            <w:tcW w:type="dxa" w:w="3402"/>
+            <w:vAlign w:val="center"/>
+            <w:tcMar>
+              <w:top w:w="30" w:type="dxa"/>
+              <w:bottom w:w="30" w:type="dxa"/>
+              <w:left w:w="40" w:type="dxa"/>
+              <w:right w:w="40" w:type="dxa"/>
+            </w:tcMar>
+            <w:tcBorders>
+              <w:top w:val="nil"/>
+              <w:left w:val="nil"/>
+              <w:bottom w:val="nil"/>
+              <w:right w:val="nil"/>
+            </w:tcBorders>
+          </w:tcPr>
+          <w:p>
+            <w:pPr>
+              <w:spacing w:before="0" w:after="0" w:line="240" w:lineRule="auto"/>
+              <w:jc w:val="center"/>
+            </w:pPr>
+            <w:r>
+              <w:rPr>
+                <w:rFonts w:ascii="Times New Roman" w:hAnsi="Times New Roman" w:eastAsia="Times New Roman" w:cs="Times New Roman"/>
+                <w:b w:val="0"/>
+                <w:i w:val="0"/>
+                <w:sz w:val="24"/>
+              </w:rPr>
+            </w:r>
+          </w:p>
+          <w:p>
+            <w:pPr>
+              <w:spacing w:before="0" w:after="0" w:line="240" w:lineRule="auto"/>
+              <w:jc w:val="center"/>
+            </w:pPr>
+            <w:r>
+              <w:rPr>
+                <w:rFonts w:ascii="Times New Roman" w:hAnsi="Times New Roman" w:eastAsia="Times New Roman" w:cs="Times New Roman"/>
+                <w:b w:val="0"/>
+                <w:i w:val="0"/>
+                <w:sz w:val="24"/>
+              </w:rPr>
+            </w:r>
+          </w:p>
+          <w:p>
+            <w:pPr>
+              <w:spacing w:before="0" w:after="0" w:line="240" w:lineRule="auto"/>
+              <w:jc w:val="center"/>
+            </w:pPr>
+            <w:r>
+              <w:rPr>
+                <w:rFonts w:ascii="Times New Roman" w:hAnsi="Times New Roman" w:eastAsia="Times New Roman" w:cs="Times New Roman"/>
+                <w:b w:val="0"/>
+                <w:i w:val="0"/>
+                <w:sz w:val="24"/>
+              </w:rPr>
+            </w:r>
+          </w:p>
+          <w:p>
+            <w:pPr>
+              <w:spacing w:before="0" w:after="0" w:line="240" w:lineRule="auto"/>
+              <w:jc w:val="center"/>
+            </w:pPr>
+            <w:r>
+              <w:rPr>
+                <w:rFonts w:ascii="Times New Roman" w:hAnsi="Times New Roman" w:eastAsia="Times New Roman" w:cs="Times New Roman"/>
+                <w:b w:val="0"/>
+                <w:i w:val="0"/>
+                <w:sz w:val="24"/>
+              </w:rPr>
+            </w:r>
+          </w:p>
+          <w:p>
+            <w:pPr>
+              <w:spacing w:before="0" w:after="0" w:line="240" w:lineRule="auto"/>
+              <w:jc w:val="center"/>
+            </w:pPr>
+            <w:r>
+              <w:rPr>
+                <w:rFonts w:ascii="Times New Roman" w:hAnsi="Times New Roman" w:eastAsia="Times New Roman" w:cs="Times New Roman"/>
+                <w:b w:val="0"/>
+                <w:i w:val="0"/>
+                <w:sz w:val="24"/>
+              </w:rPr>
+            </w:r>
+          </w:p>
+          <w:p>
+            <w:pPr>
+              <w:spacing w:before="0" w:after="0" w:line="240" w:lineRule="auto"/>
+              <w:jc w:val="center"/>
+            </w:pPr>
+            <w:r>
+              <w:rPr>
+                <w:rFonts w:ascii="Times New Roman" w:hAnsi="Times New Roman" w:eastAsia="Times New Roman" w:cs="Times New Roman"/>
+                <w:b w:val="0"/>
+                <w:i w:val="0"/>
+                <w:sz w:val="24"/>
               </w:rPr>
             </w:r>
           </w:p>
@@ -3665,14 +4604,20 @@
       <w:tr>
         <w:tc>
           <w:tcPr>
-            <w:tcW w:type="dxa" w:w="3515"/>
+            <w:tcW w:type="dxa" w:w="3402"/>
             <w:vAlign w:val="center"/>
             <w:tcMar>
-              <w:top w:w="40" w:type="dxa"/>
-              <w:bottom w:w="40" w:type="dxa"/>
+              <w:top w:w="30" w:type="dxa"/>
+              <w:bottom w:w="30" w:type="dxa"/>
               <w:left w:w="40" w:type="dxa"/>
               <w:right w:w="40" w:type="dxa"/>
             </w:tcMar>
+            <w:tcBorders>
+              <w:top w:val="nil"/>
+              <w:left w:val="nil"/>
+              <w:bottom w:val="nil"/>
+              <w:right w:val="nil"/>
+            </w:tcBorders>
           </w:tcPr>
           <w:p>
             <w:pPr>
@@ -3683,36 +4628,29 @@
               <w:rPr>
                 <w:rFonts w:ascii="Times New Roman" w:hAnsi="Times New Roman" w:eastAsia="Times New Roman" w:cs="Times New Roman"/>
                 <w:b/>
-                <w:sz w:val="16"/>
+                <w:i w:val="0"/>
+                <w:sz w:val="24"/>
               </w:rPr>
               <w:t>NY FILOHA BM FEFFI</w:t>
-            </w:r>
-          </w:p>
-          <w:p>
-            <w:pPr>
-              <w:spacing w:before="0" w:after="0" w:line="240" w:lineRule="auto"/>
-              <w:jc w:val="center"/>
-            </w:pPr>
-            <w:r>
-              <w:rPr>
-                <w:rFonts w:ascii="Times New Roman" w:hAnsi="Times New Roman" w:eastAsia="Times New Roman" w:cs="Times New Roman"/>
-                <w:b/>
-                <w:sz w:val="16"/>
-              </w:rPr>
-              <w:t>RAZAFIMANDAHATRA Maxim</w:t>
             </w:r>
           </w:p>
         </w:tc>
         <w:tc>
           <w:tcPr>
-            <w:tcW w:type="dxa" w:w="3515"/>
+            <w:tcW w:type="dxa" w:w="3402"/>
             <w:vAlign w:val="center"/>
             <w:tcMar>
-              <w:top w:w="40" w:type="dxa"/>
-              <w:bottom w:w="40" w:type="dxa"/>
+              <w:top w:w="30" w:type="dxa"/>
+              <w:bottom w:w="30" w:type="dxa"/>
               <w:left w:w="40" w:type="dxa"/>
               <w:right w:w="40" w:type="dxa"/>
             </w:tcMar>
+            <w:tcBorders>
+              <w:top w:val="nil"/>
+              <w:left w:val="nil"/>
+              <w:bottom w:val="nil"/>
+              <w:right w:val="nil"/>
+            </w:tcBorders>
           </w:tcPr>
           <w:p>
             <w:pPr>
@@ -3723,36 +4661,29 @@
               <w:rPr>
                 <w:rFonts w:ascii="Times New Roman" w:hAnsi="Times New Roman" w:eastAsia="Times New Roman" w:cs="Times New Roman"/>
                 <w:b/>
-                <w:sz w:val="16"/>
+                <w:i w:val="0"/>
+                <w:sz w:val="24"/>
               </w:rPr>
               <w:t>NY TALE</w:t>
-            </w:r>
-          </w:p>
-          <w:p>
-            <w:pPr>
-              <w:spacing w:before="0" w:after="0" w:line="240" w:lineRule="auto"/>
-              <w:jc w:val="center"/>
-            </w:pPr>
-            <w:r>
-              <w:rPr>
-                <w:rFonts w:ascii="Times New Roman" w:hAnsi="Times New Roman" w:eastAsia="Times New Roman" w:cs="Times New Roman"/>
-                <w:b/>
-                <w:sz w:val="16"/>
-              </w:rPr>
-              <w:t>RANDRIANANTENAINA H.L. Juno</w:t>
             </w:r>
           </w:p>
         </w:tc>
         <w:tc>
           <w:tcPr>
-            <w:tcW w:type="dxa" w:w="3515"/>
+            <w:tcW w:type="dxa" w:w="3402"/>
             <w:vAlign w:val="center"/>
             <w:tcMar>
-              <w:top w:w="40" w:type="dxa"/>
-              <w:bottom w:w="40" w:type="dxa"/>
+              <w:top w:w="30" w:type="dxa"/>
+              <w:bottom w:w="30" w:type="dxa"/>
               <w:left w:w="40" w:type="dxa"/>
               <w:right w:w="40" w:type="dxa"/>
             </w:tcMar>
+            <w:tcBorders>
+              <w:top w:val="nil"/>
+              <w:left w:val="nil"/>
+              <w:bottom w:val="nil"/>
+              <w:right w:val="nil"/>
+            </w:tcBorders>
           </w:tcPr>
           <w:p>
             <w:pPr>
@@ -3763,11 +4694,32 @@
               <w:rPr>
                 <w:rFonts w:ascii="Times New Roman" w:hAnsi="Times New Roman" w:eastAsia="Times New Roman" w:cs="Times New Roman"/>
                 <w:b/>
-                <w:sz w:val="16"/>
+                <w:i w:val="0"/>
+                <w:sz w:val="24"/>
               </w:rPr>
               <w:t>MPANDRINDRA NY FB</w:t>
             </w:r>
           </w:p>
+        </w:tc>
+      </w:tr>
+      <w:tr>
+        <w:tc>
+          <w:tcPr>
+            <w:tcW w:type="dxa" w:w="3402"/>
+            <w:vAlign w:val="center"/>
+            <w:tcMar>
+              <w:top w:w="30" w:type="dxa"/>
+              <w:bottom w:w="30" w:type="dxa"/>
+              <w:left w:w="40" w:type="dxa"/>
+              <w:right w:w="40" w:type="dxa"/>
+            </w:tcMar>
+            <w:tcBorders>
+              <w:top w:val="nil"/>
+              <w:left w:val="nil"/>
+              <w:bottom w:val="nil"/>
+              <w:right w:val="nil"/>
+            </w:tcBorders>
+          </w:tcPr>
           <w:p>
             <w:pPr>
               <w:spacing w:before="0" w:after="0" w:line="240" w:lineRule="auto"/>
@@ -3776,10 +4728,77 @@
             <w:r>
               <w:rPr>
                 <w:rFonts w:ascii="Times New Roman" w:hAnsi="Times New Roman" w:eastAsia="Times New Roman" w:cs="Times New Roman"/>
-                <w:b/>
-                <w:sz w:val="16"/>
+                <w:b w:val="0"/>
+                <w:i w:val="0"/>
+                <w:sz w:val="22"/>
               </w:rPr>
-              <w:t>LEDARASON</w:t>
+              <w:t>RAZAFIMANDAHATRA Maxim</w:t>
+            </w:r>
+          </w:p>
+        </w:tc>
+        <w:tc>
+          <w:tcPr>
+            <w:tcW w:type="dxa" w:w="3402"/>
+            <w:vAlign w:val="center"/>
+            <w:tcMar>
+              <w:top w:w="30" w:type="dxa"/>
+              <w:bottom w:w="30" w:type="dxa"/>
+              <w:left w:w="40" w:type="dxa"/>
+              <w:right w:w="40" w:type="dxa"/>
+            </w:tcMar>
+            <w:tcBorders>
+              <w:top w:val="nil"/>
+              <w:left w:val="nil"/>
+              <w:bottom w:val="nil"/>
+              <w:right w:val="nil"/>
+            </w:tcBorders>
+          </w:tcPr>
+          <w:p>
+            <w:pPr>
+              <w:spacing w:before="0" w:after="0" w:line="240" w:lineRule="auto"/>
+              <w:jc w:val="center"/>
+            </w:pPr>
+            <w:r>
+              <w:rPr>
+                <w:rFonts w:ascii="Times New Roman" w:hAnsi="Times New Roman" w:eastAsia="Times New Roman" w:cs="Times New Roman"/>
+                <w:b w:val="0"/>
+                <w:i w:val="0"/>
+                <w:sz w:val="22"/>
+              </w:rPr>
+              <w:t>RANDRIANANTENAINA H.L. Juno</w:t>
+            </w:r>
+          </w:p>
+        </w:tc>
+        <w:tc>
+          <w:tcPr>
+            <w:tcW w:type="dxa" w:w="3402"/>
+            <w:vAlign w:val="center"/>
+            <w:tcMar>
+              <w:top w:w="30" w:type="dxa"/>
+              <w:bottom w:w="30" w:type="dxa"/>
+              <w:left w:w="40" w:type="dxa"/>
+              <w:right w:w="40" w:type="dxa"/>
+            </w:tcMar>
+            <w:tcBorders>
+              <w:top w:val="nil"/>
+              <w:left w:val="nil"/>
+              <w:bottom w:val="nil"/>
+              <w:right w:val="nil"/>
+            </w:tcBorders>
+          </w:tcPr>
+          <w:p>
+            <w:pPr>
+              <w:spacing w:before="0" w:after="0" w:line="240" w:lineRule="auto"/>
+              <w:jc w:val="center"/>
+            </w:pPr>
+            <w:r>
+              <w:rPr>
+                <w:rFonts w:ascii="Times New Roman" w:hAnsi="Times New Roman" w:eastAsia="Times New Roman" w:cs="Times New Roman"/>
+                <w:b w:val="0"/>
+                <w:i w:val="0"/>
+                <w:sz w:val="22"/>
+              </w:rPr>
+              <w:t>LETSARASON</w:t>
             </w:r>
           </w:p>
         </w:tc>
@@ -3787,7 +4806,7 @@
     </w:tbl>
     <w:sectPr>
       <w:pgSz w:w="11906" w:h="16838"/>
-      <w:pgMar w:top="680" w:right="680" w:bottom="680" w:left="680" w:header="720" w:footer="720" w:gutter="0"/>
+      <w:pgMar w:top="680" w:right="850" w:bottom="680" w:left="850" w:header="720" w:footer="720" w:gutter="0"/>
       <w:cols w:space="720"/>
       <w:docGrid w:linePitch="360"/>
     </w:sectPr>

</xml_diff>